<commit_message>
DOCX: print_cards with Acting Lab, Drama Therapy, and Paulson rooms (560,562,570,582,620,623,624)
</commit_message>
<xml_diff>
--- a/qr_codes/print_cards.docx
+++ b/qr_codes/print_cards.docx
@@ -308,7 +308,7 @@
                 <w:rFonts w:ascii="NYU Perstare" w:hAnsi="NYU Perstare"/>
                 <w:b/>
               </w:rPr>
-              <w:t>Studio D1</w:t>
+              <w:t>Room 560</w:t>
             </w:r>
           </w:p>
         </w:tc>
@@ -620,7 +620,2211 @@
                 <w:rFonts w:ascii="NYU Perstare" w:hAnsi="NYU Perstare"/>
                 <w:b/>
               </w:rPr>
-              <w:t>6th Floor Conference Room</w:t>
+              <w:t>Room 562</w:t>
+            </w:r>
+          </w:p>
+        </w:tc>
+      </w:tr>
+    </w:tbl>
+    <w:p>
+      <w:r>
+        <w:br w:type="page"/>
+      </w:r>
+    </w:p>
+    <w:tbl>
+      <w:tblPr>
+        <w:tblW w:type="auto" w:w="0"/>
+        <w:tblLayout w:type="fixed"/>
+        <w:tblLook w:firstColumn="1" w:firstRow="1" w:lastColumn="0" w:lastRow="0" w:noHBand="0" w:noVBand="1" w:val="04A0"/>
+      </w:tblPr>
+      <w:tblGrid>
+        <w:gridCol w:w="5400"/>
+        <w:gridCol w:w="5400"/>
+      </w:tblGrid>
+      <w:tr>
+        <w:trPr>
+          <w:trHeight w:hRule="auto"/>
+        </w:trPr>
+        <w:tc>
+          <w:tcPr>
+            <w:tcW w:type="dxa" w:w="5256"/>
+          </w:tcPr>
+          <w:p/>
+        </w:tc>
+        <w:tc>
+          <w:tcPr>
+            <w:tcW w:type="dxa" w:w="5256"/>
+          </w:tcPr>
+          <w:p>
+            <w:pPr>
+              <w:spacing w:before="0" w:after="0" w:line="240" w:lineRule="auto"/>
+              <w:jc w:val="center"/>
+            </w:pPr>
+            <w:r>
+              <w:drawing>
+                <wp:inline xmlns:a="http://schemas.openxmlformats.org/drawingml/2006/main" xmlns:pic="http://schemas.openxmlformats.org/drawingml/2006/picture">
+                  <wp:extent cx="1828800" cy="225311"/>
+                  <wp:docPr id="7" name="Picture 7"/>
+                  <wp:cNvGraphicFramePr>
+                    <a:graphicFrameLocks noChangeAspect="1"/>
+                  </wp:cNvGraphicFramePr>
+                  <a:graphic>
+                    <a:graphicData uri="http://schemas.openxmlformats.org/drawingml/2006/picture">
+                      <pic:pic>
+                        <pic:nvPicPr>
+                          <pic:cNvPr id="0" name="image.png"/>
+                          <pic:cNvPicPr/>
+                        </pic:nvPicPr>
+                        <pic:blipFill>
+                          <a:blip r:embed="rId9"/>
+                          <a:stretch>
+                            <a:fillRect/>
+                          </a:stretch>
+                        </pic:blipFill>
+                        <pic:spPr>
+                          <a:xfrm>
+                            <a:off x="0" y="0"/>
+                            <a:ext cx="1828800" cy="225311"/>
+                          </a:xfrm>
+                          <a:prstGeom prst="rect"/>
+                        </pic:spPr>
+                      </pic:pic>
+                    </a:graphicData>
+                  </a:graphic>
+                </wp:inline>
+              </w:drawing>
+            </w:r>
+          </w:p>
+        </w:tc>
+      </w:tr>
+      <w:tr>
+        <w:trPr>
+          <w:trHeight w:hRule="auto"/>
+        </w:trPr>
+        <w:tc>
+          <w:tcPr>
+            <w:tcW w:type="dxa" w:w="5256"/>
+          </w:tcPr>
+          <w:p/>
+        </w:tc>
+        <w:tc>
+          <w:tcPr>
+            <w:tcW w:type="dxa" w:w="5256"/>
+          </w:tcPr>
+          <w:p>
+            <w:pPr>
+              <w:spacing w:before="0" w:after="0" w:line="240" w:lineRule="auto"/>
+              <w:jc w:val="center"/>
+            </w:pPr>
+            <w:r>
+              <w:rPr>
+                <w:rFonts w:ascii="NYU Perstare" w:hAnsi="NYU Perstare"/>
+                <w:b w:val="0"/>
+                <w:sz w:val="12"/>
+              </w:rPr>
+              <w:t>MUSIC AND PERFORMING ARTS PROFESSIONS</w:t>
+            </w:r>
+          </w:p>
+        </w:tc>
+      </w:tr>
+      <w:tr>
+        <w:trPr>
+          <w:trHeight w:val="360" w:hRule="exact"/>
+        </w:trPr>
+        <w:tc>
+          <w:tcPr>
+            <w:tcW w:type="dxa" w:w="5256"/>
+          </w:tcPr>
+          <w:p>
+            <w:pPr>
+              <w:spacing w:before="0" w:after="0" w:line="240" w:lineRule="auto"/>
+              <w:jc w:val="center"/>
+            </w:pPr>
+            <w:r>
+              <w:rPr>
+                <w:rFonts w:ascii="NYU Perstare" w:hAnsi="NYU Perstare"/>
+                <w:b w:val="0"/>
+              </w:rPr>
+              <w:t>Support</w:t>
+            </w:r>
+          </w:p>
+        </w:tc>
+        <w:tc>
+          <w:tcPr>
+            <w:tcW w:type="dxa" w:w="5256"/>
+          </w:tcPr>
+          <w:p>
+            <w:pPr>
+              <w:spacing w:before="0" w:after="0" w:line="240" w:lineRule="auto"/>
+              <w:jc w:val="center"/>
+            </w:pPr>
+            <w:r>
+              <w:rPr>
+                <w:rFonts w:ascii="NYU Perstare" w:hAnsi="NYU Perstare"/>
+                <w:b w:val="0"/>
+              </w:rPr>
+              <w:t>Room Instructions</w:t>
+            </w:r>
+          </w:p>
+        </w:tc>
+      </w:tr>
+      <w:tr>
+        <w:trPr>
+          <w:trHeight w:val="4176" w:hRule="exact"/>
+        </w:trPr>
+        <w:tc>
+          <w:tcPr>
+            <w:tcW w:type="dxa" w:w="5256"/>
+          </w:tcPr>
+          <w:p>
+            <w:pPr>
+              <w:spacing w:before="0" w:after="0" w:line="240" w:lineRule="auto"/>
+              <w:jc w:val="center"/>
+            </w:pPr>
+            <w:r>
+              <w:drawing>
+                <wp:inline xmlns:a="http://schemas.openxmlformats.org/drawingml/2006/main" xmlns:pic="http://schemas.openxmlformats.org/drawingml/2006/picture">
+                  <wp:extent cx="2194560" cy="2532185"/>
+                  <wp:docPr id="8" name="Picture 8"/>
+                  <wp:cNvGraphicFramePr>
+                    <a:graphicFrameLocks noChangeAspect="1"/>
+                  </wp:cNvGraphicFramePr>
+                  <a:graphic>
+                    <a:graphicData uri="http://schemas.openxmlformats.org/drawingml/2006/picture">
+                      <pic:pic>
+                        <pic:nvPicPr>
+                          <pic:cNvPr id="0" name="image.png"/>
+                          <pic:cNvPicPr/>
+                        </pic:nvPicPr>
+                        <pic:blipFill>
+                          <a:blip r:embed="rId10"/>
+                          <a:stretch>
+                            <a:fillRect/>
+                          </a:stretch>
+                        </pic:blipFill>
+                        <pic:spPr>
+                          <a:xfrm>
+                            <a:off x="0" y="0"/>
+                            <a:ext cx="2194560" cy="2532185"/>
+                          </a:xfrm>
+                          <a:prstGeom prst="rect"/>
+                        </pic:spPr>
+                      </pic:pic>
+                    </a:graphicData>
+                  </a:graphic>
+                </wp:inline>
+              </w:drawing>
+            </w:r>
+          </w:p>
+        </w:tc>
+        <w:tc>
+          <w:tcPr>
+            <w:tcW w:type="dxa" w:w="5256"/>
+          </w:tcPr>
+          <w:p>
+            <w:pPr>
+              <w:spacing w:before="0" w:after="0" w:line="240" w:lineRule="auto"/>
+              <w:jc w:val="center"/>
+            </w:pPr>
+            <w:r>
+              <w:drawing>
+                <wp:inline xmlns:a="http://schemas.openxmlformats.org/drawingml/2006/main" xmlns:pic="http://schemas.openxmlformats.org/drawingml/2006/picture">
+                  <wp:extent cx="2194560" cy="2532185"/>
+                  <wp:docPr id="9" name="Picture 9"/>
+                  <wp:cNvGraphicFramePr>
+                    <a:graphicFrameLocks noChangeAspect="1"/>
+                  </wp:cNvGraphicFramePr>
+                  <a:graphic>
+                    <a:graphicData uri="http://schemas.openxmlformats.org/drawingml/2006/picture">
+                      <pic:pic>
+                        <pic:nvPicPr>
+                          <pic:cNvPr id="0" name="image.png"/>
+                          <pic:cNvPicPr/>
+                        </pic:nvPicPr>
+                        <pic:blipFill>
+                          <a:blip r:embed="rId13"/>
+                          <a:stretch>
+                            <a:fillRect/>
+                          </a:stretch>
+                        </pic:blipFill>
+                        <pic:spPr>
+                          <a:xfrm>
+                            <a:off x="0" y="0"/>
+                            <a:ext cx="2194560" cy="2532185"/>
+                          </a:xfrm>
+                          <a:prstGeom prst="rect"/>
+                        </pic:spPr>
+                      </pic:pic>
+                    </a:graphicData>
+                  </a:graphic>
+                </wp:inline>
+              </w:drawing>
+            </w:r>
+          </w:p>
+        </w:tc>
+      </w:tr>
+      <w:tr>
+        <w:trPr>
+          <w:trHeight w:val="230" w:hRule="exact"/>
+        </w:trPr>
+        <w:tc>
+          <w:tcPr>
+            <w:tcW w:type="dxa" w:w="5256"/>
+          </w:tcPr>
+          <w:p>
+            <w:pPr>
+              <w:spacing w:before="0" w:after="0" w:line="240" w:lineRule="auto"/>
+            </w:pPr>
+          </w:p>
+        </w:tc>
+        <w:tc>
+          <w:tcPr>
+            <w:tcW w:type="dxa" w:w="5256"/>
+          </w:tcPr>
+          <w:p>
+            <w:pPr>
+              <w:spacing w:before="0" w:after="0" w:line="240" w:lineRule="auto"/>
+            </w:pPr>
+          </w:p>
+        </w:tc>
+      </w:tr>
+      <w:tr>
+        <w:trPr>
+          <w:trHeight w:val="230" w:hRule="exact"/>
+        </w:trPr>
+        <w:tc>
+          <w:tcPr>
+            <w:tcW w:type="dxa" w:w="5256"/>
+          </w:tcPr>
+          <w:p>
+            <w:pPr>
+              <w:spacing w:before="0" w:after="0" w:line="240" w:lineRule="auto"/>
+            </w:pPr>
+          </w:p>
+        </w:tc>
+        <w:tc>
+          <w:tcPr>
+            <w:tcW w:type="dxa" w:w="5256"/>
+          </w:tcPr>
+          <w:p>
+            <w:pPr>
+              <w:spacing w:before="0" w:after="0" w:line="240" w:lineRule="auto"/>
+            </w:pPr>
+          </w:p>
+        </w:tc>
+      </w:tr>
+      <w:tr>
+        <w:trPr>
+          <w:trHeight w:val="360" w:hRule="exact"/>
+        </w:trPr>
+        <w:tc>
+          <w:tcPr>
+            <w:tcW w:type="dxa" w:w="5256"/>
+          </w:tcPr>
+          <w:p/>
+        </w:tc>
+        <w:tc>
+          <w:tcPr>
+            <w:tcW w:type="dxa" w:w="5256"/>
+          </w:tcPr>
+          <w:p>
+            <w:pPr>
+              <w:spacing w:before="0" w:after="0" w:line="240" w:lineRule="auto"/>
+              <w:jc w:val="center"/>
+            </w:pPr>
+            <w:r>
+              <w:rPr>
+                <w:rFonts w:ascii="NYU Perstare" w:hAnsi="NYU Perstare"/>
+                <w:b/>
+              </w:rPr>
+              <w:t>Room 570</w:t>
+            </w:r>
+          </w:p>
+        </w:tc>
+      </w:tr>
+    </w:tbl>
+    <w:tbl>
+      <w:tblPr>
+        <w:tblW w:type="auto" w:w="0"/>
+        <w:tblLayout w:type="fixed"/>
+        <w:tblLook w:firstColumn="1" w:firstRow="1" w:lastColumn="0" w:lastRow="0" w:noHBand="0" w:noVBand="1" w:val="04A0"/>
+      </w:tblPr>
+      <w:tblGrid>
+        <w:gridCol w:w="5400"/>
+        <w:gridCol w:w="5400"/>
+      </w:tblGrid>
+      <w:tr>
+        <w:trPr>
+          <w:trHeight w:hRule="auto"/>
+        </w:trPr>
+        <w:tc>
+          <w:tcPr>
+            <w:tcW w:type="dxa" w:w="5256"/>
+          </w:tcPr>
+          <w:p/>
+        </w:tc>
+        <w:tc>
+          <w:tcPr>
+            <w:tcW w:type="dxa" w:w="5256"/>
+          </w:tcPr>
+          <w:p>
+            <w:pPr>
+              <w:spacing w:before="0" w:after="0" w:line="240" w:lineRule="auto"/>
+              <w:jc w:val="center"/>
+            </w:pPr>
+            <w:r>
+              <w:drawing>
+                <wp:inline xmlns:a="http://schemas.openxmlformats.org/drawingml/2006/main" xmlns:pic="http://schemas.openxmlformats.org/drawingml/2006/picture">
+                  <wp:extent cx="1828800" cy="225311"/>
+                  <wp:docPr id="10" name="Picture 10"/>
+                  <wp:cNvGraphicFramePr>
+                    <a:graphicFrameLocks noChangeAspect="1"/>
+                  </wp:cNvGraphicFramePr>
+                  <a:graphic>
+                    <a:graphicData uri="http://schemas.openxmlformats.org/drawingml/2006/picture">
+                      <pic:pic>
+                        <pic:nvPicPr>
+                          <pic:cNvPr id="0" name="image.png"/>
+                          <pic:cNvPicPr/>
+                        </pic:nvPicPr>
+                        <pic:blipFill>
+                          <a:blip r:embed="rId9"/>
+                          <a:stretch>
+                            <a:fillRect/>
+                          </a:stretch>
+                        </pic:blipFill>
+                        <pic:spPr>
+                          <a:xfrm>
+                            <a:off x="0" y="0"/>
+                            <a:ext cx="1828800" cy="225311"/>
+                          </a:xfrm>
+                          <a:prstGeom prst="rect"/>
+                        </pic:spPr>
+                      </pic:pic>
+                    </a:graphicData>
+                  </a:graphic>
+                </wp:inline>
+              </w:drawing>
+            </w:r>
+          </w:p>
+        </w:tc>
+      </w:tr>
+      <w:tr>
+        <w:trPr>
+          <w:trHeight w:hRule="auto"/>
+        </w:trPr>
+        <w:tc>
+          <w:tcPr>
+            <w:tcW w:type="dxa" w:w="5256"/>
+          </w:tcPr>
+          <w:p/>
+        </w:tc>
+        <w:tc>
+          <w:tcPr>
+            <w:tcW w:type="dxa" w:w="5256"/>
+          </w:tcPr>
+          <w:p>
+            <w:pPr>
+              <w:spacing w:before="0" w:after="0" w:line="240" w:lineRule="auto"/>
+              <w:jc w:val="center"/>
+            </w:pPr>
+            <w:r>
+              <w:rPr>
+                <w:rFonts w:ascii="NYU Perstare" w:hAnsi="NYU Perstare"/>
+                <w:b w:val="0"/>
+                <w:sz w:val="12"/>
+              </w:rPr>
+              <w:t>MUSIC AND PERFORMING ARTS PROFESSIONS</w:t>
+            </w:r>
+          </w:p>
+        </w:tc>
+      </w:tr>
+      <w:tr>
+        <w:trPr>
+          <w:trHeight w:val="360" w:hRule="exact"/>
+        </w:trPr>
+        <w:tc>
+          <w:tcPr>
+            <w:tcW w:type="dxa" w:w="5256"/>
+          </w:tcPr>
+          <w:p>
+            <w:pPr>
+              <w:spacing w:before="0" w:after="0" w:line="240" w:lineRule="auto"/>
+              <w:jc w:val="center"/>
+            </w:pPr>
+            <w:r>
+              <w:rPr>
+                <w:rFonts w:ascii="NYU Perstare" w:hAnsi="NYU Perstare"/>
+                <w:b w:val="0"/>
+              </w:rPr>
+              <w:t>Support</w:t>
+            </w:r>
+          </w:p>
+        </w:tc>
+        <w:tc>
+          <w:tcPr>
+            <w:tcW w:type="dxa" w:w="5256"/>
+          </w:tcPr>
+          <w:p>
+            <w:pPr>
+              <w:spacing w:before="0" w:after="0" w:line="240" w:lineRule="auto"/>
+              <w:jc w:val="center"/>
+            </w:pPr>
+            <w:r>
+              <w:rPr>
+                <w:rFonts w:ascii="NYU Perstare" w:hAnsi="NYU Perstare"/>
+                <w:b w:val="0"/>
+              </w:rPr>
+              <w:t>Room Instructions</w:t>
+            </w:r>
+          </w:p>
+        </w:tc>
+      </w:tr>
+      <w:tr>
+        <w:trPr>
+          <w:trHeight w:val="4176" w:hRule="exact"/>
+        </w:trPr>
+        <w:tc>
+          <w:tcPr>
+            <w:tcW w:type="dxa" w:w="5256"/>
+          </w:tcPr>
+          <w:p>
+            <w:pPr>
+              <w:spacing w:before="0" w:after="0" w:line="240" w:lineRule="auto"/>
+              <w:jc w:val="center"/>
+            </w:pPr>
+            <w:r>
+              <w:drawing>
+                <wp:inline xmlns:a="http://schemas.openxmlformats.org/drawingml/2006/main" xmlns:pic="http://schemas.openxmlformats.org/drawingml/2006/picture">
+                  <wp:extent cx="2194560" cy="2532185"/>
+                  <wp:docPr id="11" name="Picture 11"/>
+                  <wp:cNvGraphicFramePr>
+                    <a:graphicFrameLocks noChangeAspect="1"/>
+                  </wp:cNvGraphicFramePr>
+                  <a:graphic>
+                    <a:graphicData uri="http://schemas.openxmlformats.org/drawingml/2006/picture">
+                      <pic:pic>
+                        <pic:nvPicPr>
+                          <pic:cNvPr id="0" name="image.png"/>
+                          <pic:cNvPicPr/>
+                        </pic:nvPicPr>
+                        <pic:blipFill>
+                          <a:blip r:embed="rId10"/>
+                          <a:stretch>
+                            <a:fillRect/>
+                          </a:stretch>
+                        </pic:blipFill>
+                        <pic:spPr>
+                          <a:xfrm>
+                            <a:off x="0" y="0"/>
+                            <a:ext cx="2194560" cy="2532185"/>
+                          </a:xfrm>
+                          <a:prstGeom prst="rect"/>
+                        </pic:spPr>
+                      </pic:pic>
+                    </a:graphicData>
+                  </a:graphic>
+                </wp:inline>
+              </w:drawing>
+            </w:r>
+          </w:p>
+        </w:tc>
+        <w:tc>
+          <w:tcPr>
+            <w:tcW w:type="dxa" w:w="5256"/>
+          </w:tcPr>
+          <w:p>
+            <w:pPr>
+              <w:spacing w:before="0" w:after="0" w:line="240" w:lineRule="auto"/>
+              <w:jc w:val="center"/>
+            </w:pPr>
+            <w:r>
+              <w:drawing>
+                <wp:inline xmlns:a="http://schemas.openxmlformats.org/drawingml/2006/main" xmlns:pic="http://schemas.openxmlformats.org/drawingml/2006/picture">
+                  <wp:extent cx="2194560" cy="2532185"/>
+                  <wp:docPr id="12" name="Picture 12"/>
+                  <wp:cNvGraphicFramePr>
+                    <a:graphicFrameLocks noChangeAspect="1"/>
+                  </wp:cNvGraphicFramePr>
+                  <a:graphic>
+                    <a:graphicData uri="http://schemas.openxmlformats.org/drawingml/2006/picture">
+                      <pic:pic>
+                        <pic:nvPicPr>
+                          <pic:cNvPr id="0" name="image.png"/>
+                          <pic:cNvPicPr/>
+                        </pic:nvPicPr>
+                        <pic:blipFill>
+                          <a:blip r:embed="rId14"/>
+                          <a:stretch>
+                            <a:fillRect/>
+                          </a:stretch>
+                        </pic:blipFill>
+                        <pic:spPr>
+                          <a:xfrm>
+                            <a:off x="0" y="0"/>
+                            <a:ext cx="2194560" cy="2532185"/>
+                          </a:xfrm>
+                          <a:prstGeom prst="rect"/>
+                        </pic:spPr>
+                      </pic:pic>
+                    </a:graphicData>
+                  </a:graphic>
+                </wp:inline>
+              </w:drawing>
+            </w:r>
+          </w:p>
+        </w:tc>
+      </w:tr>
+      <w:tr>
+        <w:trPr>
+          <w:trHeight w:val="230" w:hRule="exact"/>
+        </w:trPr>
+        <w:tc>
+          <w:tcPr>
+            <w:tcW w:type="dxa" w:w="5256"/>
+          </w:tcPr>
+          <w:p>
+            <w:pPr>
+              <w:spacing w:before="0" w:after="0" w:line="240" w:lineRule="auto"/>
+            </w:pPr>
+          </w:p>
+        </w:tc>
+        <w:tc>
+          <w:tcPr>
+            <w:tcW w:type="dxa" w:w="5256"/>
+          </w:tcPr>
+          <w:p>
+            <w:pPr>
+              <w:spacing w:before="0" w:after="0" w:line="240" w:lineRule="auto"/>
+            </w:pPr>
+          </w:p>
+        </w:tc>
+      </w:tr>
+      <w:tr>
+        <w:trPr>
+          <w:trHeight w:val="230" w:hRule="exact"/>
+        </w:trPr>
+        <w:tc>
+          <w:tcPr>
+            <w:tcW w:type="dxa" w:w="5256"/>
+          </w:tcPr>
+          <w:p>
+            <w:pPr>
+              <w:spacing w:before="0" w:after="0" w:line="240" w:lineRule="auto"/>
+            </w:pPr>
+          </w:p>
+        </w:tc>
+        <w:tc>
+          <w:tcPr>
+            <w:tcW w:type="dxa" w:w="5256"/>
+          </w:tcPr>
+          <w:p>
+            <w:pPr>
+              <w:spacing w:before="0" w:after="0" w:line="240" w:lineRule="auto"/>
+            </w:pPr>
+          </w:p>
+        </w:tc>
+      </w:tr>
+      <w:tr>
+        <w:trPr>
+          <w:trHeight w:val="360" w:hRule="exact"/>
+        </w:trPr>
+        <w:tc>
+          <w:tcPr>
+            <w:tcW w:type="dxa" w:w="5256"/>
+          </w:tcPr>
+          <w:p/>
+        </w:tc>
+        <w:tc>
+          <w:tcPr>
+            <w:tcW w:type="dxa" w:w="5256"/>
+          </w:tcPr>
+          <w:p>
+            <w:pPr>
+              <w:spacing w:before="0" w:after="0" w:line="240" w:lineRule="auto"/>
+              <w:jc w:val="center"/>
+            </w:pPr>
+            <w:r>
+              <w:rPr>
+                <w:rFonts w:ascii="NYU Perstare" w:hAnsi="NYU Perstare"/>
+                <w:b/>
+              </w:rPr>
+              <w:t>Room 582</w:t>
+            </w:r>
+          </w:p>
+        </w:tc>
+      </w:tr>
+    </w:tbl>
+    <w:p>
+      <w:r>
+        <w:br w:type="page"/>
+      </w:r>
+    </w:p>
+    <w:tbl>
+      <w:tblPr>
+        <w:tblW w:type="auto" w:w="0"/>
+        <w:tblLayout w:type="fixed"/>
+        <w:tblLook w:firstColumn="1" w:firstRow="1" w:lastColumn="0" w:lastRow="0" w:noHBand="0" w:noVBand="1" w:val="04A0"/>
+      </w:tblPr>
+      <w:tblGrid>
+        <w:gridCol w:w="5400"/>
+        <w:gridCol w:w="5400"/>
+      </w:tblGrid>
+      <w:tr>
+        <w:trPr>
+          <w:trHeight w:hRule="auto"/>
+        </w:trPr>
+        <w:tc>
+          <w:tcPr>
+            <w:tcW w:type="dxa" w:w="5256"/>
+          </w:tcPr>
+          <w:p/>
+        </w:tc>
+        <w:tc>
+          <w:tcPr>
+            <w:tcW w:type="dxa" w:w="5256"/>
+          </w:tcPr>
+          <w:p>
+            <w:pPr>
+              <w:spacing w:before="0" w:after="0" w:line="240" w:lineRule="auto"/>
+              <w:jc w:val="center"/>
+            </w:pPr>
+            <w:r>
+              <w:drawing>
+                <wp:inline xmlns:a="http://schemas.openxmlformats.org/drawingml/2006/main" xmlns:pic="http://schemas.openxmlformats.org/drawingml/2006/picture">
+                  <wp:extent cx="1828800" cy="225311"/>
+                  <wp:docPr id="13" name="Picture 13"/>
+                  <wp:cNvGraphicFramePr>
+                    <a:graphicFrameLocks noChangeAspect="1"/>
+                  </wp:cNvGraphicFramePr>
+                  <a:graphic>
+                    <a:graphicData uri="http://schemas.openxmlformats.org/drawingml/2006/picture">
+                      <pic:pic>
+                        <pic:nvPicPr>
+                          <pic:cNvPr id="0" name="image.png"/>
+                          <pic:cNvPicPr/>
+                        </pic:nvPicPr>
+                        <pic:blipFill>
+                          <a:blip r:embed="rId9"/>
+                          <a:stretch>
+                            <a:fillRect/>
+                          </a:stretch>
+                        </pic:blipFill>
+                        <pic:spPr>
+                          <a:xfrm>
+                            <a:off x="0" y="0"/>
+                            <a:ext cx="1828800" cy="225311"/>
+                          </a:xfrm>
+                          <a:prstGeom prst="rect"/>
+                        </pic:spPr>
+                      </pic:pic>
+                    </a:graphicData>
+                  </a:graphic>
+                </wp:inline>
+              </w:drawing>
+            </w:r>
+          </w:p>
+        </w:tc>
+      </w:tr>
+      <w:tr>
+        <w:trPr>
+          <w:trHeight w:hRule="auto"/>
+        </w:trPr>
+        <w:tc>
+          <w:tcPr>
+            <w:tcW w:type="dxa" w:w="5256"/>
+          </w:tcPr>
+          <w:p/>
+        </w:tc>
+        <w:tc>
+          <w:tcPr>
+            <w:tcW w:type="dxa" w:w="5256"/>
+          </w:tcPr>
+          <w:p>
+            <w:pPr>
+              <w:spacing w:before="0" w:after="0" w:line="240" w:lineRule="auto"/>
+              <w:jc w:val="center"/>
+            </w:pPr>
+            <w:r>
+              <w:rPr>
+                <w:rFonts w:ascii="NYU Perstare" w:hAnsi="NYU Perstare"/>
+                <w:b w:val="0"/>
+                <w:sz w:val="12"/>
+              </w:rPr>
+              <w:t>MUSIC AND PERFORMING ARTS PROFESSIONS</w:t>
+            </w:r>
+          </w:p>
+        </w:tc>
+      </w:tr>
+      <w:tr>
+        <w:trPr>
+          <w:trHeight w:val="360" w:hRule="exact"/>
+        </w:trPr>
+        <w:tc>
+          <w:tcPr>
+            <w:tcW w:type="dxa" w:w="5256"/>
+          </w:tcPr>
+          <w:p>
+            <w:pPr>
+              <w:spacing w:before="0" w:after="0" w:line="240" w:lineRule="auto"/>
+              <w:jc w:val="center"/>
+            </w:pPr>
+            <w:r>
+              <w:rPr>
+                <w:rFonts w:ascii="NYU Perstare" w:hAnsi="NYU Perstare"/>
+                <w:b w:val="0"/>
+              </w:rPr>
+              <w:t>Support</w:t>
+            </w:r>
+          </w:p>
+        </w:tc>
+        <w:tc>
+          <w:tcPr>
+            <w:tcW w:type="dxa" w:w="5256"/>
+          </w:tcPr>
+          <w:p>
+            <w:pPr>
+              <w:spacing w:before="0" w:after="0" w:line="240" w:lineRule="auto"/>
+              <w:jc w:val="center"/>
+            </w:pPr>
+            <w:r>
+              <w:rPr>
+                <w:rFonts w:ascii="NYU Perstare" w:hAnsi="NYU Perstare"/>
+                <w:b w:val="0"/>
+              </w:rPr>
+              <w:t>Room Instructions</w:t>
+            </w:r>
+          </w:p>
+        </w:tc>
+      </w:tr>
+      <w:tr>
+        <w:trPr>
+          <w:trHeight w:val="4176" w:hRule="exact"/>
+        </w:trPr>
+        <w:tc>
+          <w:tcPr>
+            <w:tcW w:type="dxa" w:w="5256"/>
+          </w:tcPr>
+          <w:p>
+            <w:pPr>
+              <w:spacing w:before="0" w:after="0" w:line="240" w:lineRule="auto"/>
+              <w:jc w:val="center"/>
+            </w:pPr>
+            <w:r>
+              <w:drawing>
+                <wp:inline xmlns:a="http://schemas.openxmlformats.org/drawingml/2006/main" xmlns:pic="http://schemas.openxmlformats.org/drawingml/2006/picture">
+                  <wp:extent cx="2194560" cy="2532185"/>
+                  <wp:docPr id="14" name="Picture 14"/>
+                  <wp:cNvGraphicFramePr>
+                    <a:graphicFrameLocks noChangeAspect="1"/>
+                  </wp:cNvGraphicFramePr>
+                  <a:graphic>
+                    <a:graphicData uri="http://schemas.openxmlformats.org/drawingml/2006/picture">
+                      <pic:pic>
+                        <pic:nvPicPr>
+                          <pic:cNvPr id="0" name="image.png"/>
+                          <pic:cNvPicPr/>
+                        </pic:nvPicPr>
+                        <pic:blipFill>
+                          <a:blip r:embed="rId10"/>
+                          <a:stretch>
+                            <a:fillRect/>
+                          </a:stretch>
+                        </pic:blipFill>
+                        <pic:spPr>
+                          <a:xfrm>
+                            <a:off x="0" y="0"/>
+                            <a:ext cx="2194560" cy="2532185"/>
+                          </a:xfrm>
+                          <a:prstGeom prst="rect"/>
+                        </pic:spPr>
+                      </pic:pic>
+                    </a:graphicData>
+                  </a:graphic>
+                </wp:inline>
+              </w:drawing>
+            </w:r>
+          </w:p>
+        </w:tc>
+        <w:tc>
+          <w:tcPr>
+            <w:tcW w:type="dxa" w:w="5256"/>
+          </w:tcPr>
+          <w:p>
+            <w:pPr>
+              <w:spacing w:before="0" w:after="0" w:line="240" w:lineRule="auto"/>
+              <w:jc w:val="center"/>
+            </w:pPr>
+            <w:r>
+              <w:drawing>
+                <wp:inline xmlns:a="http://schemas.openxmlformats.org/drawingml/2006/main" xmlns:pic="http://schemas.openxmlformats.org/drawingml/2006/picture">
+                  <wp:extent cx="2194560" cy="2532185"/>
+                  <wp:docPr id="15" name="Picture 15"/>
+                  <wp:cNvGraphicFramePr>
+                    <a:graphicFrameLocks noChangeAspect="1"/>
+                  </wp:cNvGraphicFramePr>
+                  <a:graphic>
+                    <a:graphicData uri="http://schemas.openxmlformats.org/drawingml/2006/picture">
+                      <pic:pic>
+                        <pic:nvPicPr>
+                          <pic:cNvPr id="0" name="image.png"/>
+                          <pic:cNvPicPr/>
+                        </pic:nvPicPr>
+                        <pic:blipFill>
+                          <a:blip r:embed="rId15"/>
+                          <a:stretch>
+                            <a:fillRect/>
+                          </a:stretch>
+                        </pic:blipFill>
+                        <pic:spPr>
+                          <a:xfrm>
+                            <a:off x="0" y="0"/>
+                            <a:ext cx="2194560" cy="2532185"/>
+                          </a:xfrm>
+                          <a:prstGeom prst="rect"/>
+                        </pic:spPr>
+                      </pic:pic>
+                    </a:graphicData>
+                  </a:graphic>
+                </wp:inline>
+              </w:drawing>
+            </w:r>
+          </w:p>
+        </w:tc>
+      </w:tr>
+      <w:tr>
+        <w:trPr>
+          <w:trHeight w:val="230" w:hRule="exact"/>
+        </w:trPr>
+        <w:tc>
+          <w:tcPr>
+            <w:tcW w:type="dxa" w:w="5256"/>
+          </w:tcPr>
+          <w:p>
+            <w:pPr>
+              <w:spacing w:before="0" w:after="0" w:line="240" w:lineRule="auto"/>
+            </w:pPr>
+          </w:p>
+        </w:tc>
+        <w:tc>
+          <w:tcPr>
+            <w:tcW w:type="dxa" w:w="5256"/>
+          </w:tcPr>
+          <w:p>
+            <w:pPr>
+              <w:spacing w:before="0" w:after="0" w:line="240" w:lineRule="auto"/>
+            </w:pPr>
+          </w:p>
+        </w:tc>
+      </w:tr>
+      <w:tr>
+        <w:trPr>
+          <w:trHeight w:val="230" w:hRule="exact"/>
+        </w:trPr>
+        <w:tc>
+          <w:tcPr>
+            <w:tcW w:type="dxa" w:w="5256"/>
+          </w:tcPr>
+          <w:p>
+            <w:pPr>
+              <w:spacing w:before="0" w:after="0" w:line="240" w:lineRule="auto"/>
+            </w:pPr>
+          </w:p>
+        </w:tc>
+        <w:tc>
+          <w:tcPr>
+            <w:tcW w:type="dxa" w:w="5256"/>
+          </w:tcPr>
+          <w:p>
+            <w:pPr>
+              <w:spacing w:before="0" w:after="0" w:line="240" w:lineRule="auto"/>
+            </w:pPr>
+          </w:p>
+        </w:tc>
+      </w:tr>
+      <w:tr>
+        <w:trPr>
+          <w:trHeight w:val="360" w:hRule="exact"/>
+        </w:trPr>
+        <w:tc>
+          <w:tcPr>
+            <w:tcW w:type="dxa" w:w="5256"/>
+          </w:tcPr>
+          <w:p/>
+        </w:tc>
+        <w:tc>
+          <w:tcPr>
+            <w:tcW w:type="dxa" w:w="5256"/>
+          </w:tcPr>
+          <w:p>
+            <w:pPr>
+              <w:spacing w:before="0" w:after="0" w:line="240" w:lineRule="auto"/>
+              <w:jc w:val="center"/>
+            </w:pPr>
+            <w:r>
+              <w:rPr>
+                <w:rFonts w:ascii="NYU Perstare" w:hAnsi="NYU Perstare"/>
+                <w:b/>
+              </w:rPr>
+              <w:t>Room 620</w:t>
+            </w:r>
+          </w:p>
+        </w:tc>
+      </w:tr>
+    </w:tbl>
+    <w:tbl>
+      <w:tblPr>
+        <w:tblW w:type="auto" w:w="0"/>
+        <w:tblLayout w:type="fixed"/>
+        <w:tblLook w:firstColumn="1" w:firstRow="1" w:lastColumn="0" w:lastRow="0" w:noHBand="0" w:noVBand="1" w:val="04A0"/>
+      </w:tblPr>
+      <w:tblGrid>
+        <w:gridCol w:w="5400"/>
+        <w:gridCol w:w="5400"/>
+      </w:tblGrid>
+      <w:tr>
+        <w:trPr>
+          <w:trHeight w:hRule="auto"/>
+        </w:trPr>
+        <w:tc>
+          <w:tcPr>
+            <w:tcW w:type="dxa" w:w="5256"/>
+          </w:tcPr>
+          <w:p/>
+        </w:tc>
+        <w:tc>
+          <w:tcPr>
+            <w:tcW w:type="dxa" w:w="5256"/>
+          </w:tcPr>
+          <w:p>
+            <w:pPr>
+              <w:spacing w:before="0" w:after="0" w:line="240" w:lineRule="auto"/>
+              <w:jc w:val="center"/>
+            </w:pPr>
+            <w:r>
+              <w:drawing>
+                <wp:inline xmlns:a="http://schemas.openxmlformats.org/drawingml/2006/main" xmlns:pic="http://schemas.openxmlformats.org/drawingml/2006/picture">
+                  <wp:extent cx="1828800" cy="225311"/>
+                  <wp:docPr id="16" name="Picture 16"/>
+                  <wp:cNvGraphicFramePr>
+                    <a:graphicFrameLocks noChangeAspect="1"/>
+                  </wp:cNvGraphicFramePr>
+                  <a:graphic>
+                    <a:graphicData uri="http://schemas.openxmlformats.org/drawingml/2006/picture">
+                      <pic:pic>
+                        <pic:nvPicPr>
+                          <pic:cNvPr id="0" name="image.png"/>
+                          <pic:cNvPicPr/>
+                        </pic:nvPicPr>
+                        <pic:blipFill>
+                          <a:blip r:embed="rId9"/>
+                          <a:stretch>
+                            <a:fillRect/>
+                          </a:stretch>
+                        </pic:blipFill>
+                        <pic:spPr>
+                          <a:xfrm>
+                            <a:off x="0" y="0"/>
+                            <a:ext cx="1828800" cy="225311"/>
+                          </a:xfrm>
+                          <a:prstGeom prst="rect"/>
+                        </pic:spPr>
+                      </pic:pic>
+                    </a:graphicData>
+                  </a:graphic>
+                </wp:inline>
+              </w:drawing>
+            </w:r>
+          </w:p>
+        </w:tc>
+      </w:tr>
+      <w:tr>
+        <w:trPr>
+          <w:trHeight w:hRule="auto"/>
+        </w:trPr>
+        <w:tc>
+          <w:tcPr>
+            <w:tcW w:type="dxa" w:w="5256"/>
+          </w:tcPr>
+          <w:p/>
+        </w:tc>
+        <w:tc>
+          <w:tcPr>
+            <w:tcW w:type="dxa" w:w="5256"/>
+          </w:tcPr>
+          <w:p>
+            <w:pPr>
+              <w:spacing w:before="0" w:after="0" w:line="240" w:lineRule="auto"/>
+              <w:jc w:val="center"/>
+            </w:pPr>
+            <w:r>
+              <w:rPr>
+                <w:rFonts w:ascii="NYU Perstare" w:hAnsi="NYU Perstare"/>
+                <w:b w:val="0"/>
+                <w:sz w:val="12"/>
+              </w:rPr>
+              <w:t>MUSIC AND PERFORMING ARTS PROFESSIONS</w:t>
+            </w:r>
+          </w:p>
+        </w:tc>
+      </w:tr>
+      <w:tr>
+        <w:trPr>
+          <w:trHeight w:val="360" w:hRule="exact"/>
+        </w:trPr>
+        <w:tc>
+          <w:tcPr>
+            <w:tcW w:type="dxa" w:w="5256"/>
+          </w:tcPr>
+          <w:p>
+            <w:pPr>
+              <w:spacing w:before="0" w:after="0" w:line="240" w:lineRule="auto"/>
+              <w:jc w:val="center"/>
+            </w:pPr>
+            <w:r>
+              <w:rPr>
+                <w:rFonts w:ascii="NYU Perstare" w:hAnsi="NYU Perstare"/>
+                <w:b w:val="0"/>
+              </w:rPr>
+              <w:t>Support</w:t>
+            </w:r>
+          </w:p>
+        </w:tc>
+        <w:tc>
+          <w:tcPr>
+            <w:tcW w:type="dxa" w:w="5256"/>
+          </w:tcPr>
+          <w:p>
+            <w:pPr>
+              <w:spacing w:before="0" w:after="0" w:line="240" w:lineRule="auto"/>
+              <w:jc w:val="center"/>
+            </w:pPr>
+            <w:r>
+              <w:rPr>
+                <w:rFonts w:ascii="NYU Perstare" w:hAnsi="NYU Perstare"/>
+                <w:b w:val="0"/>
+              </w:rPr>
+              <w:t>Room Instructions</w:t>
+            </w:r>
+          </w:p>
+        </w:tc>
+      </w:tr>
+      <w:tr>
+        <w:trPr>
+          <w:trHeight w:val="4176" w:hRule="exact"/>
+        </w:trPr>
+        <w:tc>
+          <w:tcPr>
+            <w:tcW w:type="dxa" w:w="5256"/>
+          </w:tcPr>
+          <w:p>
+            <w:pPr>
+              <w:spacing w:before="0" w:after="0" w:line="240" w:lineRule="auto"/>
+              <w:jc w:val="center"/>
+            </w:pPr>
+            <w:r>
+              <w:drawing>
+                <wp:inline xmlns:a="http://schemas.openxmlformats.org/drawingml/2006/main" xmlns:pic="http://schemas.openxmlformats.org/drawingml/2006/picture">
+                  <wp:extent cx="2194560" cy="2532185"/>
+                  <wp:docPr id="17" name="Picture 17"/>
+                  <wp:cNvGraphicFramePr>
+                    <a:graphicFrameLocks noChangeAspect="1"/>
+                  </wp:cNvGraphicFramePr>
+                  <a:graphic>
+                    <a:graphicData uri="http://schemas.openxmlformats.org/drawingml/2006/picture">
+                      <pic:pic>
+                        <pic:nvPicPr>
+                          <pic:cNvPr id="0" name="image.png"/>
+                          <pic:cNvPicPr/>
+                        </pic:nvPicPr>
+                        <pic:blipFill>
+                          <a:blip r:embed="rId10"/>
+                          <a:stretch>
+                            <a:fillRect/>
+                          </a:stretch>
+                        </pic:blipFill>
+                        <pic:spPr>
+                          <a:xfrm>
+                            <a:off x="0" y="0"/>
+                            <a:ext cx="2194560" cy="2532185"/>
+                          </a:xfrm>
+                          <a:prstGeom prst="rect"/>
+                        </pic:spPr>
+                      </pic:pic>
+                    </a:graphicData>
+                  </a:graphic>
+                </wp:inline>
+              </w:drawing>
+            </w:r>
+          </w:p>
+        </w:tc>
+        <w:tc>
+          <w:tcPr>
+            <w:tcW w:type="dxa" w:w="5256"/>
+          </w:tcPr>
+          <w:p>
+            <w:pPr>
+              <w:spacing w:before="0" w:after="0" w:line="240" w:lineRule="auto"/>
+              <w:jc w:val="center"/>
+            </w:pPr>
+            <w:r>
+              <w:drawing>
+                <wp:inline xmlns:a="http://schemas.openxmlformats.org/drawingml/2006/main" xmlns:pic="http://schemas.openxmlformats.org/drawingml/2006/picture">
+                  <wp:extent cx="2194560" cy="2532185"/>
+                  <wp:docPr id="18" name="Picture 18"/>
+                  <wp:cNvGraphicFramePr>
+                    <a:graphicFrameLocks noChangeAspect="1"/>
+                  </wp:cNvGraphicFramePr>
+                  <a:graphic>
+                    <a:graphicData uri="http://schemas.openxmlformats.org/drawingml/2006/picture">
+                      <pic:pic>
+                        <pic:nvPicPr>
+                          <pic:cNvPr id="0" name="image.png"/>
+                          <pic:cNvPicPr/>
+                        </pic:nvPicPr>
+                        <pic:blipFill>
+                          <a:blip r:embed="rId16"/>
+                          <a:stretch>
+                            <a:fillRect/>
+                          </a:stretch>
+                        </pic:blipFill>
+                        <pic:spPr>
+                          <a:xfrm>
+                            <a:off x="0" y="0"/>
+                            <a:ext cx="2194560" cy="2532185"/>
+                          </a:xfrm>
+                          <a:prstGeom prst="rect"/>
+                        </pic:spPr>
+                      </pic:pic>
+                    </a:graphicData>
+                  </a:graphic>
+                </wp:inline>
+              </w:drawing>
+            </w:r>
+          </w:p>
+        </w:tc>
+      </w:tr>
+      <w:tr>
+        <w:trPr>
+          <w:trHeight w:val="230" w:hRule="exact"/>
+        </w:trPr>
+        <w:tc>
+          <w:tcPr>
+            <w:tcW w:type="dxa" w:w="5256"/>
+          </w:tcPr>
+          <w:p>
+            <w:pPr>
+              <w:spacing w:before="0" w:after="0" w:line="240" w:lineRule="auto"/>
+            </w:pPr>
+          </w:p>
+        </w:tc>
+        <w:tc>
+          <w:tcPr>
+            <w:tcW w:type="dxa" w:w="5256"/>
+          </w:tcPr>
+          <w:p>
+            <w:pPr>
+              <w:spacing w:before="0" w:after="0" w:line="240" w:lineRule="auto"/>
+            </w:pPr>
+          </w:p>
+        </w:tc>
+      </w:tr>
+      <w:tr>
+        <w:trPr>
+          <w:trHeight w:val="230" w:hRule="exact"/>
+        </w:trPr>
+        <w:tc>
+          <w:tcPr>
+            <w:tcW w:type="dxa" w:w="5256"/>
+          </w:tcPr>
+          <w:p>
+            <w:pPr>
+              <w:spacing w:before="0" w:after="0" w:line="240" w:lineRule="auto"/>
+            </w:pPr>
+          </w:p>
+        </w:tc>
+        <w:tc>
+          <w:tcPr>
+            <w:tcW w:type="dxa" w:w="5256"/>
+          </w:tcPr>
+          <w:p>
+            <w:pPr>
+              <w:spacing w:before="0" w:after="0" w:line="240" w:lineRule="auto"/>
+            </w:pPr>
+          </w:p>
+        </w:tc>
+      </w:tr>
+      <w:tr>
+        <w:trPr>
+          <w:trHeight w:val="360" w:hRule="exact"/>
+        </w:trPr>
+        <w:tc>
+          <w:tcPr>
+            <w:tcW w:type="dxa" w:w="5256"/>
+          </w:tcPr>
+          <w:p/>
+        </w:tc>
+        <w:tc>
+          <w:tcPr>
+            <w:tcW w:type="dxa" w:w="5256"/>
+          </w:tcPr>
+          <w:p>
+            <w:pPr>
+              <w:spacing w:before="0" w:after="0" w:line="240" w:lineRule="auto"/>
+              <w:jc w:val="center"/>
+            </w:pPr>
+            <w:r>
+              <w:rPr>
+                <w:rFonts w:ascii="NYU Perstare" w:hAnsi="NYU Perstare"/>
+                <w:b/>
+              </w:rPr>
+              <w:t>Room 623</w:t>
+            </w:r>
+          </w:p>
+        </w:tc>
+      </w:tr>
+    </w:tbl>
+    <w:p>
+      <w:r>
+        <w:br w:type="page"/>
+      </w:r>
+    </w:p>
+    <w:tbl>
+      <w:tblPr>
+        <w:tblW w:type="auto" w:w="0"/>
+        <w:tblLayout w:type="fixed"/>
+        <w:tblLook w:firstColumn="1" w:firstRow="1" w:lastColumn="0" w:lastRow="0" w:noHBand="0" w:noVBand="1" w:val="04A0"/>
+      </w:tblPr>
+      <w:tblGrid>
+        <w:gridCol w:w="5400"/>
+        <w:gridCol w:w="5400"/>
+      </w:tblGrid>
+      <w:tr>
+        <w:trPr>
+          <w:trHeight w:hRule="auto"/>
+        </w:trPr>
+        <w:tc>
+          <w:tcPr>
+            <w:tcW w:type="dxa" w:w="5256"/>
+          </w:tcPr>
+          <w:p/>
+        </w:tc>
+        <w:tc>
+          <w:tcPr>
+            <w:tcW w:type="dxa" w:w="5256"/>
+          </w:tcPr>
+          <w:p>
+            <w:pPr>
+              <w:spacing w:before="0" w:after="0" w:line="240" w:lineRule="auto"/>
+              <w:jc w:val="center"/>
+            </w:pPr>
+            <w:r>
+              <w:drawing>
+                <wp:inline xmlns:a="http://schemas.openxmlformats.org/drawingml/2006/main" xmlns:pic="http://schemas.openxmlformats.org/drawingml/2006/picture">
+                  <wp:extent cx="1828800" cy="225311"/>
+                  <wp:docPr id="19" name="Picture 19"/>
+                  <wp:cNvGraphicFramePr>
+                    <a:graphicFrameLocks noChangeAspect="1"/>
+                  </wp:cNvGraphicFramePr>
+                  <a:graphic>
+                    <a:graphicData uri="http://schemas.openxmlformats.org/drawingml/2006/picture">
+                      <pic:pic>
+                        <pic:nvPicPr>
+                          <pic:cNvPr id="0" name="image.png"/>
+                          <pic:cNvPicPr/>
+                        </pic:nvPicPr>
+                        <pic:blipFill>
+                          <a:blip r:embed="rId9"/>
+                          <a:stretch>
+                            <a:fillRect/>
+                          </a:stretch>
+                        </pic:blipFill>
+                        <pic:spPr>
+                          <a:xfrm>
+                            <a:off x="0" y="0"/>
+                            <a:ext cx="1828800" cy="225311"/>
+                          </a:xfrm>
+                          <a:prstGeom prst="rect"/>
+                        </pic:spPr>
+                      </pic:pic>
+                    </a:graphicData>
+                  </a:graphic>
+                </wp:inline>
+              </w:drawing>
+            </w:r>
+          </w:p>
+        </w:tc>
+      </w:tr>
+      <w:tr>
+        <w:trPr>
+          <w:trHeight w:hRule="auto"/>
+        </w:trPr>
+        <w:tc>
+          <w:tcPr>
+            <w:tcW w:type="dxa" w:w="5256"/>
+          </w:tcPr>
+          <w:p/>
+        </w:tc>
+        <w:tc>
+          <w:tcPr>
+            <w:tcW w:type="dxa" w:w="5256"/>
+          </w:tcPr>
+          <w:p>
+            <w:pPr>
+              <w:spacing w:before="0" w:after="0" w:line="240" w:lineRule="auto"/>
+              <w:jc w:val="center"/>
+            </w:pPr>
+            <w:r>
+              <w:rPr>
+                <w:rFonts w:ascii="NYU Perstare" w:hAnsi="NYU Perstare"/>
+                <w:b w:val="0"/>
+                <w:sz w:val="12"/>
+              </w:rPr>
+              <w:t>MUSIC AND PERFORMING ARTS PROFESSIONS</w:t>
+            </w:r>
+          </w:p>
+        </w:tc>
+      </w:tr>
+      <w:tr>
+        <w:trPr>
+          <w:trHeight w:val="360" w:hRule="exact"/>
+        </w:trPr>
+        <w:tc>
+          <w:tcPr>
+            <w:tcW w:type="dxa" w:w="5256"/>
+          </w:tcPr>
+          <w:p>
+            <w:pPr>
+              <w:spacing w:before="0" w:after="0" w:line="240" w:lineRule="auto"/>
+              <w:jc w:val="center"/>
+            </w:pPr>
+            <w:r>
+              <w:rPr>
+                <w:rFonts w:ascii="NYU Perstare" w:hAnsi="NYU Perstare"/>
+                <w:b w:val="0"/>
+              </w:rPr>
+              <w:t>Support</w:t>
+            </w:r>
+          </w:p>
+        </w:tc>
+        <w:tc>
+          <w:tcPr>
+            <w:tcW w:type="dxa" w:w="5256"/>
+          </w:tcPr>
+          <w:p>
+            <w:pPr>
+              <w:spacing w:before="0" w:after="0" w:line="240" w:lineRule="auto"/>
+              <w:jc w:val="center"/>
+            </w:pPr>
+            <w:r>
+              <w:rPr>
+                <w:rFonts w:ascii="NYU Perstare" w:hAnsi="NYU Perstare"/>
+                <w:b w:val="0"/>
+              </w:rPr>
+              <w:t>Room Instructions</w:t>
+            </w:r>
+          </w:p>
+        </w:tc>
+      </w:tr>
+      <w:tr>
+        <w:trPr>
+          <w:trHeight w:val="4176" w:hRule="exact"/>
+        </w:trPr>
+        <w:tc>
+          <w:tcPr>
+            <w:tcW w:type="dxa" w:w="5256"/>
+          </w:tcPr>
+          <w:p>
+            <w:pPr>
+              <w:spacing w:before="0" w:after="0" w:line="240" w:lineRule="auto"/>
+              <w:jc w:val="center"/>
+            </w:pPr>
+            <w:r>
+              <w:drawing>
+                <wp:inline xmlns:a="http://schemas.openxmlformats.org/drawingml/2006/main" xmlns:pic="http://schemas.openxmlformats.org/drawingml/2006/picture">
+                  <wp:extent cx="2194560" cy="2532185"/>
+                  <wp:docPr id="20" name="Picture 20"/>
+                  <wp:cNvGraphicFramePr>
+                    <a:graphicFrameLocks noChangeAspect="1"/>
+                  </wp:cNvGraphicFramePr>
+                  <a:graphic>
+                    <a:graphicData uri="http://schemas.openxmlformats.org/drawingml/2006/picture">
+                      <pic:pic>
+                        <pic:nvPicPr>
+                          <pic:cNvPr id="0" name="image.png"/>
+                          <pic:cNvPicPr/>
+                        </pic:nvPicPr>
+                        <pic:blipFill>
+                          <a:blip r:embed="rId10"/>
+                          <a:stretch>
+                            <a:fillRect/>
+                          </a:stretch>
+                        </pic:blipFill>
+                        <pic:spPr>
+                          <a:xfrm>
+                            <a:off x="0" y="0"/>
+                            <a:ext cx="2194560" cy="2532185"/>
+                          </a:xfrm>
+                          <a:prstGeom prst="rect"/>
+                        </pic:spPr>
+                      </pic:pic>
+                    </a:graphicData>
+                  </a:graphic>
+                </wp:inline>
+              </w:drawing>
+            </w:r>
+          </w:p>
+        </w:tc>
+        <w:tc>
+          <w:tcPr>
+            <w:tcW w:type="dxa" w:w="5256"/>
+          </w:tcPr>
+          <w:p>
+            <w:pPr>
+              <w:spacing w:before="0" w:after="0" w:line="240" w:lineRule="auto"/>
+              <w:jc w:val="center"/>
+            </w:pPr>
+            <w:r>
+              <w:drawing>
+                <wp:inline xmlns:a="http://schemas.openxmlformats.org/drawingml/2006/main" xmlns:pic="http://schemas.openxmlformats.org/drawingml/2006/picture">
+                  <wp:extent cx="2194560" cy="2532185"/>
+                  <wp:docPr id="21" name="Picture 21"/>
+                  <wp:cNvGraphicFramePr>
+                    <a:graphicFrameLocks noChangeAspect="1"/>
+                  </wp:cNvGraphicFramePr>
+                  <a:graphic>
+                    <a:graphicData uri="http://schemas.openxmlformats.org/drawingml/2006/picture">
+                      <pic:pic>
+                        <pic:nvPicPr>
+                          <pic:cNvPr id="0" name="image.png"/>
+                          <pic:cNvPicPr/>
+                        </pic:nvPicPr>
+                        <pic:blipFill>
+                          <a:blip r:embed="rId17"/>
+                          <a:stretch>
+                            <a:fillRect/>
+                          </a:stretch>
+                        </pic:blipFill>
+                        <pic:spPr>
+                          <a:xfrm>
+                            <a:off x="0" y="0"/>
+                            <a:ext cx="2194560" cy="2532185"/>
+                          </a:xfrm>
+                          <a:prstGeom prst="rect"/>
+                        </pic:spPr>
+                      </pic:pic>
+                    </a:graphicData>
+                  </a:graphic>
+                </wp:inline>
+              </w:drawing>
+            </w:r>
+          </w:p>
+        </w:tc>
+      </w:tr>
+      <w:tr>
+        <w:trPr>
+          <w:trHeight w:val="230" w:hRule="exact"/>
+        </w:trPr>
+        <w:tc>
+          <w:tcPr>
+            <w:tcW w:type="dxa" w:w="5256"/>
+          </w:tcPr>
+          <w:p>
+            <w:pPr>
+              <w:spacing w:before="0" w:after="0" w:line="240" w:lineRule="auto"/>
+            </w:pPr>
+          </w:p>
+        </w:tc>
+        <w:tc>
+          <w:tcPr>
+            <w:tcW w:type="dxa" w:w="5256"/>
+          </w:tcPr>
+          <w:p>
+            <w:pPr>
+              <w:spacing w:before="0" w:after="0" w:line="240" w:lineRule="auto"/>
+            </w:pPr>
+          </w:p>
+        </w:tc>
+      </w:tr>
+      <w:tr>
+        <w:trPr>
+          <w:trHeight w:val="230" w:hRule="exact"/>
+        </w:trPr>
+        <w:tc>
+          <w:tcPr>
+            <w:tcW w:type="dxa" w:w="5256"/>
+          </w:tcPr>
+          <w:p>
+            <w:pPr>
+              <w:spacing w:before="0" w:after="0" w:line="240" w:lineRule="auto"/>
+            </w:pPr>
+          </w:p>
+        </w:tc>
+        <w:tc>
+          <w:tcPr>
+            <w:tcW w:type="dxa" w:w="5256"/>
+          </w:tcPr>
+          <w:p>
+            <w:pPr>
+              <w:spacing w:before="0" w:after="0" w:line="240" w:lineRule="auto"/>
+            </w:pPr>
+          </w:p>
+        </w:tc>
+      </w:tr>
+      <w:tr>
+        <w:trPr>
+          <w:trHeight w:val="360" w:hRule="exact"/>
+        </w:trPr>
+        <w:tc>
+          <w:tcPr>
+            <w:tcW w:type="dxa" w:w="5256"/>
+          </w:tcPr>
+          <w:p/>
+        </w:tc>
+        <w:tc>
+          <w:tcPr>
+            <w:tcW w:type="dxa" w:w="5256"/>
+          </w:tcPr>
+          <w:p>
+            <w:pPr>
+              <w:spacing w:before="0" w:after="0" w:line="240" w:lineRule="auto"/>
+              <w:jc w:val="center"/>
+            </w:pPr>
+            <w:r>
+              <w:rPr>
+                <w:rFonts w:ascii="NYU Perstare" w:hAnsi="NYU Perstare"/>
+                <w:b/>
+              </w:rPr>
+              <w:t>Room 624</w:t>
+            </w:r>
+          </w:p>
+        </w:tc>
+      </w:tr>
+    </w:tbl>
+    <w:tbl>
+      <w:tblPr>
+        <w:tblW w:type="auto" w:w="0"/>
+        <w:tblLayout w:type="fixed"/>
+        <w:tblLook w:firstColumn="1" w:firstRow="1" w:lastColumn="0" w:lastRow="0" w:noHBand="0" w:noVBand="1" w:val="04A0"/>
+      </w:tblPr>
+      <w:tblGrid>
+        <w:gridCol w:w="5400"/>
+        <w:gridCol w:w="5400"/>
+      </w:tblGrid>
+      <w:tr>
+        <w:trPr>
+          <w:trHeight w:hRule="auto"/>
+        </w:trPr>
+        <w:tc>
+          <w:tcPr>
+            <w:tcW w:type="dxa" w:w="5256"/>
+          </w:tcPr>
+          <w:p/>
+        </w:tc>
+        <w:tc>
+          <w:tcPr>
+            <w:tcW w:type="dxa" w:w="5256"/>
+          </w:tcPr>
+          <w:p>
+            <w:pPr>
+              <w:spacing w:before="0" w:after="0" w:line="240" w:lineRule="auto"/>
+              <w:jc w:val="center"/>
+            </w:pPr>
+            <w:r>
+              <w:drawing>
+                <wp:inline xmlns:a="http://schemas.openxmlformats.org/drawingml/2006/main" xmlns:pic="http://schemas.openxmlformats.org/drawingml/2006/picture">
+                  <wp:extent cx="1828800" cy="225311"/>
+                  <wp:docPr id="22" name="Picture 22"/>
+                  <wp:cNvGraphicFramePr>
+                    <a:graphicFrameLocks noChangeAspect="1"/>
+                  </wp:cNvGraphicFramePr>
+                  <a:graphic>
+                    <a:graphicData uri="http://schemas.openxmlformats.org/drawingml/2006/picture">
+                      <pic:pic>
+                        <pic:nvPicPr>
+                          <pic:cNvPr id="0" name="image.png"/>
+                          <pic:cNvPicPr/>
+                        </pic:nvPicPr>
+                        <pic:blipFill>
+                          <a:blip r:embed="rId9"/>
+                          <a:stretch>
+                            <a:fillRect/>
+                          </a:stretch>
+                        </pic:blipFill>
+                        <pic:spPr>
+                          <a:xfrm>
+                            <a:off x="0" y="0"/>
+                            <a:ext cx="1828800" cy="225311"/>
+                          </a:xfrm>
+                          <a:prstGeom prst="rect"/>
+                        </pic:spPr>
+                      </pic:pic>
+                    </a:graphicData>
+                  </a:graphic>
+                </wp:inline>
+              </w:drawing>
+            </w:r>
+          </w:p>
+        </w:tc>
+      </w:tr>
+      <w:tr>
+        <w:trPr>
+          <w:trHeight w:hRule="auto"/>
+        </w:trPr>
+        <w:tc>
+          <w:tcPr>
+            <w:tcW w:type="dxa" w:w="5256"/>
+          </w:tcPr>
+          <w:p/>
+        </w:tc>
+        <w:tc>
+          <w:tcPr>
+            <w:tcW w:type="dxa" w:w="5256"/>
+          </w:tcPr>
+          <w:p>
+            <w:pPr>
+              <w:spacing w:before="0" w:after="0" w:line="240" w:lineRule="auto"/>
+              <w:jc w:val="center"/>
+            </w:pPr>
+            <w:r>
+              <w:rPr>
+                <w:rFonts w:ascii="NYU Perstare" w:hAnsi="NYU Perstare"/>
+                <w:b w:val="0"/>
+                <w:sz w:val="12"/>
+              </w:rPr>
+              <w:t>MUSIC AND PERFORMING ARTS PROFESSIONS</w:t>
+            </w:r>
+          </w:p>
+        </w:tc>
+      </w:tr>
+      <w:tr>
+        <w:trPr>
+          <w:trHeight w:val="360" w:hRule="exact"/>
+        </w:trPr>
+        <w:tc>
+          <w:tcPr>
+            <w:tcW w:type="dxa" w:w="5256"/>
+          </w:tcPr>
+          <w:p>
+            <w:pPr>
+              <w:spacing w:before="0" w:after="0" w:line="240" w:lineRule="auto"/>
+              <w:jc w:val="center"/>
+            </w:pPr>
+            <w:r>
+              <w:rPr>
+                <w:rFonts w:ascii="NYU Perstare" w:hAnsi="NYU Perstare"/>
+                <w:b w:val="0"/>
+              </w:rPr>
+              <w:t>Support</w:t>
+            </w:r>
+          </w:p>
+        </w:tc>
+        <w:tc>
+          <w:tcPr>
+            <w:tcW w:type="dxa" w:w="5256"/>
+          </w:tcPr>
+          <w:p>
+            <w:pPr>
+              <w:spacing w:before="0" w:after="0" w:line="240" w:lineRule="auto"/>
+              <w:jc w:val="center"/>
+            </w:pPr>
+            <w:r>
+              <w:rPr>
+                <w:rFonts w:ascii="NYU Perstare" w:hAnsi="NYU Perstare"/>
+                <w:b w:val="0"/>
+              </w:rPr>
+              <w:t>Room Instructions</w:t>
+            </w:r>
+          </w:p>
+        </w:tc>
+      </w:tr>
+      <w:tr>
+        <w:trPr>
+          <w:trHeight w:val="4176" w:hRule="exact"/>
+        </w:trPr>
+        <w:tc>
+          <w:tcPr>
+            <w:tcW w:type="dxa" w:w="5256"/>
+          </w:tcPr>
+          <w:p>
+            <w:pPr>
+              <w:spacing w:before="0" w:after="0" w:line="240" w:lineRule="auto"/>
+              <w:jc w:val="center"/>
+            </w:pPr>
+            <w:r>
+              <w:drawing>
+                <wp:inline xmlns:a="http://schemas.openxmlformats.org/drawingml/2006/main" xmlns:pic="http://schemas.openxmlformats.org/drawingml/2006/picture">
+                  <wp:extent cx="2194560" cy="2532185"/>
+                  <wp:docPr id="23" name="Picture 23"/>
+                  <wp:cNvGraphicFramePr>
+                    <a:graphicFrameLocks noChangeAspect="1"/>
+                  </wp:cNvGraphicFramePr>
+                  <a:graphic>
+                    <a:graphicData uri="http://schemas.openxmlformats.org/drawingml/2006/picture">
+                      <pic:pic>
+                        <pic:nvPicPr>
+                          <pic:cNvPr id="0" name="image.png"/>
+                          <pic:cNvPicPr/>
+                        </pic:nvPicPr>
+                        <pic:blipFill>
+                          <a:blip r:embed="rId10"/>
+                          <a:stretch>
+                            <a:fillRect/>
+                          </a:stretch>
+                        </pic:blipFill>
+                        <pic:spPr>
+                          <a:xfrm>
+                            <a:off x="0" y="0"/>
+                            <a:ext cx="2194560" cy="2532185"/>
+                          </a:xfrm>
+                          <a:prstGeom prst="rect"/>
+                        </pic:spPr>
+                      </pic:pic>
+                    </a:graphicData>
+                  </a:graphic>
+                </wp:inline>
+              </w:drawing>
+            </w:r>
+          </w:p>
+        </w:tc>
+        <w:tc>
+          <w:tcPr>
+            <w:tcW w:type="dxa" w:w="5256"/>
+          </w:tcPr>
+          <w:p>
+            <w:pPr>
+              <w:spacing w:before="0" w:after="0" w:line="240" w:lineRule="auto"/>
+              <w:jc w:val="center"/>
+            </w:pPr>
+            <w:r>
+              <w:drawing>
+                <wp:inline xmlns:a="http://schemas.openxmlformats.org/drawingml/2006/main" xmlns:pic="http://schemas.openxmlformats.org/drawingml/2006/picture">
+                  <wp:extent cx="2194560" cy="2532185"/>
+                  <wp:docPr id="24" name="Picture 24"/>
+                  <wp:cNvGraphicFramePr>
+                    <a:graphicFrameLocks noChangeAspect="1"/>
+                  </wp:cNvGraphicFramePr>
+                  <a:graphic>
+                    <a:graphicData uri="http://schemas.openxmlformats.org/drawingml/2006/picture">
+                      <pic:pic>
+                        <pic:nvPicPr>
+                          <pic:cNvPr id="0" name="image.png"/>
+                          <pic:cNvPicPr/>
+                        </pic:nvPicPr>
+                        <pic:blipFill>
+                          <a:blip r:embed="rId18"/>
+                          <a:stretch>
+                            <a:fillRect/>
+                          </a:stretch>
+                        </pic:blipFill>
+                        <pic:spPr>
+                          <a:xfrm>
+                            <a:off x="0" y="0"/>
+                            <a:ext cx="2194560" cy="2532185"/>
+                          </a:xfrm>
+                          <a:prstGeom prst="rect"/>
+                        </pic:spPr>
+                      </pic:pic>
+                    </a:graphicData>
+                  </a:graphic>
+                </wp:inline>
+              </w:drawing>
+            </w:r>
+          </w:p>
+        </w:tc>
+      </w:tr>
+      <w:tr>
+        <w:trPr>
+          <w:trHeight w:val="230" w:hRule="exact"/>
+        </w:trPr>
+        <w:tc>
+          <w:tcPr>
+            <w:tcW w:type="dxa" w:w="5256"/>
+          </w:tcPr>
+          <w:p>
+            <w:pPr>
+              <w:spacing w:before="0" w:after="0" w:line="240" w:lineRule="auto"/>
+            </w:pPr>
+          </w:p>
+        </w:tc>
+        <w:tc>
+          <w:tcPr>
+            <w:tcW w:type="dxa" w:w="5256"/>
+          </w:tcPr>
+          <w:p>
+            <w:pPr>
+              <w:spacing w:before="0" w:after="0" w:line="240" w:lineRule="auto"/>
+            </w:pPr>
+          </w:p>
+        </w:tc>
+      </w:tr>
+      <w:tr>
+        <w:trPr>
+          <w:trHeight w:val="230" w:hRule="exact"/>
+        </w:trPr>
+        <w:tc>
+          <w:tcPr>
+            <w:tcW w:type="dxa" w:w="5256"/>
+          </w:tcPr>
+          <w:p>
+            <w:pPr>
+              <w:spacing w:before="0" w:after="0" w:line="240" w:lineRule="auto"/>
+            </w:pPr>
+          </w:p>
+        </w:tc>
+        <w:tc>
+          <w:tcPr>
+            <w:tcW w:type="dxa" w:w="5256"/>
+          </w:tcPr>
+          <w:p>
+            <w:pPr>
+              <w:spacing w:before="0" w:after="0" w:line="240" w:lineRule="auto"/>
+            </w:pPr>
+          </w:p>
+        </w:tc>
+      </w:tr>
+      <w:tr>
+        <w:trPr>
+          <w:trHeight w:val="360" w:hRule="exact"/>
+        </w:trPr>
+        <w:tc>
+          <w:tcPr>
+            <w:tcW w:type="dxa" w:w="5256"/>
+          </w:tcPr>
+          <w:p/>
+        </w:tc>
+        <w:tc>
+          <w:tcPr>
+            <w:tcW w:type="dxa" w:w="5256"/>
+          </w:tcPr>
+          <w:p>
+            <w:pPr>
+              <w:spacing w:before="0" w:after="0" w:line="240" w:lineRule="auto"/>
+              <w:jc w:val="center"/>
+            </w:pPr>
+            <w:r>
+              <w:rPr>
+                <w:rFonts w:ascii="NYU Perstare" w:hAnsi="NYU Perstare"/>
+                <w:b/>
+              </w:rPr>
+              <w:t>Acting Lab</w:t>
+            </w:r>
+          </w:p>
+        </w:tc>
+      </w:tr>
+    </w:tbl>
+    <w:p>
+      <w:r>
+        <w:br w:type="page"/>
+      </w:r>
+    </w:p>
+    <w:tbl>
+      <w:tblPr>
+        <w:tblW w:type="auto" w:w="0"/>
+        <w:tblLayout w:type="fixed"/>
+        <w:tblLook w:firstColumn="1" w:firstRow="1" w:lastColumn="0" w:lastRow="0" w:noHBand="0" w:noVBand="1" w:val="04A0"/>
+      </w:tblPr>
+      <w:tblGrid>
+        <w:gridCol w:w="5400"/>
+        <w:gridCol w:w="5400"/>
+      </w:tblGrid>
+      <w:tr>
+        <w:trPr>
+          <w:trHeight w:hRule="auto"/>
+        </w:trPr>
+        <w:tc>
+          <w:tcPr>
+            <w:tcW w:type="dxa" w:w="5256"/>
+          </w:tcPr>
+          <w:p/>
+        </w:tc>
+        <w:tc>
+          <w:tcPr>
+            <w:tcW w:type="dxa" w:w="5256"/>
+          </w:tcPr>
+          <w:p>
+            <w:pPr>
+              <w:spacing w:before="0" w:after="0" w:line="240" w:lineRule="auto"/>
+              <w:jc w:val="center"/>
+            </w:pPr>
+            <w:r>
+              <w:drawing>
+                <wp:inline xmlns:a="http://schemas.openxmlformats.org/drawingml/2006/main" xmlns:pic="http://schemas.openxmlformats.org/drawingml/2006/picture">
+                  <wp:extent cx="1828800" cy="225311"/>
+                  <wp:docPr id="25" name="Picture 25"/>
+                  <wp:cNvGraphicFramePr>
+                    <a:graphicFrameLocks noChangeAspect="1"/>
+                  </wp:cNvGraphicFramePr>
+                  <a:graphic>
+                    <a:graphicData uri="http://schemas.openxmlformats.org/drawingml/2006/picture">
+                      <pic:pic>
+                        <pic:nvPicPr>
+                          <pic:cNvPr id="0" name="image.png"/>
+                          <pic:cNvPicPr/>
+                        </pic:nvPicPr>
+                        <pic:blipFill>
+                          <a:blip r:embed="rId9"/>
+                          <a:stretch>
+                            <a:fillRect/>
+                          </a:stretch>
+                        </pic:blipFill>
+                        <pic:spPr>
+                          <a:xfrm>
+                            <a:off x="0" y="0"/>
+                            <a:ext cx="1828800" cy="225311"/>
+                          </a:xfrm>
+                          <a:prstGeom prst="rect"/>
+                        </pic:spPr>
+                      </pic:pic>
+                    </a:graphicData>
+                  </a:graphic>
+                </wp:inline>
+              </w:drawing>
+            </w:r>
+          </w:p>
+        </w:tc>
+      </w:tr>
+      <w:tr>
+        <w:trPr>
+          <w:trHeight w:hRule="auto"/>
+        </w:trPr>
+        <w:tc>
+          <w:tcPr>
+            <w:tcW w:type="dxa" w:w="5256"/>
+          </w:tcPr>
+          <w:p/>
+        </w:tc>
+        <w:tc>
+          <w:tcPr>
+            <w:tcW w:type="dxa" w:w="5256"/>
+          </w:tcPr>
+          <w:p>
+            <w:pPr>
+              <w:spacing w:before="0" w:after="0" w:line="240" w:lineRule="auto"/>
+              <w:jc w:val="center"/>
+            </w:pPr>
+            <w:r>
+              <w:rPr>
+                <w:rFonts w:ascii="NYU Perstare" w:hAnsi="NYU Perstare"/>
+                <w:b w:val="0"/>
+                <w:sz w:val="12"/>
+              </w:rPr>
+              <w:t>MUSIC AND PERFORMING ARTS PROFESSIONS</w:t>
+            </w:r>
+          </w:p>
+        </w:tc>
+      </w:tr>
+      <w:tr>
+        <w:trPr>
+          <w:trHeight w:val="360" w:hRule="exact"/>
+        </w:trPr>
+        <w:tc>
+          <w:tcPr>
+            <w:tcW w:type="dxa" w:w="5256"/>
+          </w:tcPr>
+          <w:p>
+            <w:pPr>
+              <w:spacing w:before="0" w:after="0" w:line="240" w:lineRule="auto"/>
+              <w:jc w:val="center"/>
+            </w:pPr>
+            <w:r>
+              <w:rPr>
+                <w:rFonts w:ascii="NYU Perstare" w:hAnsi="NYU Perstare"/>
+                <w:b w:val="0"/>
+              </w:rPr>
+              <w:t>Support</w:t>
+            </w:r>
+          </w:p>
+        </w:tc>
+        <w:tc>
+          <w:tcPr>
+            <w:tcW w:type="dxa" w:w="5256"/>
+          </w:tcPr>
+          <w:p>
+            <w:pPr>
+              <w:spacing w:before="0" w:after="0" w:line="240" w:lineRule="auto"/>
+              <w:jc w:val="center"/>
+            </w:pPr>
+            <w:r>
+              <w:rPr>
+                <w:rFonts w:ascii="NYU Perstare" w:hAnsi="NYU Perstare"/>
+                <w:b w:val="0"/>
+              </w:rPr>
+              <w:t>Room Instructions</w:t>
+            </w:r>
+          </w:p>
+        </w:tc>
+      </w:tr>
+      <w:tr>
+        <w:trPr>
+          <w:trHeight w:val="4176" w:hRule="exact"/>
+        </w:trPr>
+        <w:tc>
+          <w:tcPr>
+            <w:tcW w:type="dxa" w:w="5256"/>
+          </w:tcPr>
+          <w:p>
+            <w:pPr>
+              <w:spacing w:before="0" w:after="0" w:line="240" w:lineRule="auto"/>
+              <w:jc w:val="center"/>
+            </w:pPr>
+            <w:r>
+              <w:drawing>
+                <wp:inline xmlns:a="http://schemas.openxmlformats.org/drawingml/2006/main" xmlns:pic="http://schemas.openxmlformats.org/drawingml/2006/picture">
+                  <wp:extent cx="2194560" cy="2532185"/>
+                  <wp:docPr id="26" name="Picture 26"/>
+                  <wp:cNvGraphicFramePr>
+                    <a:graphicFrameLocks noChangeAspect="1"/>
+                  </wp:cNvGraphicFramePr>
+                  <a:graphic>
+                    <a:graphicData uri="http://schemas.openxmlformats.org/drawingml/2006/picture">
+                      <pic:pic>
+                        <pic:nvPicPr>
+                          <pic:cNvPr id="0" name="image.png"/>
+                          <pic:cNvPicPr/>
+                        </pic:nvPicPr>
+                        <pic:blipFill>
+                          <a:blip r:embed="rId10"/>
+                          <a:stretch>
+                            <a:fillRect/>
+                          </a:stretch>
+                        </pic:blipFill>
+                        <pic:spPr>
+                          <a:xfrm>
+                            <a:off x="0" y="0"/>
+                            <a:ext cx="2194560" cy="2532185"/>
+                          </a:xfrm>
+                          <a:prstGeom prst="rect"/>
+                        </pic:spPr>
+                      </pic:pic>
+                    </a:graphicData>
+                  </a:graphic>
+                </wp:inline>
+              </w:drawing>
+            </w:r>
+          </w:p>
+        </w:tc>
+        <w:tc>
+          <w:tcPr>
+            <w:tcW w:type="dxa" w:w="5256"/>
+          </w:tcPr>
+          <w:p>
+            <w:pPr>
+              <w:spacing w:before="0" w:after="0" w:line="240" w:lineRule="auto"/>
+              <w:jc w:val="center"/>
+            </w:pPr>
+            <w:r>
+              <w:drawing>
+                <wp:inline xmlns:a="http://schemas.openxmlformats.org/drawingml/2006/main" xmlns:pic="http://schemas.openxmlformats.org/drawingml/2006/picture">
+                  <wp:extent cx="2194560" cy="2532185"/>
+                  <wp:docPr id="27" name="Picture 27"/>
+                  <wp:cNvGraphicFramePr>
+                    <a:graphicFrameLocks noChangeAspect="1"/>
+                  </wp:cNvGraphicFramePr>
+                  <a:graphic>
+                    <a:graphicData uri="http://schemas.openxmlformats.org/drawingml/2006/picture">
+                      <pic:pic>
+                        <pic:nvPicPr>
+                          <pic:cNvPr id="0" name="image.png"/>
+                          <pic:cNvPicPr/>
+                        </pic:nvPicPr>
+                        <pic:blipFill>
+                          <a:blip r:embed="rId19"/>
+                          <a:stretch>
+                            <a:fillRect/>
+                          </a:stretch>
+                        </pic:blipFill>
+                        <pic:spPr>
+                          <a:xfrm>
+                            <a:off x="0" y="0"/>
+                            <a:ext cx="2194560" cy="2532185"/>
+                          </a:xfrm>
+                          <a:prstGeom prst="rect"/>
+                        </pic:spPr>
+                      </pic:pic>
+                    </a:graphicData>
+                  </a:graphic>
+                </wp:inline>
+              </w:drawing>
+            </w:r>
+          </w:p>
+        </w:tc>
+      </w:tr>
+      <w:tr>
+        <w:trPr>
+          <w:trHeight w:val="230" w:hRule="exact"/>
+        </w:trPr>
+        <w:tc>
+          <w:tcPr>
+            <w:tcW w:type="dxa" w:w="5256"/>
+          </w:tcPr>
+          <w:p>
+            <w:pPr>
+              <w:spacing w:before="0" w:after="0" w:line="240" w:lineRule="auto"/>
+            </w:pPr>
+          </w:p>
+        </w:tc>
+        <w:tc>
+          <w:tcPr>
+            <w:tcW w:type="dxa" w:w="5256"/>
+          </w:tcPr>
+          <w:p>
+            <w:pPr>
+              <w:spacing w:before="0" w:after="0" w:line="240" w:lineRule="auto"/>
+            </w:pPr>
+          </w:p>
+        </w:tc>
+      </w:tr>
+      <w:tr>
+        <w:trPr>
+          <w:trHeight w:val="230" w:hRule="exact"/>
+        </w:trPr>
+        <w:tc>
+          <w:tcPr>
+            <w:tcW w:type="dxa" w:w="5256"/>
+          </w:tcPr>
+          <w:p>
+            <w:pPr>
+              <w:spacing w:before="0" w:after="0" w:line="240" w:lineRule="auto"/>
+            </w:pPr>
+          </w:p>
+        </w:tc>
+        <w:tc>
+          <w:tcPr>
+            <w:tcW w:type="dxa" w:w="5256"/>
+          </w:tcPr>
+          <w:p>
+            <w:pPr>
+              <w:spacing w:before="0" w:after="0" w:line="240" w:lineRule="auto"/>
+            </w:pPr>
+          </w:p>
+        </w:tc>
+      </w:tr>
+      <w:tr>
+        <w:trPr>
+          <w:trHeight w:val="360" w:hRule="exact"/>
+        </w:trPr>
+        <w:tc>
+          <w:tcPr>
+            <w:tcW w:type="dxa" w:w="5256"/>
+          </w:tcPr>
+          <w:p/>
+        </w:tc>
+        <w:tc>
+          <w:tcPr>
+            <w:tcW w:type="dxa" w:w="5256"/>
+          </w:tcPr>
+          <w:p>
+            <w:pPr>
+              <w:spacing w:before="0" w:after="0" w:line="240" w:lineRule="auto"/>
+              <w:jc w:val="center"/>
+            </w:pPr>
+            <w:r>
+              <w:rPr>
+                <w:rFonts w:ascii="NYU Perstare" w:hAnsi="NYU Perstare"/>
+                <w:b/>
+              </w:rPr>
+              <w:t>Drama Therapy</w:t>
             </w:r>
           </w:p>
         </w:tc>

</xml_diff>

<commit_message>
Update YouTube embed to ayf1sYiNLhQ, penthouse content, and QR codes
Co-authored-by: Cursor <cursoragent@cursor.com>
</commit_message>
<xml_diff>
--- a/qr_codes/print_cards.docx
+++ b/qr_codes/print_cards.docx
@@ -34,7 +34,7 @@
             <w:r>
               <w:drawing>
                 <wp:inline xmlns:a="http://schemas.openxmlformats.org/drawingml/2006/main" xmlns:pic="http://schemas.openxmlformats.org/drawingml/2006/picture">
-                  <wp:extent cx="1828800" cy="225311"/>
+                  <wp:extent cx="1828800" cy="1828800"/>
                   <wp:docPr id="1" name="Picture 1"/>
                   <wp:cNvGraphicFramePr>
                     <a:graphicFrameLocks noChangeAspect="1"/>
@@ -55,7 +55,7 @@
                         <pic:spPr>
                           <a:xfrm>
                             <a:off x="0" y="0"/>
-                            <a:ext cx="1828800" cy="225311"/>
+                            <a:ext cx="1828800" cy="1828800"/>
                           </a:xfrm>
                           <a:prstGeom prst="rect"/>
                         </pic:spPr>
@@ -308,7 +308,7 @@
                 <w:rFonts w:ascii="NYU Perstare" w:hAnsi="NYU Perstare"/>
                 <w:b/>
               </w:rPr>
-              <w:t>Room 560</w:t>
+              <w:t>Studio A</w:t>
             </w:r>
           </w:p>
         </w:tc>
@@ -346,7 +346,7 @@
             <w:r>
               <w:drawing>
                 <wp:inline xmlns:a="http://schemas.openxmlformats.org/drawingml/2006/main" xmlns:pic="http://schemas.openxmlformats.org/drawingml/2006/picture">
-                  <wp:extent cx="1828800" cy="225311"/>
+                  <wp:extent cx="1828800" cy="1828800"/>
                   <wp:docPr id="4" name="Picture 4"/>
                   <wp:cNvGraphicFramePr>
                     <a:graphicFrameLocks noChangeAspect="1"/>
@@ -367,7 +367,7 @@
                         <pic:spPr>
                           <a:xfrm>
                             <a:off x="0" y="0"/>
-                            <a:ext cx="1828800" cy="225311"/>
+                            <a:ext cx="1828800" cy="1828800"/>
                           </a:xfrm>
                           <a:prstGeom prst="rect"/>
                         </pic:spPr>
@@ -620,7 +620,7 @@
                 <w:rFonts w:ascii="NYU Perstare" w:hAnsi="NYU Perstare"/>
                 <w:b/>
               </w:rPr>
-              <w:t>Room 562</w:t>
+              <w:t>Studio C</w:t>
             </w:r>
           </w:p>
         </w:tc>
@@ -663,7 +663,7 @@
             <w:r>
               <w:drawing>
                 <wp:inline xmlns:a="http://schemas.openxmlformats.org/drawingml/2006/main" xmlns:pic="http://schemas.openxmlformats.org/drawingml/2006/picture">
-                  <wp:extent cx="1828800" cy="225311"/>
+                  <wp:extent cx="1828800" cy="1828800"/>
                   <wp:docPr id="7" name="Picture 7"/>
                   <wp:cNvGraphicFramePr>
                     <a:graphicFrameLocks noChangeAspect="1"/>
@@ -684,7 +684,7 @@
                         <pic:spPr>
                           <a:xfrm>
                             <a:off x="0" y="0"/>
-                            <a:ext cx="1828800" cy="225311"/>
+                            <a:ext cx="1828800" cy="1828800"/>
                           </a:xfrm>
                           <a:prstGeom prst="rect"/>
                         </pic:spPr>
@@ -937,7 +937,7 @@
                 <w:rFonts w:ascii="NYU Perstare" w:hAnsi="NYU Perstare"/>
                 <w:b/>
               </w:rPr>
-              <w:t>Room 570</w:t>
+              <w:t>Studio D</w:t>
             </w:r>
           </w:p>
         </w:tc>
@@ -975,7 +975,7 @@
             <w:r>
               <w:drawing>
                 <wp:inline xmlns:a="http://schemas.openxmlformats.org/drawingml/2006/main" xmlns:pic="http://schemas.openxmlformats.org/drawingml/2006/picture">
-                  <wp:extent cx="1828800" cy="225311"/>
+                  <wp:extent cx="1828800" cy="1828800"/>
                   <wp:docPr id="10" name="Picture 10"/>
                   <wp:cNvGraphicFramePr>
                     <a:graphicFrameLocks noChangeAspect="1"/>
@@ -996,7 +996,7 @@
                         <pic:spPr>
                           <a:xfrm>
                             <a:off x="0" y="0"/>
-                            <a:ext cx="1828800" cy="225311"/>
+                            <a:ext cx="1828800" cy="1828800"/>
                           </a:xfrm>
                           <a:prstGeom prst="rect"/>
                         </pic:spPr>
@@ -1249,7 +1249,7 @@
                 <w:rFonts w:ascii="NYU Perstare" w:hAnsi="NYU Perstare"/>
                 <w:b/>
               </w:rPr>
-              <w:t>Room 582</w:t>
+              <w:t>Studio D1</w:t>
             </w:r>
           </w:p>
         </w:tc>
@@ -1292,7 +1292,7 @@
             <w:r>
               <w:drawing>
                 <wp:inline xmlns:a="http://schemas.openxmlformats.org/drawingml/2006/main" xmlns:pic="http://schemas.openxmlformats.org/drawingml/2006/picture">
-                  <wp:extent cx="1828800" cy="225311"/>
+                  <wp:extent cx="1828800" cy="1828800"/>
                   <wp:docPr id="13" name="Picture 13"/>
                   <wp:cNvGraphicFramePr>
                     <a:graphicFrameLocks noChangeAspect="1"/>
@@ -1313,7 +1313,7 @@
                         <pic:spPr>
                           <a:xfrm>
                             <a:off x="0" y="0"/>
-                            <a:ext cx="1828800" cy="225311"/>
+                            <a:ext cx="1828800" cy="1828800"/>
                           </a:xfrm>
                           <a:prstGeom prst="rect"/>
                         </pic:spPr>
@@ -1566,7 +1566,7 @@
                 <w:rFonts w:ascii="NYU Perstare" w:hAnsi="NYU Perstare"/>
                 <w:b/>
               </w:rPr>
-              <w:t>Room 620</w:t>
+              <w:t>Studio E</w:t>
             </w:r>
           </w:p>
         </w:tc>
@@ -1604,7 +1604,7 @@
             <w:r>
               <w:drawing>
                 <wp:inline xmlns:a="http://schemas.openxmlformats.org/drawingml/2006/main" xmlns:pic="http://schemas.openxmlformats.org/drawingml/2006/picture">
-                  <wp:extent cx="1828800" cy="225311"/>
+                  <wp:extent cx="1828800" cy="1828800"/>
                   <wp:docPr id="16" name="Picture 16"/>
                   <wp:cNvGraphicFramePr>
                     <a:graphicFrameLocks noChangeAspect="1"/>
@@ -1625,7 +1625,7 @@
                         <pic:spPr>
                           <a:xfrm>
                             <a:off x="0" y="0"/>
-                            <a:ext cx="1828800" cy="225311"/>
+                            <a:ext cx="1828800" cy="1828800"/>
                           </a:xfrm>
                           <a:prstGeom prst="rect"/>
                         </pic:spPr>
@@ -1878,7 +1878,7 @@
                 <w:rFonts w:ascii="NYU Perstare" w:hAnsi="NYU Perstare"/>
                 <w:b/>
               </w:rPr>
-              <w:t>Room 623</w:t>
+              <w:t>Studio F</w:t>
             </w:r>
           </w:p>
         </w:tc>
@@ -1921,7 +1921,7 @@
             <w:r>
               <w:drawing>
                 <wp:inline xmlns:a="http://schemas.openxmlformats.org/drawingml/2006/main" xmlns:pic="http://schemas.openxmlformats.org/drawingml/2006/picture">
-                  <wp:extent cx="1828800" cy="225311"/>
+                  <wp:extent cx="1828800" cy="1828800"/>
                   <wp:docPr id="19" name="Picture 19"/>
                   <wp:cNvGraphicFramePr>
                     <a:graphicFrameLocks noChangeAspect="1"/>
@@ -1942,7 +1942,7 @@
                         <pic:spPr>
                           <a:xfrm>
                             <a:off x="0" y="0"/>
-                            <a:ext cx="1828800" cy="225311"/>
+                            <a:ext cx="1828800" cy="1828800"/>
                           </a:xfrm>
                           <a:prstGeom prst="rect"/>
                         </pic:spPr>
@@ -2195,7 +2195,7 @@
                 <w:rFonts w:ascii="NYU Perstare" w:hAnsi="NYU Perstare"/>
                 <w:b/>
               </w:rPr>
-              <w:t>Room 624</w:t>
+              <w:t>Room 302 A</w:t>
             </w:r>
           </w:p>
         </w:tc>
@@ -2233,7 +2233,7 @@
             <w:r>
               <w:drawing>
                 <wp:inline xmlns:a="http://schemas.openxmlformats.org/drawingml/2006/main" xmlns:pic="http://schemas.openxmlformats.org/drawingml/2006/picture">
-                  <wp:extent cx="1828800" cy="225311"/>
+                  <wp:extent cx="1828800" cy="1828800"/>
                   <wp:docPr id="22" name="Picture 22"/>
                   <wp:cNvGraphicFramePr>
                     <a:graphicFrameLocks noChangeAspect="1"/>
@@ -2254,7 +2254,7 @@
                         <pic:spPr>
                           <a:xfrm>
                             <a:off x="0" y="0"/>
-                            <a:ext cx="1828800" cy="225311"/>
+                            <a:ext cx="1828800" cy="1828800"/>
                           </a:xfrm>
                           <a:prstGeom prst="rect"/>
                         </pic:spPr>
@@ -2412,7 +2412,7 @@
                           <pic:cNvPicPr/>
                         </pic:nvPicPr>
                         <pic:blipFill>
-                          <a:blip r:embed="rId18"/>
+                          <a:blip r:embed="rId17"/>
                           <a:stretch>
                             <a:fillRect/>
                           </a:stretch>
@@ -2507,7 +2507,7 @@
                 <w:rFonts w:ascii="NYU Perstare" w:hAnsi="NYU Perstare"/>
                 <w:b/>
               </w:rPr>
-              <w:t>Acting Lab</w:t>
+              <w:t>Room 302 B</w:t>
             </w:r>
           </w:p>
         </w:tc>
@@ -2550,7 +2550,7 @@
             <w:r>
               <w:drawing>
                 <wp:inline xmlns:a="http://schemas.openxmlformats.org/drawingml/2006/main" xmlns:pic="http://schemas.openxmlformats.org/drawingml/2006/picture">
-                  <wp:extent cx="1828800" cy="225311"/>
+                  <wp:extent cx="1828800" cy="1828800"/>
                   <wp:docPr id="25" name="Picture 25"/>
                   <wp:cNvGraphicFramePr>
                     <a:graphicFrameLocks noChangeAspect="1"/>
@@ -2571,7 +2571,7 @@
                         <pic:spPr>
                           <a:xfrm>
                             <a:off x="0" y="0"/>
-                            <a:ext cx="1828800" cy="225311"/>
+                            <a:ext cx="1828800" cy="1828800"/>
                           </a:xfrm>
                           <a:prstGeom prst="rect"/>
                         </pic:spPr>
@@ -2729,6 +2729,947 @@
                           <pic:cNvPicPr/>
                         </pic:nvPicPr>
                         <pic:blipFill>
+                          <a:blip r:embed="rId17"/>
+                          <a:stretch>
+                            <a:fillRect/>
+                          </a:stretch>
+                        </pic:blipFill>
+                        <pic:spPr>
+                          <a:xfrm>
+                            <a:off x="0" y="0"/>
+                            <a:ext cx="2194560" cy="2532185"/>
+                          </a:xfrm>
+                          <a:prstGeom prst="rect"/>
+                        </pic:spPr>
+                      </pic:pic>
+                    </a:graphicData>
+                  </a:graphic>
+                </wp:inline>
+              </w:drawing>
+            </w:r>
+          </w:p>
+        </w:tc>
+      </w:tr>
+      <w:tr>
+        <w:trPr>
+          <w:trHeight w:val="230" w:hRule="exact"/>
+        </w:trPr>
+        <w:tc>
+          <w:tcPr>
+            <w:tcW w:type="dxa" w:w="5256"/>
+          </w:tcPr>
+          <w:p>
+            <w:pPr>
+              <w:spacing w:before="0" w:after="0" w:line="240" w:lineRule="auto"/>
+            </w:pPr>
+          </w:p>
+        </w:tc>
+        <w:tc>
+          <w:tcPr>
+            <w:tcW w:type="dxa" w:w="5256"/>
+          </w:tcPr>
+          <w:p>
+            <w:pPr>
+              <w:spacing w:before="0" w:after="0" w:line="240" w:lineRule="auto"/>
+            </w:pPr>
+          </w:p>
+        </w:tc>
+      </w:tr>
+      <w:tr>
+        <w:trPr>
+          <w:trHeight w:val="230" w:hRule="exact"/>
+        </w:trPr>
+        <w:tc>
+          <w:tcPr>
+            <w:tcW w:type="dxa" w:w="5256"/>
+          </w:tcPr>
+          <w:p>
+            <w:pPr>
+              <w:spacing w:before="0" w:after="0" w:line="240" w:lineRule="auto"/>
+            </w:pPr>
+          </w:p>
+        </w:tc>
+        <w:tc>
+          <w:tcPr>
+            <w:tcW w:type="dxa" w:w="5256"/>
+          </w:tcPr>
+          <w:p>
+            <w:pPr>
+              <w:spacing w:before="0" w:after="0" w:line="240" w:lineRule="auto"/>
+            </w:pPr>
+          </w:p>
+        </w:tc>
+      </w:tr>
+      <w:tr>
+        <w:trPr>
+          <w:trHeight w:val="360" w:hRule="exact"/>
+        </w:trPr>
+        <w:tc>
+          <w:tcPr>
+            <w:tcW w:type="dxa" w:w="5256"/>
+          </w:tcPr>
+          <w:p/>
+        </w:tc>
+        <w:tc>
+          <w:tcPr>
+            <w:tcW w:type="dxa" w:w="5256"/>
+          </w:tcPr>
+          <w:p>
+            <w:pPr>
+              <w:spacing w:before="0" w:after="0" w:line="240" w:lineRule="auto"/>
+              <w:jc w:val="center"/>
+            </w:pPr>
+            <w:r>
+              <w:rPr>
+                <w:rFonts w:ascii="NYU Perstare" w:hAnsi="NYU Perstare"/>
+                <w:b/>
+              </w:rPr>
+              <w:t>Room 302 C</w:t>
+            </w:r>
+          </w:p>
+        </w:tc>
+      </w:tr>
+    </w:tbl>
+    <w:tbl>
+      <w:tblPr>
+        <w:tblW w:type="auto" w:w="0"/>
+        <w:tblLayout w:type="fixed"/>
+        <w:tblLook w:firstColumn="1" w:firstRow="1" w:lastColumn="0" w:lastRow="0" w:noHBand="0" w:noVBand="1" w:val="04A0"/>
+      </w:tblPr>
+      <w:tblGrid>
+        <w:gridCol w:w="5400"/>
+        <w:gridCol w:w="5400"/>
+      </w:tblGrid>
+      <w:tr>
+        <w:trPr>
+          <w:trHeight w:hRule="auto"/>
+        </w:trPr>
+        <w:tc>
+          <w:tcPr>
+            <w:tcW w:type="dxa" w:w="5256"/>
+          </w:tcPr>
+          <w:p/>
+        </w:tc>
+        <w:tc>
+          <w:tcPr>
+            <w:tcW w:type="dxa" w:w="5256"/>
+          </w:tcPr>
+          <w:p>
+            <w:pPr>
+              <w:spacing w:before="0" w:after="0" w:line="240" w:lineRule="auto"/>
+              <w:jc w:val="center"/>
+            </w:pPr>
+            <w:r>
+              <w:drawing>
+                <wp:inline xmlns:a="http://schemas.openxmlformats.org/drawingml/2006/main" xmlns:pic="http://schemas.openxmlformats.org/drawingml/2006/picture">
+                  <wp:extent cx="1828800" cy="1828800"/>
+                  <wp:docPr id="28" name="Picture 28"/>
+                  <wp:cNvGraphicFramePr>
+                    <a:graphicFrameLocks noChangeAspect="1"/>
+                  </wp:cNvGraphicFramePr>
+                  <a:graphic>
+                    <a:graphicData uri="http://schemas.openxmlformats.org/drawingml/2006/picture">
+                      <pic:pic>
+                        <pic:nvPicPr>
+                          <pic:cNvPr id="0" name="image.png"/>
+                          <pic:cNvPicPr/>
+                        </pic:nvPicPr>
+                        <pic:blipFill>
+                          <a:blip r:embed="rId9"/>
+                          <a:stretch>
+                            <a:fillRect/>
+                          </a:stretch>
+                        </pic:blipFill>
+                        <pic:spPr>
+                          <a:xfrm>
+                            <a:off x="0" y="0"/>
+                            <a:ext cx="1828800" cy="1828800"/>
+                          </a:xfrm>
+                          <a:prstGeom prst="rect"/>
+                        </pic:spPr>
+                      </pic:pic>
+                    </a:graphicData>
+                  </a:graphic>
+                </wp:inline>
+              </w:drawing>
+            </w:r>
+          </w:p>
+        </w:tc>
+      </w:tr>
+      <w:tr>
+        <w:trPr>
+          <w:trHeight w:hRule="auto"/>
+        </w:trPr>
+        <w:tc>
+          <w:tcPr>
+            <w:tcW w:type="dxa" w:w="5256"/>
+          </w:tcPr>
+          <w:p/>
+        </w:tc>
+        <w:tc>
+          <w:tcPr>
+            <w:tcW w:type="dxa" w:w="5256"/>
+          </w:tcPr>
+          <w:p>
+            <w:pPr>
+              <w:spacing w:before="0" w:after="0" w:line="240" w:lineRule="auto"/>
+              <w:jc w:val="center"/>
+            </w:pPr>
+            <w:r>
+              <w:rPr>
+                <w:rFonts w:ascii="NYU Perstare" w:hAnsi="NYU Perstare"/>
+                <w:b w:val="0"/>
+                <w:sz w:val="12"/>
+              </w:rPr>
+              <w:t>MUSIC AND PERFORMING ARTS PROFESSIONS</w:t>
+            </w:r>
+          </w:p>
+        </w:tc>
+      </w:tr>
+      <w:tr>
+        <w:trPr>
+          <w:trHeight w:val="360" w:hRule="exact"/>
+        </w:trPr>
+        <w:tc>
+          <w:tcPr>
+            <w:tcW w:type="dxa" w:w="5256"/>
+          </w:tcPr>
+          <w:p>
+            <w:pPr>
+              <w:spacing w:before="0" w:after="0" w:line="240" w:lineRule="auto"/>
+              <w:jc w:val="center"/>
+            </w:pPr>
+            <w:r>
+              <w:rPr>
+                <w:rFonts w:ascii="NYU Perstare" w:hAnsi="NYU Perstare"/>
+                <w:b w:val="0"/>
+              </w:rPr>
+              <w:t>Support</w:t>
+            </w:r>
+          </w:p>
+        </w:tc>
+        <w:tc>
+          <w:tcPr>
+            <w:tcW w:type="dxa" w:w="5256"/>
+          </w:tcPr>
+          <w:p>
+            <w:pPr>
+              <w:spacing w:before="0" w:after="0" w:line="240" w:lineRule="auto"/>
+              <w:jc w:val="center"/>
+            </w:pPr>
+            <w:r>
+              <w:rPr>
+                <w:rFonts w:ascii="NYU Perstare" w:hAnsi="NYU Perstare"/>
+                <w:b w:val="0"/>
+              </w:rPr>
+              <w:t>Room Instructions</w:t>
+            </w:r>
+          </w:p>
+        </w:tc>
+      </w:tr>
+      <w:tr>
+        <w:trPr>
+          <w:trHeight w:val="4176" w:hRule="exact"/>
+        </w:trPr>
+        <w:tc>
+          <w:tcPr>
+            <w:tcW w:type="dxa" w:w="5256"/>
+          </w:tcPr>
+          <w:p>
+            <w:pPr>
+              <w:spacing w:before="0" w:after="0" w:line="240" w:lineRule="auto"/>
+              <w:jc w:val="center"/>
+            </w:pPr>
+            <w:r>
+              <w:drawing>
+                <wp:inline xmlns:a="http://schemas.openxmlformats.org/drawingml/2006/main" xmlns:pic="http://schemas.openxmlformats.org/drawingml/2006/picture">
+                  <wp:extent cx="2194560" cy="2532185"/>
+                  <wp:docPr id="29" name="Picture 29"/>
+                  <wp:cNvGraphicFramePr>
+                    <a:graphicFrameLocks noChangeAspect="1"/>
+                  </wp:cNvGraphicFramePr>
+                  <a:graphic>
+                    <a:graphicData uri="http://schemas.openxmlformats.org/drawingml/2006/picture">
+                      <pic:pic>
+                        <pic:nvPicPr>
+                          <pic:cNvPr id="0" name="image.png"/>
+                          <pic:cNvPicPr/>
+                        </pic:nvPicPr>
+                        <pic:blipFill>
+                          <a:blip r:embed="rId10"/>
+                          <a:stretch>
+                            <a:fillRect/>
+                          </a:stretch>
+                        </pic:blipFill>
+                        <pic:spPr>
+                          <a:xfrm>
+                            <a:off x="0" y="0"/>
+                            <a:ext cx="2194560" cy="2532185"/>
+                          </a:xfrm>
+                          <a:prstGeom prst="rect"/>
+                        </pic:spPr>
+                      </pic:pic>
+                    </a:graphicData>
+                  </a:graphic>
+                </wp:inline>
+              </w:drawing>
+            </w:r>
+          </w:p>
+        </w:tc>
+        <w:tc>
+          <w:tcPr>
+            <w:tcW w:type="dxa" w:w="5256"/>
+          </w:tcPr>
+          <w:p>
+            <w:pPr>
+              <w:spacing w:before="0" w:after="0" w:line="240" w:lineRule="auto"/>
+              <w:jc w:val="center"/>
+            </w:pPr>
+            <w:r>
+              <w:drawing>
+                <wp:inline xmlns:a="http://schemas.openxmlformats.org/drawingml/2006/main" xmlns:pic="http://schemas.openxmlformats.org/drawingml/2006/picture">
+                  <wp:extent cx="2194560" cy="2532185"/>
+                  <wp:docPr id="30" name="Picture 30"/>
+                  <wp:cNvGraphicFramePr>
+                    <a:graphicFrameLocks noChangeAspect="1"/>
+                  </wp:cNvGraphicFramePr>
+                  <a:graphic>
+                    <a:graphicData uri="http://schemas.openxmlformats.org/drawingml/2006/picture">
+                      <pic:pic>
+                        <pic:nvPicPr>
+                          <pic:cNvPr id="0" name="image.png"/>
+                          <pic:cNvPicPr/>
+                        </pic:nvPicPr>
+                        <pic:blipFill>
+                          <a:blip r:embed="rId17"/>
+                          <a:stretch>
+                            <a:fillRect/>
+                          </a:stretch>
+                        </pic:blipFill>
+                        <pic:spPr>
+                          <a:xfrm>
+                            <a:off x="0" y="0"/>
+                            <a:ext cx="2194560" cy="2532185"/>
+                          </a:xfrm>
+                          <a:prstGeom prst="rect"/>
+                        </pic:spPr>
+                      </pic:pic>
+                    </a:graphicData>
+                  </a:graphic>
+                </wp:inline>
+              </w:drawing>
+            </w:r>
+          </w:p>
+        </w:tc>
+      </w:tr>
+      <w:tr>
+        <w:trPr>
+          <w:trHeight w:val="230" w:hRule="exact"/>
+        </w:trPr>
+        <w:tc>
+          <w:tcPr>
+            <w:tcW w:type="dxa" w:w="5256"/>
+          </w:tcPr>
+          <w:p>
+            <w:pPr>
+              <w:spacing w:before="0" w:after="0" w:line="240" w:lineRule="auto"/>
+            </w:pPr>
+          </w:p>
+        </w:tc>
+        <w:tc>
+          <w:tcPr>
+            <w:tcW w:type="dxa" w:w="5256"/>
+          </w:tcPr>
+          <w:p>
+            <w:pPr>
+              <w:spacing w:before="0" w:after="0" w:line="240" w:lineRule="auto"/>
+            </w:pPr>
+          </w:p>
+        </w:tc>
+      </w:tr>
+      <w:tr>
+        <w:trPr>
+          <w:trHeight w:val="230" w:hRule="exact"/>
+        </w:trPr>
+        <w:tc>
+          <w:tcPr>
+            <w:tcW w:type="dxa" w:w="5256"/>
+          </w:tcPr>
+          <w:p>
+            <w:pPr>
+              <w:spacing w:before="0" w:after="0" w:line="240" w:lineRule="auto"/>
+            </w:pPr>
+          </w:p>
+        </w:tc>
+        <w:tc>
+          <w:tcPr>
+            <w:tcW w:type="dxa" w:w="5256"/>
+          </w:tcPr>
+          <w:p>
+            <w:pPr>
+              <w:spacing w:before="0" w:after="0" w:line="240" w:lineRule="auto"/>
+            </w:pPr>
+          </w:p>
+        </w:tc>
+      </w:tr>
+      <w:tr>
+        <w:trPr>
+          <w:trHeight w:val="360" w:hRule="exact"/>
+        </w:trPr>
+        <w:tc>
+          <w:tcPr>
+            <w:tcW w:type="dxa" w:w="5256"/>
+          </w:tcPr>
+          <w:p/>
+        </w:tc>
+        <w:tc>
+          <w:tcPr>
+            <w:tcW w:type="dxa" w:w="5256"/>
+          </w:tcPr>
+          <w:p>
+            <w:pPr>
+              <w:spacing w:before="0" w:after="0" w:line="240" w:lineRule="auto"/>
+              <w:jc w:val="center"/>
+            </w:pPr>
+            <w:r>
+              <w:rPr>
+                <w:rFonts w:ascii="NYU Perstare" w:hAnsi="NYU Perstare"/>
+                <w:b/>
+              </w:rPr>
+              <w:t>Room 302 D</w:t>
+            </w:r>
+          </w:p>
+        </w:tc>
+      </w:tr>
+    </w:tbl>
+    <w:p>
+      <w:r>
+        <w:br w:type="page"/>
+      </w:r>
+    </w:p>
+    <w:tbl>
+      <w:tblPr>
+        <w:tblW w:type="auto" w:w="0"/>
+        <w:tblLayout w:type="fixed"/>
+        <w:tblLook w:firstColumn="1" w:firstRow="1" w:lastColumn="0" w:lastRow="0" w:noHBand="0" w:noVBand="1" w:val="04A0"/>
+      </w:tblPr>
+      <w:tblGrid>
+        <w:gridCol w:w="5400"/>
+        <w:gridCol w:w="5400"/>
+      </w:tblGrid>
+      <w:tr>
+        <w:trPr>
+          <w:trHeight w:hRule="auto"/>
+        </w:trPr>
+        <w:tc>
+          <w:tcPr>
+            <w:tcW w:type="dxa" w:w="5256"/>
+          </w:tcPr>
+          <w:p/>
+        </w:tc>
+        <w:tc>
+          <w:tcPr>
+            <w:tcW w:type="dxa" w:w="5256"/>
+          </w:tcPr>
+          <w:p>
+            <w:pPr>
+              <w:spacing w:before="0" w:after="0" w:line="240" w:lineRule="auto"/>
+              <w:jc w:val="center"/>
+            </w:pPr>
+            <w:r>
+              <w:drawing>
+                <wp:inline xmlns:a="http://schemas.openxmlformats.org/drawingml/2006/main" xmlns:pic="http://schemas.openxmlformats.org/drawingml/2006/picture">
+                  <wp:extent cx="1828800" cy="1828800"/>
+                  <wp:docPr id="31" name="Picture 31"/>
+                  <wp:cNvGraphicFramePr>
+                    <a:graphicFrameLocks noChangeAspect="1"/>
+                  </wp:cNvGraphicFramePr>
+                  <a:graphic>
+                    <a:graphicData uri="http://schemas.openxmlformats.org/drawingml/2006/picture">
+                      <pic:pic>
+                        <pic:nvPicPr>
+                          <pic:cNvPr id="0" name="image.png"/>
+                          <pic:cNvPicPr/>
+                        </pic:nvPicPr>
+                        <pic:blipFill>
+                          <a:blip r:embed="rId9"/>
+                          <a:stretch>
+                            <a:fillRect/>
+                          </a:stretch>
+                        </pic:blipFill>
+                        <pic:spPr>
+                          <a:xfrm>
+                            <a:off x="0" y="0"/>
+                            <a:ext cx="1828800" cy="1828800"/>
+                          </a:xfrm>
+                          <a:prstGeom prst="rect"/>
+                        </pic:spPr>
+                      </pic:pic>
+                    </a:graphicData>
+                  </a:graphic>
+                </wp:inline>
+              </w:drawing>
+            </w:r>
+          </w:p>
+        </w:tc>
+      </w:tr>
+      <w:tr>
+        <w:trPr>
+          <w:trHeight w:hRule="auto"/>
+        </w:trPr>
+        <w:tc>
+          <w:tcPr>
+            <w:tcW w:type="dxa" w:w="5256"/>
+          </w:tcPr>
+          <w:p/>
+        </w:tc>
+        <w:tc>
+          <w:tcPr>
+            <w:tcW w:type="dxa" w:w="5256"/>
+          </w:tcPr>
+          <w:p>
+            <w:pPr>
+              <w:spacing w:before="0" w:after="0" w:line="240" w:lineRule="auto"/>
+              <w:jc w:val="center"/>
+            </w:pPr>
+            <w:r>
+              <w:rPr>
+                <w:rFonts w:ascii="NYU Perstare" w:hAnsi="NYU Perstare"/>
+                <w:b w:val="0"/>
+                <w:sz w:val="12"/>
+              </w:rPr>
+              <w:t>MUSIC AND PERFORMING ARTS PROFESSIONS</w:t>
+            </w:r>
+          </w:p>
+        </w:tc>
+      </w:tr>
+      <w:tr>
+        <w:trPr>
+          <w:trHeight w:val="360" w:hRule="exact"/>
+        </w:trPr>
+        <w:tc>
+          <w:tcPr>
+            <w:tcW w:type="dxa" w:w="5256"/>
+          </w:tcPr>
+          <w:p>
+            <w:pPr>
+              <w:spacing w:before="0" w:after="0" w:line="240" w:lineRule="auto"/>
+              <w:jc w:val="center"/>
+            </w:pPr>
+            <w:r>
+              <w:rPr>
+                <w:rFonts w:ascii="NYU Perstare" w:hAnsi="NYU Perstare"/>
+                <w:b w:val="0"/>
+              </w:rPr>
+              <w:t>Support</w:t>
+            </w:r>
+          </w:p>
+        </w:tc>
+        <w:tc>
+          <w:tcPr>
+            <w:tcW w:type="dxa" w:w="5256"/>
+          </w:tcPr>
+          <w:p>
+            <w:pPr>
+              <w:spacing w:before="0" w:after="0" w:line="240" w:lineRule="auto"/>
+              <w:jc w:val="center"/>
+            </w:pPr>
+            <w:r>
+              <w:rPr>
+                <w:rFonts w:ascii="NYU Perstare" w:hAnsi="NYU Perstare"/>
+                <w:b w:val="0"/>
+              </w:rPr>
+              <w:t>Room Instructions</w:t>
+            </w:r>
+          </w:p>
+        </w:tc>
+      </w:tr>
+      <w:tr>
+        <w:trPr>
+          <w:trHeight w:val="4176" w:hRule="exact"/>
+        </w:trPr>
+        <w:tc>
+          <w:tcPr>
+            <w:tcW w:type="dxa" w:w="5256"/>
+          </w:tcPr>
+          <w:p>
+            <w:pPr>
+              <w:spacing w:before="0" w:after="0" w:line="240" w:lineRule="auto"/>
+              <w:jc w:val="center"/>
+            </w:pPr>
+            <w:r>
+              <w:drawing>
+                <wp:inline xmlns:a="http://schemas.openxmlformats.org/drawingml/2006/main" xmlns:pic="http://schemas.openxmlformats.org/drawingml/2006/picture">
+                  <wp:extent cx="2194560" cy="2532185"/>
+                  <wp:docPr id="32" name="Picture 32"/>
+                  <wp:cNvGraphicFramePr>
+                    <a:graphicFrameLocks noChangeAspect="1"/>
+                  </wp:cNvGraphicFramePr>
+                  <a:graphic>
+                    <a:graphicData uri="http://schemas.openxmlformats.org/drawingml/2006/picture">
+                      <pic:pic>
+                        <pic:nvPicPr>
+                          <pic:cNvPr id="0" name="image.png"/>
+                          <pic:cNvPicPr/>
+                        </pic:nvPicPr>
+                        <pic:blipFill>
+                          <a:blip r:embed="rId10"/>
+                          <a:stretch>
+                            <a:fillRect/>
+                          </a:stretch>
+                        </pic:blipFill>
+                        <pic:spPr>
+                          <a:xfrm>
+                            <a:off x="0" y="0"/>
+                            <a:ext cx="2194560" cy="2532185"/>
+                          </a:xfrm>
+                          <a:prstGeom prst="rect"/>
+                        </pic:spPr>
+                      </pic:pic>
+                    </a:graphicData>
+                  </a:graphic>
+                </wp:inline>
+              </w:drawing>
+            </w:r>
+          </w:p>
+        </w:tc>
+        <w:tc>
+          <w:tcPr>
+            <w:tcW w:type="dxa" w:w="5256"/>
+          </w:tcPr>
+          <w:p>
+            <w:pPr>
+              <w:spacing w:before="0" w:after="0" w:line="240" w:lineRule="auto"/>
+              <w:jc w:val="center"/>
+            </w:pPr>
+            <w:r>
+              <w:drawing>
+                <wp:inline xmlns:a="http://schemas.openxmlformats.org/drawingml/2006/main" xmlns:pic="http://schemas.openxmlformats.org/drawingml/2006/picture">
+                  <wp:extent cx="2194560" cy="2532185"/>
+                  <wp:docPr id="33" name="Picture 33"/>
+                  <wp:cNvGraphicFramePr>
+                    <a:graphicFrameLocks noChangeAspect="1"/>
+                  </wp:cNvGraphicFramePr>
+                  <a:graphic>
+                    <a:graphicData uri="http://schemas.openxmlformats.org/drawingml/2006/picture">
+                      <pic:pic>
+                        <pic:nvPicPr>
+                          <pic:cNvPr id="0" name="image.png"/>
+                          <pic:cNvPicPr/>
+                        </pic:nvPicPr>
+                        <pic:blipFill>
+                          <a:blip r:embed="rId18"/>
+                          <a:stretch>
+                            <a:fillRect/>
+                          </a:stretch>
+                        </pic:blipFill>
+                        <pic:spPr>
+                          <a:xfrm>
+                            <a:off x="0" y="0"/>
+                            <a:ext cx="2194560" cy="2532185"/>
+                          </a:xfrm>
+                          <a:prstGeom prst="rect"/>
+                        </pic:spPr>
+                      </pic:pic>
+                    </a:graphicData>
+                  </a:graphic>
+                </wp:inline>
+              </w:drawing>
+            </w:r>
+          </w:p>
+        </w:tc>
+      </w:tr>
+      <w:tr>
+        <w:trPr>
+          <w:trHeight w:val="230" w:hRule="exact"/>
+        </w:trPr>
+        <w:tc>
+          <w:tcPr>
+            <w:tcW w:type="dxa" w:w="5256"/>
+          </w:tcPr>
+          <w:p>
+            <w:pPr>
+              <w:spacing w:before="0" w:after="0" w:line="240" w:lineRule="auto"/>
+            </w:pPr>
+          </w:p>
+        </w:tc>
+        <w:tc>
+          <w:tcPr>
+            <w:tcW w:type="dxa" w:w="5256"/>
+          </w:tcPr>
+          <w:p>
+            <w:pPr>
+              <w:spacing w:before="0" w:after="0" w:line="240" w:lineRule="auto"/>
+            </w:pPr>
+          </w:p>
+        </w:tc>
+      </w:tr>
+      <w:tr>
+        <w:trPr>
+          <w:trHeight w:val="230" w:hRule="exact"/>
+        </w:trPr>
+        <w:tc>
+          <w:tcPr>
+            <w:tcW w:type="dxa" w:w="5256"/>
+          </w:tcPr>
+          <w:p>
+            <w:pPr>
+              <w:spacing w:before="0" w:after="0" w:line="240" w:lineRule="auto"/>
+            </w:pPr>
+          </w:p>
+        </w:tc>
+        <w:tc>
+          <w:tcPr>
+            <w:tcW w:type="dxa" w:w="5256"/>
+          </w:tcPr>
+          <w:p>
+            <w:pPr>
+              <w:spacing w:before="0" w:after="0" w:line="240" w:lineRule="auto"/>
+            </w:pPr>
+          </w:p>
+        </w:tc>
+      </w:tr>
+      <w:tr>
+        <w:trPr>
+          <w:trHeight w:val="360" w:hRule="exact"/>
+        </w:trPr>
+        <w:tc>
+          <w:tcPr>
+            <w:tcW w:type="dxa" w:w="5256"/>
+          </w:tcPr>
+          <w:p/>
+        </w:tc>
+        <w:tc>
+          <w:tcPr>
+            <w:tcW w:type="dxa" w:w="5256"/>
+          </w:tcPr>
+          <w:p>
+            <w:pPr>
+              <w:spacing w:before="0" w:after="0" w:line="240" w:lineRule="auto"/>
+              <w:jc w:val="center"/>
+            </w:pPr>
+            <w:r>
+              <w:rPr>
+                <w:rFonts w:ascii="NYU Perstare" w:hAnsi="NYU Perstare"/>
+                <w:b/>
+              </w:rPr>
+              <w:t>Room 303</w:t>
+            </w:r>
+          </w:p>
+        </w:tc>
+      </w:tr>
+    </w:tbl>
+    <w:tbl>
+      <w:tblPr>
+        <w:tblW w:type="auto" w:w="0"/>
+        <w:tblLayout w:type="fixed"/>
+        <w:tblLook w:firstColumn="1" w:firstRow="1" w:lastColumn="0" w:lastRow="0" w:noHBand="0" w:noVBand="1" w:val="04A0"/>
+      </w:tblPr>
+      <w:tblGrid>
+        <w:gridCol w:w="5400"/>
+        <w:gridCol w:w="5400"/>
+      </w:tblGrid>
+      <w:tr>
+        <w:trPr>
+          <w:trHeight w:hRule="auto"/>
+        </w:trPr>
+        <w:tc>
+          <w:tcPr>
+            <w:tcW w:type="dxa" w:w="5256"/>
+          </w:tcPr>
+          <w:p/>
+        </w:tc>
+        <w:tc>
+          <w:tcPr>
+            <w:tcW w:type="dxa" w:w="5256"/>
+          </w:tcPr>
+          <w:p>
+            <w:pPr>
+              <w:spacing w:before="0" w:after="0" w:line="240" w:lineRule="auto"/>
+              <w:jc w:val="center"/>
+            </w:pPr>
+            <w:r>
+              <w:drawing>
+                <wp:inline xmlns:a="http://schemas.openxmlformats.org/drawingml/2006/main" xmlns:pic="http://schemas.openxmlformats.org/drawingml/2006/picture">
+                  <wp:extent cx="1828800" cy="1828800"/>
+                  <wp:docPr id="34" name="Picture 34"/>
+                  <wp:cNvGraphicFramePr>
+                    <a:graphicFrameLocks noChangeAspect="1"/>
+                  </wp:cNvGraphicFramePr>
+                  <a:graphic>
+                    <a:graphicData uri="http://schemas.openxmlformats.org/drawingml/2006/picture">
+                      <pic:pic>
+                        <pic:nvPicPr>
+                          <pic:cNvPr id="0" name="image.png"/>
+                          <pic:cNvPicPr/>
+                        </pic:nvPicPr>
+                        <pic:blipFill>
+                          <a:blip r:embed="rId9"/>
+                          <a:stretch>
+                            <a:fillRect/>
+                          </a:stretch>
+                        </pic:blipFill>
+                        <pic:spPr>
+                          <a:xfrm>
+                            <a:off x="0" y="0"/>
+                            <a:ext cx="1828800" cy="1828800"/>
+                          </a:xfrm>
+                          <a:prstGeom prst="rect"/>
+                        </pic:spPr>
+                      </pic:pic>
+                    </a:graphicData>
+                  </a:graphic>
+                </wp:inline>
+              </w:drawing>
+            </w:r>
+          </w:p>
+        </w:tc>
+      </w:tr>
+      <w:tr>
+        <w:trPr>
+          <w:trHeight w:hRule="auto"/>
+        </w:trPr>
+        <w:tc>
+          <w:tcPr>
+            <w:tcW w:type="dxa" w:w="5256"/>
+          </w:tcPr>
+          <w:p/>
+        </w:tc>
+        <w:tc>
+          <w:tcPr>
+            <w:tcW w:type="dxa" w:w="5256"/>
+          </w:tcPr>
+          <w:p>
+            <w:pPr>
+              <w:spacing w:before="0" w:after="0" w:line="240" w:lineRule="auto"/>
+              <w:jc w:val="center"/>
+            </w:pPr>
+            <w:r>
+              <w:rPr>
+                <w:rFonts w:ascii="NYU Perstare" w:hAnsi="NYU Perstare"/>
+                <w:b w:val="0"/>
+                <w:sz w:val="12"/>
+              </w:rPr>
+              <w:t>MUSIC AND PERFORMING ARTS PROFESSIONS</w:t>
+            </w:r>
+          </w:p>
+        </w:tc>
+      </w:tr>
+      <w:tr>
+        <w:trPr>
+          <w:trHeight w:val="360" w:hRule="exact"/>
+        </w:trPr>
+        <w:tc>
+          <w:tcPr>
+            <w:tcW w:type="dxa" w:w="5256"/>
+          </w:tcPr>
+          <w:p>
+            <w:pPr>
+              <w:spacing w:before="0" w:after="0" w:line="240" w:lineRule="auto"/>
+              <w:jc w:val="center"/>
+            </w:pPr>
+            <w:r>
+              <w:rPr>
+                <w:rFonts w:ascii="NYU Perstare" w:hAnsi="NYU Perstare"/>
+                <w:b w:val="0"/>
+              </w:rPr>
+              <w:t>Support</w:t>
+            </w:r>
+          </w:p>
+        </w:tc>
+        <w:tc>
+          <w:tcPr>
+            <w:tcW w:type="dxa" w:w="5256"/>
+          </w:tcPr>
+          <w:p>
+            <w:pPr>
+              <w:spacing w:before="0" w:after="0" w:line="240" w:lineRule="auto"/>
+              <w:jc w:val="center"/>
+            </w:pPr>
+            <w:r>
+              <w:rPr>
+                <w:rFonts w:ascii="NYU Perstare" w:hAnsi="NYU Perstare"/>
+                <w:b w:val="0"/>
+              </w:rPr>
+              <w:t>Room Instructions</w:t>
+            </w:r>
+          </w:p>
+        </w:tc>
+      </w:tr>
+      <w:tr>
+        <w:trPr>
+          <w:trHeight w:val="4176" w:hRule="exact"/>
+        </w:trPr>
+        <w:tc>
+          <w:tcPr>
+            <w:tcW w:type="dxa" w:w="5256"/>
+          </w:tcPr>
+          <w:p>
+            <w:pPr>
+              <w:spacing w:before="0" w:after="0" w:line="240" w:lineRule="auto"/>
+              <w:jc w:val="center"/>
+            </w:pPr>
+            <w:r>
+              <w:drawing>
+                <wp:inline xmlns:a="http://schemas.openxmlformats.org/drawingml/2006/main" xmlns:pic="http://schemas.openxmlformats.org/drawingml/2006/picture">
+                  <wp:extent cx="2194560" cy="2532185"/>
+                  <wp:docPr id="35" name="Picture 35"/>
+                  <wp:cNvGraphicFramePr>
+                    <a:graphicFrameLocks noChangeAspect="1"/>
+                  </wp:cNvGraphicFramePr>
+                  <a:graphic>
+                    <a:graphicData uri="http://schemas.openxmlformats.org/drawingml/2006/picture">
+                      <pic:pic>
+                        <pic:nvPicPr>
+                          <pic:cNvPr id="0" name="image.png"/>
+                          <pic:cNvPicPr/>
+                        </pic:nvPicPr>
+                        <pic:blipFill>
+                          <a:blip r:embed="rId10"/>
+                          <a:stretch>
+                            <a:fillRect/>
+                          </a:stretch>
+                        </pic:blipFill>
+                        <pic:spPr>
+                          <a:xfrm>
+                            <a:off x="0" y="0"/>
+                            <a:ext cx="2194560" cy="2532185"/>
+                          </a:xfrm>
+                          <a:prstGeom prst="rect"/>
+                        </pic:spPr>
+                      </pic:pic>
+                    </a:graphicData>
+                  </a:graphic>
+                </wp:inline>
+              </w:drawing>
+            </w:r>
+          </w:p>
+        </w:tc>
+        <w:tc>
+          <w:tcPr>
+            <w:tcW w:type="dxa" w:w="5256"/>
+          </w:tcPr>
+          <w:p>
+            <w:pPr>
+              <w:spacing w:before="0" w:after="0" w:line="240" w:lineRule="auto"/>
+              <w:jc w:val="center"/>
+            </w:pPr>
+            <w:r>
+              <w:drawing>
+                <wp:inline xmlns:a="http://schemas.openxmlformats.org/drawingml/2006/main" xmlns:pic="http://schemas.openxmlformats.org/drawingml/2006/picture">
+                  <wp:extent cx="2194560" cy="2532185"/>
+                  <wp:docPr id="36" name="Picture 36"/>
+                  <wp:cNvGraphicFramePr>
+                    <a:graphicFrameLocks noChangeAspect="1"/>
+                  </wp:cNvGraphicFramePr>
+                  <a:graphic>
+                    <a:graphicData uri="http://schemas.openxmlformats.org/drawingml/2006/picture">
+                      <pic:pic>
+                        <pic:nvPicPr>
+                          <pic:cNvPr id="0" name="image.png"/>
+                          <pic:cNvPicPr/>
+                        </pic:nvPicPr>
+                        <pic:blipFill>
                           <a:blip r:embed="rId19"/>
                           <a:stretch>
                             <a:fillRect/>
@@ -2824,7 +3765,3781 @@
                 <w:rFonts w:ascii="NYU Perstare" w:hAnsi="NYU Perstare"/>
                 <w:b/>
               </w:rPr>
-              <w:t>Drama Therapy</w:t>
+              <w:t>Room 304</w:t>
+            </w:r>
+          </w:p>
+        </w:tc>
+      </w:tr>
+    </w:tbl>
+    <w:p>
+      <w:r>
+        <w:br w:type="page"/>
+      </w:r>
+    </w:p>
+    <w:tbl>
+      <w:tblPr>
+        <w:tblW w:type="auto" w:w="0"/>
+        <w:tblLayout w:type="fixed"/>
+        <w:tblLook w:firstColumn="1" w:firstRow="1" w:lastColumn="0" w:lastRow="0" w:noHBand="0" w:noVBand="1" w:val="04A0"/>
+      </w:tblPr>
+      <w:tblGrid>
+        <w:gridCol w:w="5400"/>
+        <w:gridCol w:w="5400"/>
+      </w:tblGrid>
+      <w:tr>
+        <w:trPr>
+          <w:trHeight w:hRule="auto"/>
+        </w:trPr>
+        <w:tc>
+          <w:tcPr>
+            <w:tcW w:type="dxa" w:w="5256"/>
+          </w:tcPr>
+          <w:p/>
+        </w:tc>
+        <w:tc>
+          <w:tcPr>
+            <w:tcW w:type="dxa" w:w="5256"/>
+          </w:tcPr>
+          <w:p>
+            <w:pPr>
+              <w:spacing w:before="0" w:after="0" w:line="240" w:lineRule="auto"/>
+              <w:jc w:val="center"/>
+            </w:pPr>
+            <w:r>
+              <w:drawing>
+                <wp:inline xmlns:a="http://schemas.openxmlformats.org/drawingml/2006/main" xmlns:pic="http://schemas.openxmlformats.org/drawingml/2006/picture">
+                  <wp:extent cx="1828800" cy="1828800"/>
+                  <wp:docPr id="37" name="Picture 37"/>
+                  <wp:cNvGraphicFramePr>
+                    <a:graphicFrameLocks noChangeAspect="1"/>
+                  </wp:cNvGraphicFramePr>
+                  <a:graphic>
+                    <a:graphicData uri="http://schemas.openxmlformats.org/drawingml/2006/picture">
+                      <pic:pic>
+                        <pic:nvPicPr>
+                          <pic:cNvPr id="0" name="image.png"/>
+                          <pic:cNvPicPr/>
+                        </pic:nvPicPr>
+                        <pic:blipFill>
+                          <a:blip r:embed="rId9"/>
+                          <a:stretch>
+                            <a:fillRect/>
+                          </a:stretch>
+                        </pic:blipFill>
+                        <pic:spPr>
+                          <a:xfrm>
+                            <a:off x="0" y="0"/>
+                            <a:ext cx="1828800" cy="1828800"/>
+                          </a:xfrm>
+                          <a:prstGeom prst="rect"/>
+                        </pic:spPr>
+                      </pic:pic>
+                    </a:graphicData>
+                  </a:graphic>
+                </wp:inline>
+              </w:drawing>
+            </w:r>
+          </w:p>
+        </w:tc>
+      </w:tr>
+      <w:tr>
+        <w:trPr>
+          <w:trHeight w:hRule="auto"/>
+        </w:trPr>
+        <w:tc>
+          <w:tcPr>
+            <w:tcW w:type="dxa" w:w="5256"/>
+          </w:tcPr>
+          <w:p/>
+        </w:tc>
+        <w:tc>
+          <w:tcPr>
+            <w:tcW w:type="dxa" w:w="5256"/>
+          </w:tcPr>
+          <w:p>
+            <w:pPr>
+              <w:spacing w:before="0" w:after="0" w:line="240" w:lineRule="auto"/>
+              <w:jc w:val="center"/>
+            </w:pPr>
+            <w:r>
+              <w:rPr>
+                <w:rFonts w:ascii="NYU Perstare" w:hAnsi="NYU Perstare"/>
+                <w:b w:val="0"/>
+                <w:sz w:val="12"/>
+              </w:rPr>
+              <w:t>MUSIC AND PERFORMING ARTS PROFESSIONS</w:t>
+            </w:r>
+          </w:p>
+        </w:tc>
+      </w:tr>
+      <w:tr>
+        <w:trPr>
+          <w:trHeight w:val="360" w:hRule="exact"/>
+        </w:trPr>
+        <w:tc>
+          <w:tcPr>
+            <w:tcW w:type="dxa" w:w="5256"/>
+          </w:tcPr>
+          <w:p>
+            <w:pPr>
+              <w:spacing w:before="0" w:after="0" w:line="240" w:lineRule="auto"/>
+              <w:jc w:val="center"/>
+            </w:pPr>
+            <w:r>
+              <w:rPr>
+                <w:rFonts w:ascii="NYU Perstare" w:hAnsi="NYU Perstare"/>
+                <w:b w:val="0"/>
+              </w:rPr>
+              <w:t>Support</w:t>
+            </w:r>
+          </w:p>
+        </w:tc>
+        <w:tc>
+          <w:tcPr>
+            <w:tcW w:type="dxa" w:w="5256"/>
+          </w:tcPr>
+          <w:p>
+            <w:pPr>
+              <w:spacing w:before="0" w:after="0" w:line="240" w:lineRule="auto"/>
+              <w:jc w:val="center"/>
+            </w:pPr>
+            <w:r>
+              <w:rPr>
+                <w:rFonts w:ascii="NYU Perstare" w:hAnsi="NYU Perstare"/>
+                <w:b w:val="0"/>
+              </w:rPr>
+              <w:t>Room Instructions</w:t>
+            </w:r>
+          </w:p>
+        </w:tc>
+      </w:tr>
+      <w:tr>
+        <w:trPr>
+          <w:trHeight w:val="4176" w:hRule="exact"/>
+        </w:trPr>
+        <w:tc>
+          <w:tcPr>
+            <w:tcW w:type="dxa" w:w="5256"/>
+          </w:tcPr>
+          <w:p>
+            <w:pPr>
+              <w:spacing w:before="0" w:after="0" w:line="240" w:lineRule="auto"/>
+              <w:jc w:val="center"/>
+            </w:pPr>
+            <w:r>
+              <w:drawing>
+                <wp:inline xmlns:a="http://schemas.openxmlformats.org/drawingml/2006/main" xmlns:pic="http://schemas.openxmlformats.org/drawingml/2006/picture">
+                  <wp:extent cx="2194560" cy="2532185"/>
+                  <wp:docPr id="38" name="Picture 38"/>
+                  <wp:cNvGraphicFramePr>
+                    <a:graphicFrameLocks noChangeAspect="1"/>
+                  </wp:cNvGraphicFramePr>
+                  <a:graphic>
+                    <a:graphicData uri="http://schemas.openxmlformats.org/drawingml/2006/picture">
+                      <pic:pic>
+                        <pic:nvPicPr>
+                          <pic:cNvPr id="0" name="image.png"/>
+                          <pic:cNvPicPr/>
+                        </pic:nvPicPr>
+                        <pic:blipFill>
+                          <a:blip r:embed="rId10"/>
+                          <a:stretch>
+                            <a:fillRect/>
+                          </a:stretch>
+                        </pic:blipFill>
+                        <pic:spPr>
+                          <a:xfrm>
+                            <a:off x="0" y="0"/>
+                            <a:ext cx="2194560" cy="2532185"/>
+                          </a:xfrm>
+                          <a:prstGeom prst="rect"/>
+                        </pic:spPr>
+                      </pic:pic>
+                    </a:graphicData>
+                  </a:graphic>
+                </wp:inline>
+              </w:drawing>
+            </w:r>
+          </w:p>
+        </w:tc>
+        <w:tc>
+          <w:tcPr>
+            <w:tcW w:type="dxa" w:w="5256"/>
+          </w:tcPr>
+          <w:p>
+            <w:pPr>
+              <w:spacing w:before="0" w:after="0" w:line="240" w:lineRule="auto"/>
+              <w:jc w:val="center"/>
+            </w:pPr>
+            <w:r>
+              <w:drawing>
+                <wp:inline xmlns:a="http://schemas.openxmlformats.org/drawingml/2006/main" xmlns:pic="http://schemas.openxmlformats.org/drawingml/2006/picture">
+                  <wp:extent cx="2194560" cy="2532185"/>
+                  <wp:docPr id="39" name="Picture 39"/>
+                  <wp:cNvGraphicFramePr>
+                    <a:graphicFrameLocks noChangeAspect="1"/>
+                  </wp:cNvGraphicFramePr>
+                  <a:graphic>
+                    <a:graphicData uri="http://schemas.openxmlformats.org/drawingml/2006/picture">
+                      <pic:pic>
+                        <pic:nvPicPr>
+                          <pic:cNvPr id="0" name="image.png"/>
+                          <pic:cNvPicPr/>
+                        </pic:nvPicPr>
+                        <pic:blipFill>
+                          <a:blip r:embed="rId20"/>
+                          <a:stretch>
+                            <a:fillRect/>
+                          </a:stretch>
+                        </pic:blipFill>
+                        <pic:spPr>
+                          <a:xfrm>
+                            <a:off x="0" y="0"/>
+                            <a:ext cx="2194560" cy="2532185"/>
+                          </a:xfrm>
+                          <a:prstGeom prst="rect"/>
+                        </pic:spPr>
+                      </pic:pic>
+                    </a:graphicData>
+                  </a:graphic>
+                </wp:inline>
+              </w:drawing>
+            </w:r>
+          </w:p>
+        </w:tc>
+      </w:tr>
+      <w:tr>
+        <w:trPr>
+          <w:trHeight w:val="230" w:hRule="exact"/>
+        </w:trPr>
+        <w:tc>
+          <w:tcPr>
+            <w:tcW w:type="dxa" w:w="5256"/>
+          </w:tcPr>
+          <w:p>
+            <w:pPr>
+              <w:spacing w:before="0" w:after="0" w:line="240" w:lineRule="auto"/>
+            </w:pPr>
+          </w:p>
+        </w:tc>
+        <w:tc>
+          <w:tcPr>
+            <w:tcW w:type="dxa" w:w="5256"/>
+          </w:tcPr>
+          <w:p>
+            <w:pPr>
+              <w:spacing w:before="0" w:after="0" w:line="240" w:lineRule="auto"/>
+            </w:pPr>
+          </w:p>
+        </w:tc>
+      </w:tr>
+      <w:tr>
+        <w:trPr>
+          <w:trHeight w:val="230" w:hRule="exact"/>
+        </w:trPr>
+        <w:tc>
+          <w:tcPr>
+            <w:tcW w:type="dxa" w:w="5256"/>
+          </w:tcPr>
+          <w:p>
+            <w:pPr>
+              <w:spacing w:before="0" w:after="0" w:line="240" w:lineRule="auto"/>
+            </w:pPr>
+          </w:p>
+        </w:tc>
+        <w:tc>
+          <w:tcPr>
+            <w:tcW w:type="dxa" w:w="5256"/>
+          </w:tcPr>
+          <w:p>
+            <w:pPr>
+              <w:spacing w:before="0" w:after="0" w:line="240" w:lineRule="auto"/>
+            </w:pPr>
+          </w:p>
+        </w:tc>
+      </w:tr>
+      <w:tr>
+        <w:trPr>
+          <w:trHeight w:val="360" w:hRule="exact"/>
+        </w:trPr>
+        <w:tc>
+          <w:tcPr>
+            <w:tcW w:type="dxa" w:w="5256"/>
+          </w:tcPr>
+          <w:p/>
+        </w:tc>
+        <w:tc>
+          <w:tcPr>
+            <w:tcW w:type="dxa" w:w="5256"/>
+          </w:tcPr>
+          <w:p>
+            <w:pPr>
+              <w:spacing w:before="0" w:after="0" w:line="240" w:lineRule="auto"/>
+              <w:jc w:val="center"/>
+            </w:pPr>
+            <w:r>
+              <w:rPr>
+                <w:rFonts w:ascii="NYU Perstare" w:hAnsi="NYU Perstare"/>
+                <w:b/>
+              </w:rPr>
+              <w:t>Room 305</w:t>
+            </w:r>
+          </w:p>
+        </w:tc>
+      </w:tr>
+    </w:tbl>
+    <w:tbl>
+      <w:tblPr>
+        <w:tblW w:type="auto" w:w="0"/>
+        <w:tblLayout w:type="fixed"/>
+        <w:tblLook w:firstColumn="1" w:firstRow="1" w:lastColumn="0" w:lastRow="0" w:noHBand="0" w:noVBand="1" w:val="04A0"/>
+      </w:tblPr>
+      <w:tblGrid>
+        <w:gridCol w:w="5400"/>
+        <w:gridCol w:w="5400"/>
+      </w:tblGrid>
+      <w:tr>
+        <w:trPr>
+          <w:trHeight w:hRule="auto"/>
+        </w:trPr>
+        <w:tc>
+          <w:tcPr>
+            <w:tcW w:type="dxa" w:w="5256"/>
+          </w:tcPr>
+          <w:p/>
+        </w:tc>
+        <w:tc>
+          <w:tcPr>
+            <w:tcW w:type="dxa" w:w="5256"/>
+          </w:tcPr>
+          <w:p>
+            <w:pPr>
+              <w:spacing w:before="0" w:after="0" w:line="240" w:lineRule="auto"/>
+              <w:jc w:val="center"/>
+            </w:pPr>
+            <w:r>
+              <w:drawing>
+                <wp:inline xmlns:a="http://schemas.openxmlformats.org/drawingml/2006/main" xmlns:pic="http://schemas.openxmlformats.org/drawingml/2006/picture">
+                  <wp:extent cx="1828800" cy="1828800"/>
+                  <wp:docPr id="40" name="Picture 40"/>
+                  <wp:cNvGraphicFramePr>
+                    <a:graphicFrameLocks noChangeAspect="1"/>
+                  </wp:cNvGraphicFramePr>
+                  <a:graphic>
+                    <a:graphicData uri="http://schemas.openxmlformats.org/drawingml/2006/picture">
+                      <pic:pic>
+                        <pic:nvPicPr>
+                          <pic:cNvPr id="0" name="image.png"/>
+                          <pic:cNvPicPr/>
+                        </pic:nvPicPr>
+                        <pic:blipFill>
+                          <a:blip r:embed="rId9"/>
+                          <a:stretch>
+                            <a:fillRect/>
+                          </a:stretch>
+                        </pic:blipFill>
+                        <pic:spPr>
+                          <a:xfrm>
+                            <a:off x="0" y="0"/>
+                            <a:ext cx="1828800" cy="1828800"/>
+                          </a:xfrm>
+                          <a:prstGeom prst="rect"/>
+                        </pic:spPr>
+                      </pic:pic>
+                    </a:graphicData>
+                  </a:graphic>
+                </wp:inline>
+              </w:drawing>
+            </w:r>
+          </w:p>
+        </w:tc>
+      </w:tr>
+      <w:tr>
+        <w:trPr>
+          <w:trHeight w:hRule="auto"/>
+        </w:trPr>
+        <w:tc>
+          <w:tcPr>
+            <w:tcW w:type="dxa" w:w="5256"/>
+          </w:tcPr>
+          <w:p/>
+        </w:tc>
+        <w:tc>
+          <w:tcPr>
+            <w:tcW w:type="dxa" w:w="5256"/>
+          </w:tcPr>
+          <w:p>
+            <w:pPr>
+              <w:spacing w:before="0" w:after="0" w:line="240" w:lineRule="auto"/>
+              <w:jc w:val="center"/>
+            </w:pPr>
+            <w:r>
+              <w:rPr>
+                <w:rFonts w:ascii="NYU Perstare" w:hAnsi="NYU Perstare"/>
+                <w:b w:val="0"/>
+                <w:sz w:val="12"/>
+              </w:rPr>
+              <w:t>MUSIC AND PERFORMING ARTS PROFESSIONS</w:t>
+            </w:r>
+          </w:p>
+        </w:tc>
+      </w:tr>
+      <w:tr>
+        <w:trPr>
+          <w:trHeight w:val="360" w:hRule="exact"/>
+        </w:trPr>
+        <w:tc>
+          <w:tcPr>
+            <w:tcW w:type="dxa" w:w="5256"/>
+          </w:tcPr>
+          <w:p>
+            <w:pPr>
+              <w:spacing w:before="0" w:after="0" w:line="240" w:lineRule="auto"/>
+              <w:jc w:val="center"/>
+            </w:pPr>
+            <w:r>
+              <w:rPr>
+                <w:rFonts w:ascii="NYU Perstare" w:hAnsi="NYU Perstare"/>
+                <w:b w:val="0"/>
+              </w:rPr>
+              <w:t>Support</w:t>
+            </w:r>
+          </w:p>
+        </w:tc>
+        <w:tc>
+          <w:tcPr>
+            <w:tcW w:type="dxa" w:w="5256"/>
+          </w:tcPr>
+          <w:p>
+            <w:pPr>
+              <w:spacing w:before="0" w:after="0" w:line="240" w:lineRule="auto"/>
+              <w:jc w:val="center"/>
+            </w:pPr>
+            <w:r>
+              <w:rPr>
+                <w:rFonts w:ascii="NYU Perstare" w:hAnsi="NYU Perstare"/>
+                <w:b w:val="0"/>
+              </w:rPr>
+              <w:t>Room Instructions</w:t>
+            </w:r>
+          </w:p>
+        </w:tc>
+      </w:tr>
+      <w:tr>
+        <w:trPr>
+          <w:trHeight w:val="4176" w:hRule="exact"/>
+        </w:trPr>
+        <w:tc>
+          <w:tcPr>
+            <w:tcW w:type="dxa" w:w="5256"/>
+          </w:tcPr>
+          <w:p>
+            <w:pPr>
+              <w:spacing w:before="0" w:after="0" w:line="240" w:lineRule="auto"/>
+              <w:jc w:val="center"/>
+            </w:pPr>
+            <w:r>
+              <w:drawing>
+                <wp:inline xmlns:a="http://schemas.openxmlformats.org/drawingml/2006/main" xmlns:pic="http://schemas.openxmlformats.org/drawingml/2006/picture">
+                  <wp:extent cx="2194560" cy="2532185"/>
+                  <wp:docPr id="41" name="Picture 41"/>
+                  <wp:cNvGraphicFramePr>
+                    <a:graphicFrameLocks noChangeAspect="1"/>
+                  </wp:cNvGraphicFramePr>
+                  <a:graphic>
+                    <a:graphicData uri="http://schemas.openxmlformats.org/drawingml/2006/picture">
+                      <pic:pic>
+                        <pic:nvPicPr>
+                          <pic:cNvPr id="0" name="image.png"/>
+                          <pic:cNvPicPr/>
+                        </pic:nvPicPr>
+                        <pic:blipFill>
+                          <a:blip r:embed="rId10"/>
+                          <a:stretch>
+                            <a:fillRect/>
+                          </a:stretch>
+                        </pic:blipFill>
+                        <pic:spPr>
+                          <a:xfrm>
+                            <a:off x="0" y="0"/>
+                            <a:ext cx="2194560" cy="2532185"/>
+                          </a:xfrm>
+                          <a:prstGeom prst="rect"/>
+                        </pic:spPr>
+                      </pic:pic>
+                    </a:graphicData>
+                  </a:graphic>
+                </wp:inline>
+              </w:drawing>
+            </w:r>
+          </w:p>
+        </w:tc>
+        <w:tc>
+          <w:tcPr>
+            <w:tcW w:type="dxa" w:w="5256"/>
+          </w:tcPr>
+          <w:p>
+            <w:pPr>
+              <w:spacing w:before="0" w:after="0" w:line="240" w:lineRule="auto"/>
+              <w:jc w:val="center"/>
+            </w:pPr>
+            <w:r>
+              <w:drawing>
+                <wp:inline xmlns:a="http://schemas.openxmlformats.org/drawingml/2006/main" xmlns:pic="http://schemas.openxmlformats.org/drawingml/2006/picture">
+                  <wp:extent cx="2194560" cy="2532185"/>
+                  <wp:docPr id="42" name="Picture 42"/>
+                  <wp:cNvGraphicFramePr>
+                    <a:graphicFrameLocks noChangeAspect="1"/>
+                  </wp:cNvGraphicFramePr>
+                  <a:graphic>
+                    <a:graphicData uri="http://schemas.openxmlformats.org/drawingml/2006/picture">
+                      <pic:pic>
+                        <pic:nvPicPr>
+                          <pic:cNvPr id="0" name="image.png"/>
+                          <pic:cNvPicPr/>
+                        </pic:nvPicPr>
+                        <pic:blipFill>
+                          <a:blip r:embed="rId21"/>
+                          <a:stretch>
+                            <a:fillRect/>
+                          </a:stretch>
+                        </pic:blipFill>
+                        <pic:spPr>
+                          <a:xfrm>
+                            <a:off x="0" y="0"/>
+                            <a:ext cx="2194560" cy="2532185"/>
+                          </a:xfrm>
+                          <a:prstGeom prst="rect"/>
+                        </pic:spPr>
+                      </pic:pic>
+                    </a:graphicData>
+                  </a:graphic>
+                </wp:inline>
+              </w:drawing>
+            </w:r>
+          </w:p>
+        </w:tc>
+      </w:tr>
+      <w:tr>
+        <w:trPr>
+          <w:trHeight w:val="230" w:hRule="exact"/>
+        </w:trPr>
+        <w:tc>
+          <w:tcPr>
+            <w:tcW w:type="dxa" w:w="5256"/>
+          </w:tcPr>
+          <w:p>
+            <w:pPr>
+              <w:spacing w:before="0" w:after="0" w:line="240" w:lineRule="auto"/>
+            </w:pPr>
+          </w:p>
+        </w:tc>
+        <w:tc>
+          <w:tcPr>
+            <w:tcW w:type="dxa" w:w="5256"/>
+          </w:tcPr>
+          <w:p>
+            <w:pPr>
+              <w:spacing w:before="0" w:after="0" w:line="240" w:lineRule="auto"/>
+            </w:pPr>
+          </w:p>
+        </w:tc>
+      </w:tr>
+      <w:tr>
+        <w:trPr>
+          <w:trHeight w:val="230" w:hRule="exact"/>
+        </w:trPr>
+        <w:tc>
+          <w:tcPr>
+            <w:tcW w:type="dxa" w:w="5256"/>
+          </w:tcPr>
+          <w:p>
+            <w:pPr>
+              <w:spacing w:before="0" w:after="0" w:line="240" w:lineRule="auto"/>
+            </w:pPr>
+          </w:p>
+        </w:tc>
+        <w:tc>
+          <w:tcPr>
+            <w:tcW w:type="dxa" w:w="5256"/>
+          </w:tcPr>
+          <w:p>
+            <w:pPr>
+              <w:spacing w:before="0" w:after="0" w:line="240" w:lineRule="auto"/>
+            </w:pPr>
+          </w:p>
+        </w:tc>
+      </w:tr>
+      <w:tr>
+        <w:trPr>
+          <w:trHeight w:val="360" w:hRule="exact"/>
+        </w:trPr>
+        <w:tc>
+          <w:tcPr>
+            <w:tcW w:type="dxa" w:w="5256"/>
+          </w:tcPr>
+          <w:p/>
+        </w:tc>
+        <w:tc>
+          <w:tcPr>
+            <w:tcW w:type="dxa" w:w="5256"/>
+          </w:tcPr>
+          <w:p>
+            <w:pPr>
+              <w:spacing w:before="0" w:after="0" w:line="240" w:lineRule="auto"/>
+              <w:jc w:val="center"/>
+            </w:pPr>
+            <w:r>
+              <w:rPr>
+                <w:rFonts w:ascii="NYU Perstare" w:hAnsi="NYU Perstare"/>
+                <w:b/>
+              </w:rPr>
+              <w:t>Room 306</w:t>
+            </w:r>
+          </w:p>
+        </w:tc>
+      </w:tr>
+    </w:tbl>
+    <w:p>
+      <w:r>
+        <w:br w:type="page"/>
+      </w:r>
+    </w:p>
+    <w:tbl>
+      <w:tblPr>
+        <w:tblW w:type="auto" w:w="0"/>
+        <w:tblLayout w:type="fixed"/>
+        <w:tblLook w:firstColumn="1" w:firstRow="1" w:lastColumn="0" w:lastRow="0" w:noHBand="0" w:noVBand="1" w:val="04A0"/>
+      </w:tblPr>
+      <w:tblGrid>
+        <w:gridCol w:w="5400"/>
+        <w:gridCol w:w="5400"/>
+      </w:tblGrid>
+      <w:tr>
+        <w:trPr>
+          <w:trHeight w:hRule="auto"/>
+        </w:trPr>
+        <w:tc>
+          <w:tcPr>
+            <w:tcW w:type="dxa" w:w="5256"/>
+          </w:tcPr>
+          <w:p/>
+        </w:tc>
+        <w:tc>
+          <w:tcPr>
+            <w:tcW w:type="dxa" w:w="5256"/>
+          </w:tcPr>
+          <w:p>
+            <w:pPr>
+              <w:spacing w:before="0" w:after="0" w:line="240" w:lineRule="auto"/>
+              <w:jc w:val="center"/>
+            </w:pPr>
+            <w:r>
+              <w:drawing>
+                <wp:inline xmlns:a="http://schemas.openxmlformats.org/drawingml/2006/main" xmlns:pic="http://schemas.openxmlformats.org/drawingml/2006/picture">
+                  <wp:extent cx="1828800" cy="1828800"/>
+                  <wp:docPr id="43" name="Picture 43"/>
+                  <wp:cNvGraphicFramePr>
+                    <a:graphicFrameLocks noChangeAspect="1"/>
+                  </wp:cNvGraphicFramePr>
+                  <a:graphic>
+                    <a:graphicData uri="http://schemas.openxmlformats.org/drawingml/2006/picture">
+                      <pic:pic>
+                        <pic:nvPicPr>
+                          <pic:cNvPr id="0" name="image.png"/>
+                          <pic:cNvPicPr/>
+                        </pic:nvPicPr>
+                        <pic:blipFill>
+                          <a:blip r:embed="rId9"/>
+                          <a:stretch>
+                            <a:fillRect/>
+                          </a:stretch>
+                        </pic:blipFill>
+                        <pic:spPr>
+                          <a:xfrm>
+                            <a:off x="0" y="0"/>
+                            <a:ext cx="1828800" cy="1828800"/>
+                          </a:xfrm>
+                          <a:prstGeom prst="rect"/>
+                        </pic:spPr>
+                      </pic:pic>
+                    </a:graphicData>
+                  </a:graphic>
+                </wp:inline>
+              </w:drawing>
+            </w:r>
+          </w:p>
+        </w:tc>
+      </w:tr>
+      <w:tr>
+        <w:trPr>
+          <w:trHeight w:hRule="auto"/>
+        </w:trPr>
+        <w:tc>
+          <w:tcPr>
+            <w:tcW w:type="dxa" w:w="5256"/>
+          </w:tcPr>
+          <w:p/>
+        </w:tc>
+        <w:tc>
+          <w:tcPr>
+            <w:tcW w:type="dxa" w:w="5256"/>
+          </w:tcPr>
+          <w:p>
+            <w:pPr>
+              <w:spacing w:before="0" w:after="0" w:line="240" w:lineRule="auto"/>
+              <w:jc w:val="center"/>
+            </w:pPr>
+            <w:r>
+              <w:rPr>
+                <w:rFonts w:ascii="NYU Perstare" w:hAnsi="NYU Perstare"/>
+                <w:b w:val="0"/>
+                <w:sz w:val="12"/>
+              </w:rPr>
+              <w:t>MUSIC AND PERFORMING ARTS PROFESSIONS</w:t>
+            </w:r>
+          </w:p>
+        </w:tc>
+      </w:tr>
+      <w:tr>
+        <w:trPr>
+          <w:trHeight w:val="360" w:hRule="exact"/>
+        </w:trPr>
+        <w:tc>
+          <w:tcPr>
+            <w:tcW w:type="dxa" w:w="5256"/>
+          </w:tcPr>
+          <w:p>
+            <w:pPr>
+              <w:spacing w:before="0" w:after="0" w:line="240" w:lineRule="auto"/>
+              <w:jc w:val="center"/>
+            </w:pPr>
+            <w:r>
+              <w:rPr>
+                <w:rFonts w:ascii="NYU Perstare" w:hAnsi="NYU Perstare"/>
+                <w:b w:val="0"/>
+              </w:rPr>
+              <w:t>Support</w:t>
+            </w:r>
+          </w:p>
+        </w:tc>
+        <w:tc>
+          <w:tcPr>
+            <w:tcW w:type="dxa" w:w="5256"/>
+          </w:tcPr>
+          <w:p>
+            <w:pPr>
+              <w:spacing w:before="0" w:after="0" w:line="240" w:lineRule="auto"/>
+              <w:jc w:val="center"/>
+            </w:pPr>
+            <w:r>
+              <w:rPr>
+                <w:rFonts w:ascii="NYU Perstare" w:hAnsi="NYU Perstare"/>
+                <w:b w:val="0"/>
+              </w:rPr>
+              <w:t>Room Instructions</w:t>
+            </w:r>
+          </w:p>
+        </w:tc>
+      </w:tr>
+      <w:tr>
+        <w:trPr>
+          <w:trHeight w:val="4176" w:hRule="exact"/>
+        </w:trPr>
+        <w:tc>
+          <w:tcPr>
+            <w:tcW w:type="dxa" w:w="5256"/>
+          </w:tcPr>
+          <w:p>
+            <w:pPr>
+              <w:spacing w:before="0" w:after="0" w:line="240" w:lineRule="auto"/>
+              <w:jc w:val="center"/>
+            </w:pPr>
+            <w:r>
+              <w:drawing>
+                <wp:inline xmlns:a="http://schemas.openxmlformats.org/drawingml/2006/main" xmlns:pic="http://schemas.openxmlformats.org/drawingml/2006/picture">
+                  <wp:extent cx="2194560" cy="2532185"/>
+                  <wp:docPr id="44" name="Picture 44"/>
+                  <wp:cNvGraphicFramePr>
+                    <a:graphicFrameLocks noChangeAspect="1"/>
+                  </wp:cNvGraphicFramePr>
+                  <a:graphic>
+                    <a:graphicData uri="http://schemas.openxmlformats.org/drawingml/2006/picture">
+                      <pic:pic>
+                        <pic:nvPicPr>
+                          <pic:cNvPr id="0" name="image.png"/>
+                          <pic:cNvPicPr/>
+                        </pic:nvPicPr>
+                        <pic:blipFill>
+                          <a:blip r:embed="rId10"/>
+                          <a:stretch>
+                            <a:fillRect/>
+                          </a:stretch>
+                        </pic:blipFill>
+                        <pic:spPr>
+                          <a:xfrm>
+                            <a:off x="0" y="0"/>
+                            <a:ext cx="2194560" cy="2532185"/>
+                          </a:xfrm>
+                          <a:prstGeom prst="rect"/>
+                        </pic:spPr>
+                      </pic:pic>
+                    </a:graphicData>
+                  </a:graphic>
+                </wp:inline>
+              </w:drawing>
+            </w:r>
+          </w:p>
+        </w:tc>
+        <w:tc>
+          <w:tcPr>
+            <w:tcW w:type="dxa" w:w="5256"/>
+          </w:tcPr>
+          <w:p>
+            <w:pPr>
+              <w:spacing w:before="0" w:after="0" w:line="240" w:lineRule="auto"/>
+              <w:jc w:val="center"/>
+            </w:pPr>
+            <w:r>
+              <w:drawing>
+                <wp:inline xmlns:a="http://schemas.openxmlformats.org/drawingml/2006/main" xmlns:pic="http://schemas.openxmlformats.org/drawingml/2006/picture">
+                  <wp:extent cx="2194560" cy="2532185"/>
+                  <wp:docPr id="45" name="Picture 45"/>
+                  <wp:cNvGraphicFramePr>
+                    <a:graphicFrameLocks noChangeAspect="1"/>
+                  </wp:cNvGraphicFramePr>
+                  <a:graphic>
+                    <a:graphicData uri="http://schemas.openxmlformats.org/drawingml/2006/picture">
+                      <pic:pic>
+                        <pic:nvPicPr>
+                          <pic:cNvPr id="0" name="image.png"/>
+                          <pic:cNvPicPr/>
+                        </pic:nvPicPr>
+                        <pic:blipFill>
+                          <a:blip r:embed="rId22"/>
+                          <a:stretch>
+                            <a:fillRect/>
+                          </a:stretch>
+                        </pic:blipFill>
+                        <pic:spPr>
+                          <a:xfrm>
+                            <a:off x="0" y="0"/>
+                            <a:ext cx="2194560" cy="2532185"/>
+                          </a:xfrm>
+                          <a:prstGeom prst="rect"/>
+                        </pic:spPr>
+                      </pic:pic>
+                    </a:graphicData>
+                  </a:graphic>
+                </wp:inline>
+              </w:drawing>
+            </w:r>
+          </w:p>
+        </w:tc>
+      </w:tr>
+      <w:tr>
+        <w:trPr>
+          <w:trHeight w:val="230" w:hRule="exact"/>
+        </w:trPr>
+        <w:tc>
+          <w:tcPr>
+            <w:tcW w:type="dxa" w:w="5256"/>
+          </w:tcPr>
+          <w:p>
+            <w:pPr>
+              <w:spacing w:before="0" w:after="0" w:line="240" w:lineRule="auto"/>
+            </w:pPr>
+          </w:p>
+        </w:tc>
+        <w:tc>
+          <w:tcPr>
+            <w:tcW w:type="dxa" w:w="5256"/>
+          </w:tcPr>
+          <w:p>
+            <w:pPr>
+              <w:spacing w:before="0" w:after="0" w:line="240" w:lineRule="auto"/>
+            </w:pPr>
+          </w:p>
+        </w:tc>
+      </w:tr>
+      <w:tr>
+        <w:trPr>
+          <w:trHeight w:val="230" w:hRule="exact"/>
+        </w:trPr>
+        <w:tc>
+          <w:tcPr>
+            <w:tcW w:type="dxa" w:w="5256"/>
+          </w:tcPr>
+          <w:p>
+            <w:pPr>
+              <w:spacing w:before="0" w:after="0" w:line="240" w:lineRule="auto"/>
+            </w:pPr>
+          </w:p>
+        </w:tc>
+        <w:tc>
+          <w:tcPr>
+            <w:tcW w:type="dxa" w:w="5256"/>
+          </w:tcPr>
+          <w:p>
+            <w:pPr>
+              <w:spacing w:before="0" w:after="0" w:line="240" w:lineRule="auto"/>
+            </w:pPr>
+          </w:p>
+        </w:tc>
+      </w:tr>
+      <w:tr>
+        <w:trPr>
+          <w:trHeight w:val="360" w:hRule="exact"/>
+        </w:trPr>
+        <w:tc>
+          <w:tcPr>
+            <w:tcW w:type="dxa" w:w="5256"/>
+          </w:tcPr>
+          <w:p/>
+        </w:tc>
+        <w:tc>
+          <w:tcPr>
+            <w:tcW w:type="dxa" w:w="5256"/>
+          </w:tcPr>
+          <w:p>
+            <w:pPr>
+              <w:spacing w:before="0" w:after="0" w:line="240" w:lineRule="auto"/>
+              <w:jc w:val="center"/>
+            </w:pPr>
+            <w:r>
+              <w:rPr>
+                <w:rFonts w:ascii="NYU Perstare" w:hAnsi="NYU Perstare"/>
+                <w:b/>
+              </w:rPr>
+              <w:t>Room 307</w:t>
+            </w:r>
+          </w:p>
+        </w:tc>
+      </w:tr>
+    </w:tbl>
+    <w:tbl>
+      <w:tblPr>
+        <w:tblW w:type="auto" w:w="0"/>
+        <w:tblLayout w:type="fixed"/>
+        <w:tblLook w:firstColumn="1" w:firstRow="1" w:lastColumn="0" w:lastRow="0" w:noHBand="0" w:noVBand="1" w:val="04A0"/>
+      </w:tblPr>
+      <w:tblGrid>
+        <w:gridCol w:w="5400"/>
+        <w:gridCol w:w="5400"/>
+      </w:tblGrid>
+      <w:tr>
+        <w:trPr>
+          <w:trHeight w:hRule="auto"/>
+        </w:trPr>
+        <w:tc>
+          <w:tcPr>
+            <w:tcW w:type="dxa" w:w="5256"/>
+          </w:tcPr>
+          <w:p/>
+        </w:tc>
+        <w:tc>
+          <w:tcPr>
+            <w:tcW w:type="dxa" w:w="5256"/>
+          </w:tcPr>
+          <w:p>
+            <w:pPr>
+              <w:spacing w:before="0" w:after="0" w:line="240" w:lineRule="auto"/>
+              <w:jc w:val="center"/>
+            </w:pPr>
+            <w:r>
+              <w:drawing>
+                <wp:inline xmlns:a="http://schemas.openxmlformats.org/drawingml/2006/main" xmlns:pic="http://schemas.openxmlformats.org/drawingml/2006/picture">
+                  <wp:extent cx="1828800" cy="1828800"/>
+                  <wp:docPr id="46" name="Picture 46"/>
+                  <wp:cNvGraphicFramePr>
+                    <a:graphicFrameLocks noChangeAspect="1"/>
+                  </wp:cNvGraphicFramePr>
+                  <a:graphic>
+                    <a:graphicData uri="http://schemas.openxmlformats.org/drawingml/2006/picture">
+                      <pic:pic>
+                        <pic:nvPicPr>
+                          <pic:cNvPr id="0" name="image.png"/>
+                          <pic:cNvPicPr/>
+                        </pic:nvPicPr>
+                        <pic:blipFill>
+                          <a:blip r:embed="rId9"/>
+                          <a:stretch>
+                            <a:fillRect/>
+                          </a:stretch>
+                        </pic:blipFill>
+                        <pic:spPr>
+                          <a:xfrm>
+                            <a:off x="0" y="0"/>
+                            <a:ext cx="1828800" cy="1828800"/>
+                          </a:xfrm>
+                          <a:prstGeom prst="rect"/>
+                        </pic:spPr>
+                      </pic:pic>
+                    </a:graphicData>
+                  </a:graphic>
+                </wp:inline>
+              </w:drawing>
+            </w:r>
+          </w:p>
+        </w:tc>
+      </w:tr>
+      <w:tr>
+        <w:trPr>
+          <w:trHeight w:hRule="auto"/>
+        </w:trPr>
+        <w:tc>
+          <w:tcPr>
+            <w:tcW w:type="dxa" w:w="5256"/>
+          </w:tcPr>
+          <w:p/>
+        </w:tc>
+        <w:tc>
+          <w:tcPr>
+            <w:tcW w:type="dxa" w:w="5256"/>
+          </w:tcPr>
+          <w:p>
+            <w:pPr>
+              <w:spacing w:before="0" w:after="0" w:line="240" w:lineRule="auto"/>
+              <w:jc w:val="center"/>
+            </w:pPr>
+            <w:r>
+              <w:rPr>
+                <w:rFonts w:ascii="NYU Perstare" w:hAnsi="NYU Perstare"/>
+                <w:b w:val="0"/>
+                <w:sz w:val="12"/>
+              </w:rPr>
+              <w:t>MUSIC AND PERFORMING ARTS PROFESSIONS</w:t>
+            </w:r>
+          </w:p>
+        </w:tc>
+      </w:tr>
+      <w:tr>
+        <w:trPr>
+          <w:trHeight w:val="360" w:hRule="exact"/>
+        </w:trPr>
+        <w:tc>
+          <w:tcPr>
+            <w:tcW w:type="dxa" w:w="5256"/>
+          </w:tcPr>
+          <w:p>
+            <w:pPr>
+              <w:spacing w:before="0" w:after="0" w:line="240" w:lineRule="auto"/>
+              <w:jc w:val="center"/>
+            </w:pPr>
+            <w:r>
+              <w:rPr>
+                <w:rFonts w:ascii="NYU Perstare" w:hAnsi="NYU Perstare"/>
+                <w:b w:val="0"/>
+              </w:rPr>
+              <w:t>Support</w:t>
+            </w:r>
+          </w:p>
+        </w:tc>
+        <w:tc>
+          <w:tcPr>
+            <w:tcW w:type="dxa" w:w="5256"/>
+          </w:tcPr>
+          <w:p>
+            <w:pPr>
+              <w:spacing w:before="0" w:after="0" w:line="240" w:lineRule="auto"/>
+              <w:jc w:val="center"/>
+            </w:pPr>
+            <w:r>
+              <w:rPr>
+                <w:rFonts w:ascii="NYU Perstare" w:hAnsi="NYU Perstare"/>
+                <w:b w:val="0"/>
+              </w:rPr>
+              <w:t>Room Instructions</w:t>
+            </w:r>
+          </w:p>
+        </w:tc>
+      </w:tr>
+      <w:tr>
+        <w:trPr>
+          <w:trHeight w:val="4176" w:hRule="exact"/>
+        </w:trPr>
+        <w:tc>
+          <w:tcPr>
+            <w:tcW w:type="dxa" w:w="5256"/>
+          </w:tcPr>
+          <w:p>
+            <w:pPr>
+              <w:spacing w:before="0" w:after="0" w:line="240" w:lineRule="auto"/>
+              <w:jc w:val="center"/>
+            </w:pPr>
+            <w:r>
+              <w:drawing>
+                <wp:inline xmlns:a="http://schemas.openxmlformats.org/drawingml/2006/main" xmlns:pic="http://schemas.openxmlformats.org/drawingml/2006/picture">
+                  <wp:extent cx="2194560" cy="2532185"/>
+                  <wp:docPr id="47" name="Picture 47"/>
+                  <wp:cNvGraphicFramePr>
+                    <a:graphicFrameLocks noChangeAspect="1"/>
+                  </wp:cNvGraphicFramePr>
+                  <a:graphic>
+                    <a:graphicData uri="http://schemas.openxmlformats.org/drawingml/2006/picture">
+                      <pic:pic>
+                        <pic:nvPicPr>
+                          <pic:cNvPr id="0" name="image.png"/>
+                          <pic:cNvPicPr/>
+                        </pic:nvPicPr>
+                        <pic:blipFill>
+                          <a:blip r:embed="rId10"/>
+                          <a:stretch>
+                            <a:fillRect/>
+                          </a:stretch>
+                        </pic:blipFill>
+                        <pic:spPr>
+                          <a:xfrm>
+                            <a:off x="0" y="0"/>
+                            <a:ext cx="2194560" cy="2532185"/>
+                          </a:xfrm>
+                          <a:prstGeom prst="rect"/>
+                        </pic:spPr>
+                      </pic:pic>
+                    </a:graphicData>
+                  </a:graphic>
+                </wp:inline>
+              </w:drawing>
+            </w:r>
+          </w:p>
+        </w:tc>
+        <w:tc>
+          <w:tcPr>
+            <w:tcW w:type="dxa" w:w="5256"/>
+          </w:tcPr>
+          <w:p>
+            <w:pPr>
+              <w:spacing w:before="0" w:after="0" w:line="240" w:lineRule="auto"/>
+              <w:jc w:val="center"/>
+            </w:pPr>
+            <w:r>
+              <w:drawing>
+                <wp:inline xmlns:a="http://schemas.openxmlformats.org/drawingml/2006/main" xmlns:pic="http://schemas.openxmlformats.org/drawingml/2006/picture">
+                  <wp:extent cx="2194560" cy="2532185"/>
+                  <wp:docPr id="48" name="Picture 48"/>
+                  <wp:cNvGraphicFramePr>
+                    <a:graphicFrameLocks noChangeAspect="1"/>
+                  </wp:cNvGraphicFramePr>
+                  <a:graphic>
+                    <a:graphicData uri="http://schemas.openxmlformats.org/drawingml/2006/picture">
+                      <pic:pic>
+                        <pic:nvPicPr>
+                          <pic:cNvPr id="0" name="image.png"/>
+                          <pic:cNvPicPr/>
+                        </pic:nvPicPr>
+                        <pic:blipFill>
+                          <a:blip r:embed="rId23"/>
+                          <a:stretch>
+                            <a:fillRect/>
+                          </a:stretch>
+                        </pic:blipFill>
+                        <pic:spPr>
+                          <a:xfrm>
+                            <a:off x="0" y="0"/>
+                            <a:ext cx="2194560" cy="2532185"/>
+                          </a:xfrm>
+                          <a:prstGeom prst="rect"/>
+                        </pic:spPr>
+                      </pic:pic>
+                    </a:graphicData>
+                  </a:graphic>
+                </wp:inline>
+              </w:drawing>
+            </w:r>
+          </w:p>
+        </w:tc>
+      </w:tr>
+      <w:tr>
+        <w:trPr>
+          <w:trHeight w:val="230" w:hRule="exact"/>
+        </w:trPr>
+        <w:tc>
+          <w:tcPr>
+            <w:tcW w:type="dxa" w:w="5256"/>
+          </w:tcPr>
+          <w:p>
+            <w:pPr>
+              <w:spacing w:before="0" w:after="0" w:line="240" w:lineRule="auto"/>
+            </w:pPr>
+          </w:p>
+        </w:tc>
+        <w:tc>
+          <w:tcPr>
+            <w:tcW w:type="dxa" w:w="5256"/>
+          </w:tcPr>
+          <w:p>
+            <w:pPr>
+              <w:spacing w:before="0" w:after="0" w:line="240" w:lineRule="auto"/>
+            </w:pPr>
+          </w:p>
+        </w:tc>
+      </w:tr>
+      <w:tr>
+        <w:trPr>
+          <w:trHeight w:val="230" w:hRule="exact"/>
+        </w:trPr>
+        <w:tc>
+          <w:tcPr>
+            <w:tcW w:type="dxa" w:w="5256"/>
+          </w:tcPr>
+          <w:p>
+            <w:pPr>
+              <w:spacing w:before="0" w:after="0" w:line="240" w:lineRule="auto"/>
+            </w:pPr>
+          </w:p>
+        </w:tc>
+        <w:tc>
+          <w:tcPr>
+            <w:tcW w:type="dxa" w:w="5256"/>
+          </w:tcPr>
+          <w:p>
+            <w:pPr>
+              <w:spacing w:before="0" w:after="0" w:line="240" w:lineRule="auto"/>
+            </w:pPr>
+          </w:p>
+        </w:tc>
+      </w:tr>
+      <w:tr>
+        <w:trPr>
+          <w:trHeight w:val="360" w:hRule="exact"/>
+        </w:trPr>
+        <w:tc>
+          <w:tcPr>
+            <w:tcW w:type="dxa" w:w="5256"/>
+          </w:tcPr>
+          <w:p/>
+        </w:tc>
+        <w:tc>
+          <w:tcPr>
+            <w:tcW w:type="dxa" w:w="5256"/>
+          </w:tcPr>
+          <w:p>
+            <w:pPr>
+              <w:spacing w:before="0" w:after="0" w:line="240" w:lineRule="auto"/>
+              <w:jc w:val="center"/>
+            </w:pPr>
+            <w:r>
+              <w:rPr>
+                <w:rFonts w:ascii="NYU Perstare" w:hAnsi="NYU Perstare"/>
+                <w:b/>
+              </w:rPr>
+              <w:t>Room 770</w:t>
+            </w:r>
+          </w:p>
+        </w:tc>
+      </w:tr>
+    </w:tbl>
+    <w:p>
+      <w:r>
+        <w:br w:type="page"/>
+      </w:r>
+    </w:p>
+    <w:tbl>
+      <w:tblPr>
+        <w:tblW w:type="auto" w:w="0"/>
+        <w:tblLayout w:type="fixed"/>
+        <w:tblLook w:firstColumn="1" w:firstRow="1" w:lastColumn="0" w:lastRow="0" w:noHBand="0" w:noVBand="1" w:val="04A0"/>
+      </w:tblPr>
+      <w:tblGrid>
+        <w:gridCol w:w="5400"/>
+        <w:gridCol w:w="5400"/>
+      </w:tblGrid>
+      <w:tr>
+        <w:trPr>
+          <w:trHeight w:hRule="auto"/>
+        </w:trPr>
+        <w:tc>
+          <w:tcPr>
+            <w:tcW w:type="dxa" w:w="5256"/>
+          </w:tcPr>
+          <w:p/>
+        </w:tc>
+        <w:tc>
+          <w:tcPr>
+            <w:tcW w:type="dxa" w:w="5256"/>
+          </w:tcPr>
+          <w:p>
+            <w:pPr>
+              <w:spacing w:before="0" w:after="0" w:line="240" w:lineRule="auto"/>
+              <w:jc w:val="center"/>
+            </w:pPr>
+            <w:r>
+              <w:drawing>
+                <wp:inline xmlns:a="http://schemas.openxmlformats.org/drawingml/2006/main" xmlns:pic="http://schemas.openxmlformats.org/drawingml/2006/picture">
+                  <wp:extent cx="1828800" cy="1828800"/>
+                  <wp:docPr id="49" name="Picture 49"/>
+                  <wp:cNvGraphicFramePr>
+                    <a:graphicFrameLocks noChangeAspect="1"/>
+                  </wp:cNvGraphicFramePr>
+                  <a:graphic>
+                    <a:graphicData uri="http://schemas.openxmlformats.org/drawingml/2006/picture">
+                      <pic:pic>
+                        <pic:nvPicPr>
+                          <pic:cNvPr id="0" name="image.png"/>
+                          <pic:cNvPicPr/>
+                        </pic:nvPicPr>
+                        <pic:blipFill>
+                          <a:blip r:embed="rId9"/>
+                          <a:stretch>
+                            <a:fillRect/>
+                          </a:stretch>
+                        </pic:blipFill>
+                        <pic:spPr>
+                          <a:xfrm>
+                            <a:off x="0" y="0"/>
+                            <a:ext cx="1828800" cy="1828800"/>
+                          </a:xfrm>
+                          <a:prstGeom prst="rect"/>
+                        </pic:spPr>
+                      </pic:pic>
+                    </a:graphicData>
+                  </a:graphic>
+                </wp:inline>
+              </w:drawing>
+            </w:r>
+          </w:p>
+        </w:tc>
+      </w:tr>
+      <w:tr>
+        <w:trPr>
+          <w:trHeight w:hRule="auto"/>
+        </w:trPr>
+        <w:tc>
+          <w:tcPr>
+            <w:tcW w:type="dxa" w:w="5256"/>
+          </w:tcPr>
+          <w:p/>
+        </w:tc>
+        <w:tc>
+          <w:tcPr>
+            <w:tcW w:type="dxa" w:w="5256"/>
+          </w:tcPr>
+          <w:p>
+            <w:pPr>
+              <w:spacing w:before="0" w:after="0" w:line="240" w:lineRule="auto"/>
+              <w:jc w:val="center"/>
+            </w:pPr>
+            <w:r>
+              <w:rPr>
+                <w:rFonts w:ascii="NYU Perstare" w:hAnsi="NYU Perstare"/>
+                <w:b w:val="0"/>
+                <w:sz w:val="12"/>
+              </w:rPr>
+              <w:t>MUSIC AND PERFORMING ARTS PROFESSIONS</w:t>
+            </w:r>
+          </w:p>
+        </w:tc>
+      </w:tr>
+      <w:tr>
+        <w:trPr>
+          <w:trHeight w:val="360" w:hRule="exact"/>
+        </w:trPr>
+        <w:tc>
+          <w:tcPr>
+            <w:tcW w:type="dxa" w:w="5256"/>
+          </w:tcPr>
+          <w:p>
+            <w:pPr>
+              <w:spacing w:before="0" w:after="0" w:line="240" w:lineRule="auto"/>
+              <w:jc w:val="center"/>
+            </w:pPr>
+            <w:r>
+              <w:rPr>
+                <w:rFonts w:ascii="NYU Perstare" w:hAnsi="NYU Perstare"/>
+                <w:b w:val="0"/>
+              </w:rPr>
+              <w:t>Support</w:t>
+            </w:r>
+          </w:p>
+        </w:tc>
+        <w:tc>
+          <w:tcPr>
+            <w:tcW w:type="dxa" w:w="5256"/>
+          </w:tcPr>
+          <w:p>
+            <w:pPr>
+              <w:spacing w:before="0" w:after="0" w:line="240" w:lineRule="auto"/>
+              <w:jc w:val="center"/>
+            </w:pPr>
+            <w:r>
+              <w:rPr>
+                <w:rFonts w:ascii="NYU Perstare" w:hAnsi="NYU Perstare"/>
+                <w:b w:val="0"/>
+              </w:rPr>
+              <w:t>Room Instructions</w:t>
+            </w:r>
+          </w:p>
+        </w:tc>
+      </w:tr>
+      <w:tr>
+        <w:trPr>
+          <w:trHeight w:val="4176" w:hRule="exact"/>
+        </w:trPr>
+        <w:tc>
+          <w:tcPr>
+            <w:tcW w:type="dxa" w:w="5256"/>
+          </w:tcPr>
+          <w:p>
+            <w:pPr>
+              <w:spacing w:before="0" w:after="0" w:line="240" w:lineRule="auto"/>
+              <w:jc w:val="center"/>
+            </w:pPr>
+            <w:r>
+              <w:drawing>
+                <wp:inline xmlns:a="http://schemas.openxmlformats.org/drawingml/2006/main" xmlns:pic="http://schemas.openxmlformats.org/drawingml/2006/picture">
+                  <wp:extent cx="2194560" cy="2532185"/>
+                  <wp:docPr id="50" name="Picture 50"/>
+                  <wp:cNvGraphicFramePr>
+                    <a:graphicFrameLocks noChangeAspect="1"/>
+                  </wp:cNvGraphicFramePr>
+                  <a:graphic>
+                    <a:graphicData uri="http://schemas.openxmlformats.org/drawingml/2006/picture">
+                      <pic:pic>
+                        <pic:nvPicPr>
+                          <pic:cNvPr id="0" name="image.png"/>
+                          <pic:cNvPicPr/>
+                        </pic:nvPicPr>
+                        <pic:blipFill>
+                          <a:blip r:embed="rId10"/>
+                          <a:stretch>
+                            <a:fillRect/>
+                          </a:stretch>
+                        </pic:blipFill>
+                        <pic:spPr>
+                          <a:xfrm>
+                            <a:off x="0" y="0"/>
+                            <a:ext cx="2194560" cy="2532185"/>
+                          </a:xfrm>
+                          <a:prstGeom prst="rect"/>
+                        </pic:spPr>
+                      </pic:pic>
+                    </a:graphicData>
+                  </a:graphic>
+                </wp:inline>
+              </w:drawing>
+            </w:r>
+          </w:p>
+        </w:tc>
+        <w:tc>
+          <w:tcPr>
+            <w:tcW w:type="dxa" w:w="5256"/>
+          </w:tcPr>
+          <w:p>
+            <w:pPr>
+              <w:spacing w:before="0" w:after="0" w:line="240" w:lineRule="auto"/>
+              <w:jc w:val="center"/>
+            </w:pPr>
+            <w:r>
+              <w:drawing>
+                <wp:inline xmlns:a="http://schemas.openxmlformats.org/drawingml/2006/main" xmlns:pic="http://schemas.openxmlformats.org/drawingml/2006/picture">
+                  <wp:extent cx="2194560" cy="2532185"/>
+                  <wp:docPr id="51" name="Picture 51"/>
+                  <wp:cNvGraphicFramePr>
+                    <a:graphicFrameLocks noChangeAspect="1"/>
+                  </wp:cNvGraphicFramePr>
+                  <a:graphic>
+                    <a:graphicData uri="http://schemas.openxmlformats.org/drawingml/2006/picture">
+                      <pic:pic>
+                        <pic:nvPicPr>
+                          <pic:cNvPr id="0" name="image.png"/>
+                          <pic:cNvPicPr/>
+                        </pic:nvPicPr>
+                        <pic:blipFill>
+                          <a:blip r:embed="rId24"/>
+                          <a:stretch>
+                            <a:fillRect/>
+                          </a:stretch>
+                        </pic:blipFill>
+                        <pic:spPr>
+                          <a:xfrm>
+                            <a:off x="0" y="0"/>
+                            <a:ext cx="2194560" cy="2532185"/>
+                          </a:xfrm>
+                          <a:prstGeom prst="rect"/>
+                        </pic:spPr>
+                      </pic:pic>
+                    </a:graphicData>
+                  </a:graphic>
+                </wp:inline>
+              </w:drawing>
+            </w:r>
+          </w:p>
+        </w:tc>
+      </w:tr>
+      <w:tr>
+        <w:trPr>
+          <w:trHeight w:val="230" w:hRule="exact"/>
+        </w:trPr>
+        <w:tc>
+          <w:tcPr>
+            <w:tcW w:type="dxa" w:w="5256"/>
+          </w:tcPr>
+          <w:p>
+            <w:pPr>
+              <w:spacing w:before="0" w:after="0" w:line="240" w:lineRule="auto"/>
+            </w:pPr>
+          </w:p>
+        </w:tc>
+        <w:tc>
+          <w:tcPr>
+            <w:tcW w:type="dxa" w:w="5256"/>
+          </w:tcPr>
+          <w:p>
+            <w:pPr>
+              <w:spacing w:before="0" w:after="0" w:line="240" w:lineRule="auto"/>
+            </w:pPr>
+          </w:p>
+        </w:tc>
+      </w:tr>
+      <w:tr>
+        <w:trPr>
+          <w:trHeight w:val="230" w:hRule="exact"/>
+        </w:trPr>
+        <w:tc>
+          <w:tcPr>
+            <w:tcW w:type="dxa" w:w="5256"/>
+          </w:tcPr>
+          <w:p>
+            <w:pPr>
+              <w:spacing w:before="0" w:after="0" w:line="240" w:lineRule="auto"/>
+            </w:pPr>
+          </w:p>
+        </w:tc>
+        <w:tc>
+          <w:tcPr>
+            <w:tcW w:type="dxa" w:w="5256"/>
+          </w:tcPr>
+          <w:p>
+            <w:pPr>
+              <w:spacing w:before="0" w:after="0" w:line="240" w:lineRule="auto"/>
+            </w:pPr>
+          </w:p>
+        </w:tc>
+      </w:tr>
+      <w:tr>
+        <w:trPr>
+          <w:trHeight w:val="360" w:hRule="exact"/>
+        </w:trPr>
+        <w:tc>
+          <w:tcPr>
+            <w:tcW w:type="dxa" w:w="5256"/>
+          </w:tcPr>
+          <w:p/>
+        </w:tc>
+        <w:tc>
+          <w:tcPr>
+            <w:tcW w:type="dxa" w:w="5256"/>
+          </w:tcPr>
+          <w:p>
+            <w:pPr>
+              <w:spacing w:before="0" w:after="0" w:line="240" w:lineRule="auto"/>
+              <w:jc w:val="center"/>
+            </w:pPr>
+            <w:r>
+              <w:rPr>
+                <w:rFonts w:ascii="NYU Perstare" w:hAnsi="NYU Perstare"/>
+                <w:b/>
+              </w:rPr>
+              <w:t>Room 771</w:t>
+            </w:r>
+          </w:p>
+        </w:tc>
+      </w:tr>
+    </w:tbl>
+    <w:tbl>
+      <w:tblPr>
+        <w:tblW w:type="auto" w:w="0"/>
+        <w:tblLayout w:type="fixed"/>
+        <w:tblLook w:firstColumn="1" w:firstRow="1" w:lastColumn="0" w:lastRow="0" w:noHBand="0" w:noVBand="1" w:val="04A0"/>
+      </w:tblPr>
+      <w:tblGrid>
+        <w:gridCol w:w="5400"/>
+        <w:gridCol w:w="5400"/>
+      </w:tblGrid>
+      <w:tr>
+        <w:trPr>
+          <w:trHeight w:hRule="auto"/>
+        </w:trPr>
+        <w:tc>
+          <w:tcPr>
+            <w:tcW w:type="dxa" w:w="5256"/>
+          </w:tcPr>
+          <w:p/>
+        </w:tc>
+        <w:tc>
+          <w:tcPr>
+            <w:tcW w:type="dxa" w:w="5256"/>
+          </w:tcPr>
+          <w:p>
+            <w:pPr>
+              <w:spacing w:before="0" w:after="0" w:line="240" w:lineRule="auto"/>
+              <w:jc w:val="center"/>
+            </w:pPr>
+            <w:r>
+              <w:drawing>
+                <wp:inline xmlns:a="http://schemas.openxmlformats.org/drawingml/2006/main" xmlns:pic="http://schemas.openxmlformats.org/drawingml/2006/picture">
+                  <wp:extent cx="1828800" cy="1828800"/>
+                  <wp:docPr id="52" name="Picture 52"/>
+                  <wp:cNvGraphicFramePr>
+                    <a:graphicFrameLocks noChangeAspect="1"/>
+                  </wp:cNvGraphicFramePr>
+                  <a:graphic>
+                    <a:graphicData uri="http://schemas.openxmlformats.org/drawingml/2006/picture">
+                      <pic:pic>
+                        <pic:nvPicPr>
+                          <pic:cNvPr id="0" name="image.png"/>
+                          <pic:cNvPicPr/>
+                        </pic:nvPicPr>
+                        <pic:blipFill>
+                          <a:blip r:embed="rId9"/>
+                          <a:stretch>
+                            <a:fillRect/>
+                          </a:stretch>
+                        </pic:blipFill>
+                        <pic:spPr>
+                          <a:xfrm>
+                            <a:off x="0" y="0"/>
+                            <a:ext cx="1828800" cy="1828800"/>
+                          </a:xfrm>
+                          <a:prstGeom prst="rect"/>
+                        </pic:spPr>
+                      </pic:pic>
+                    </a:graphicData>
+                  </a:graphic>
+                </wp:inline>
+              </w:drawing>
+            </w:r>
+          </w:p>
+        </w:tc>
+      </w:tr>
+      <w:tr>
+        <w:trPr>
+          <w:trHeight w:hRule="auto"/>
+        </w:trPr>
+        <w:tc>
+          <w:tcPr>
+            <w:tcW w:type="dxa" w:w="5256"/>
+          </w:tcPr>
+          <w:p/>
+        </w:tc>
+        <w:tc>
+          <w:tcPr>
+            <w:tcW w:type="dxa" w:w="5256"/>
+          </w:tcPr>
+          <w:p>
+            <w:pPr>
+              <w:spacing w:before="0" w:after="0" w:line="240" w:lineRule="auto"/>
+              <w:jc w:val="center"/>
+            </w:pPr>
+            <w:r>
+              <w:rPr>
+                <w:rFonts w:ascii="NYU Perstare" w:hAnsi="NYU Perstare"/>
+                <w:b w:val="0"/>
+                <w:sz w:val="12"/>
+              </w:rPr>
+              <w:t>MUSIC AND PERFORMING ARTS PROFESSIONS</w:t>
+            </w:r>
+          </w:p>
+        </w:tc>
+      </w:tr>
+      <w:tr>
+        <w:trPr>
+          <w:trHeight w:val="360" w:hRule="exact"/>
+        </w:trPr>
+        <w:tc>
+          <w:tcPr>
+            <w:tcW w:type="dxa" w:w="5256"/>
+          </w:tcPr>
+          <w:p>
+            <w:pPr>
+              <w:spacing w:before="0" w:after="0" w:line="240" w:lineRule="auto"/>
+              <w:jc w:val="center"/>
+            </w:pPr>
+            <w:r>
+              <w:rPr>
+                <w:rFonts w:ascii="NYU Perstare" w:hAnsi="NYU Perstare"/>
+                <w:b w:val="0"/>
+              </w:rPr>
+              <w:t>Support</w:t>
+            </w:r>
+          </w:p>
+        </w:tc>
+        <w:tc>
+          <w:tcPr>
+            <w:tcW w:type="dxa" w:w="5256"/>
+          </w:tcPr>
+          <w:p>
+            <w:pPr>
+              <w:spacing w:before="0" w:after="0" w:line="240" w:lineRule="auto"/>
+              <w:jc w:val="center"/>
+            </w:pPr>
+            <w:r>
+              <w:rPr>
+                <w:rFonts w:ascii="NYU Perstare" w:hAnsi="NYU Perstare"/>
+                <w:b w:val="0"/>
+              </w:rPr>
+              <w:t>Room Instructions</w:t>
+            </w:r>
+          </w:p>
+        </w:tc>
+      </w:tr>
+      <w:tr>
+        <w:trPr>
+          <w:trHeight w:val="4176" w:hRule="exact"/>
+        </w:trPr>
+        <w:tc>
+          <w:tcPr>
+            <w:tcW w:type="dxa" w:w="5256"/>
+          </w:tcPr>
+          <w:p>
+            <w:pPr>
+              <w:spacing w:before="0" w:after="0" w:line="240" w:lineRule="auto"/>
+              <w:jc w:val="center"/>
+            </w:pPr>
+            <w:r>
+              <w:drawing>
+                <wp:inline xmlns:a="http://schemas.openxmlformats.org/drawingml/2006/main" xmlns:pic="http://schemas.openxmlformats.org/drawingml/2006/picture">
+                  <wp:extent cx="2194560" cy="2532185"/>
+                  <wp:docPr id="53" name="Picture 53"/>
+                  <wp:cNvGraphicFramePr>
+                    <a:graphicFrameLocks noChangeAspect="1"/>
+                  </wp:cNvGraphicFramePr>
+                  <a:graphic>
+                    <a:graphicData uri="http://schemas.openxmlformats.org/drawingml/2006/picture">
+                      <pic:pic>
+                        <pic:nvPicPr>
+                          <pic:cNvPr id="0" name="image.png"/>
+                          <pic:cNvPicPr/>
+                        </pic:nvPicPr>
+                        <pic:blipFill>
+                          <a:blip r:embed="rId10"/>
+                          <a:stretch>
+                            <a:fillRect/>
+                          </a:stretch>
+                        </pic:blipFill>
+                        <pic:spPr>
+                          <a:xfrm>
+                            <a:off x="0" y="0"/>
+                            <a:ext cx="2194560" cy="2532185"/>
+                          </a:xfrm>
+                          <a:prstGeom prst="rect"/>
+                        </pic:spPr>
+                      </pic:pic>
+                    </a:graphicData>
+                  </a:graphic>
+                </wp:inline>
+              </w:drawing>
+            </w:r>
+          </w:p>
+        </w:tc>
+        <w:tc>
+          <w:tcPr>
+            <w:tcW w:type="dxa" w:w="5256"/>
+          </w:tcPr>
+          <w:p>
+            <w:pPr>
+              <w:spacing w:before="0" w:after="0" w:line="240" w:lineRule="auto"/>
+              <w:jc w:val="center"/>
+            </w:pPr>
+            <w:r>
+              <w:drawing>
+                <wp:inline xmlns:a="http://schemas.openxmlformats.org/drawingml/2006/main" xmlns:pic="http://schemas.openxmlformats.org/drawingml/2006/picture">
+                  <wp:extent cx="2194560" cy="2532185"/>
+                  <wp:docPr id="54" name="Picture 54"/>
+                  <wp:cNvGraphicFramePr>
+                    <a:graphicFrameLocks noChangeAspect="1"/>
+                  </wp:cNvGraphicFramePr>
+                  <a:graphic>
+                    <a:graphicData uri="http://schemas.openxmlformats.org/drawingml/2006/picture">
+                      <pic:pic>
+                        <pic:nvPicPr>
+                          <pic:cNvPr id="0" name="image.png"/>
+                          <pic:cNvPicPr/>
+                        </pic:nvPicPr>
+                        <pic:blipFill>
+                          <a:blip r:embed="rId25"/>
+                          <a:stretch>
+                            <a:fillRect/>
+                          </a:stretch>
+                        </pic:blipFill>
+                        <pic:spPr>
+                          <a:xfrm>
+                            <a:off x="0" y="0"/>
+                            <a:ext cx="2194560" cy="2532185"/>
+                          </a:xfrm>
+                          <a:prstGeom prst="rect"/>
+                        </pic:spPr>
+                      </pic:pic>
+                    </a:graphicData>
+                  </a:graphic>
+                </wp:inline>
+              </w:drawing>
+            </w:r>
+          </w:p>
+        </w:tc>
+      </w:tr>
+      <w:tr>
+        <w:trPr>
+          <w:trHeight w:val="230" w:hRule="exact"/>
+        </w:trPr>
+        <w:tc>
+          <w:tcPr>
+            <w:tcW w:type="dxa" w:w="5256"/>
+          </w:tcPr>
+          <w:p>
+            <w:pPr>
+              <w:spacing w:before="0" w:after="0" w:line="240" w:lineRule="auto"/>
+            </w:pPr>
+          </w:p>
+        </w:tc>
+        <w:tc>
+          <w:tcPr>
+            <w:tcW w:type="dxa" w:w="5256"/>
+          </w:tcPr>
+          <w:p>
+            <w:pPr>
+              <w:spacing w:before="0" w:after="0" w:line="240" w:lineRule="auto"/>
+            </w:pPr>
+          </w:p>
+        </w:tc>
+      </w:tr>
+      <w:tr>
+        <w:trPr>
+          <w:trHeight w:val="230" w:hRule="exact"/>
+        </w:trPr>
+        <w:tc>
+          <w:tcPr>
+            <w:tcW w:type="dxa" w:w="5256"/>
+          </w:tcPr>
+          <w:p>
+            <w:pPr>
+              <w:spacing w:before="0" w:after="0" w:line="240" w:lineRule="auto"/>
+            </w:pPr>
+          </w:p>
+        </w:tc>
+        <w:tc>
+          <w:tcPr>
+            <w:tcW w:type="dxa" w:w="5256"/>
+          </w:tcPr>
+          <w:p>
+            <w:pPr>
+              <w:spacing w:before="0" w:after="0" w:line="240" w:lineRule="auto"/>
+            </w:pPr>
+          </w:p>
+        </w:tc>
+      </w:tr>
+      <w:tr>
+        <w:trPr>
+          <w:trHeight w:val="360" w:hRule="exact"/>
+        </w:trPr>
+        <w:tc>
+          <w:tcPr>
+            <w:tcW w:type="dxa" w:w="5256"/>
+          </w:tcPr>
+          <w:p/>
+        </w:tc>
+        <w:tc>
+          <w:tcPr>
+            <w:tcW w:type="dxa" w:w="5256"/>
+          </w:tcPr>
+          <w:p>
+            <w:pPr>
+              <w:spacing w:before="0" w:after="0" w:line="240" w:lineRule="auto"/>
+              <w:jc w:val="center"/>
+            </w:pPr>
+            <w:r>
+              <w:rPr>
+                <w:rFonts w:ascii="NYU Perstare" w:hAnsi="NYU Perstare"/>
+                <w:b/>
+              </w:rPr>
+              <w:t>Room 774</w:t>
+            </w:r>
+          </w:p>
+        </w:tc>
+      </w:tr>
+    </w:tbl>
+    <w:p>
+      <w:r>
+        <w:br w:type="page"/>
+      </w:r>
+    </w:p>
+    <w:tbl>
+      <w:tblPr>
+        <w:tblW w:type="auto" w:w="0"/>
+        <w:tblLayout w:type="fixed"/>
+        <w:tblLook w:firstColumn="1" w:firstRow="1" w:lastColumn="0" w:lastRow="0" w:noHBand="0" w:noVBand="1" w:val="04A0"/>
+      </w:tblPr>
+      <w:tblGrid>
+        <w:gridCol w:w="5400"/>
+        <w:gridCol w:w="5400"/>
+      </w:tblGrid>
+      <w:tr>
+        <w:trPr>
+          <w:trHeight w:hRule="auto"/>
+        </w:trPr>
+        <w:tc>
+          <w:tcPr>
+            <w:tcW w:type="dxa" w:w="5256"/>
+          </w:tcPr>
+          <w:p/>
+        </w:tc>
+        <w:tc>
+          <w:tcPr>
+            <w:tcW w:type="dxa" w:w="5256"/>
+          </w:tcPr>
+          <w:p>
+            <w:pPr>
+              <w:spacing w:before="0" w:after="0" w:line="240" w:lineRule="auto"/>
+              <w:jc w:val="center"/>
+            </w:pPr>
+            <w:r>
+              <w:drawing>
+                <wp:inline xmlns:a="http://schemas.openxmlformats.org/drawingml/2006/main" xmlns:pic="http://schemas.openxmlformats.org/drawingml/2006/picture">
+                  <wp:extent cx="1828800" cy="1828800"/>
+                  <wp:docPr id="55" name="Picture 55"/>
+                  <wp:cNvGraphicFramePr>
+                    <a:graphicFrameLocks noChangeAspect="1"/>
+                  </wp:cNvGraphicFramePr>
+                  <a:graphic>
+                    <a:graphicData uri="http://schemas.openxmlformats.org/drawingml/2006/picture">
+                      <pic:pic>
+                        <pic:nvPicPr>
+                          <pic:cNvPr id="0" name="image.png"/>
+                          <pic:cNvPicPr/>
+                        </pic:nvPicPr>
+                        <pic:blipFill>
+                          <a:blip r:embed="rId9"/>
+                          <a:stretch>
+                            <a:fillRect/>
+                          </a:stretch>
+                        </pic:blipFill>
+                        <pic:spPr>
+                          <a:xfrm>
+                            <a:off x="0" y="0"/>
+                            <a:ext cx="1828800" cy="1828800"/>
+                          </a:xfrm>
+                          <a:prstGeom prst="rect"/>
+                        </pic:spPr>
+                      </pic:pic>
+                    </a:graphicData>
+                  </a:graphic>
+                </wp:inline>
+              </w:drawing>
+            </w:r>
+          </w:p>
+        </w:tc>
+      </w:tr>
+      <w:tr>
+        <w:trPr>
+          <w:trHeight w:hRule="auto"/>
+        </w:trPr>
+        <w:tc>
+          <w:tcPr>
+            <w:tcW w:type="dxa" w:w="5256"/>
+          </w:tcPr>
+          <w:p/>
+        </w:tc>
+        <w:tc>
+          <w:tcPr>
+            <w:tcW w:type="dxa" w:w="5256"/>
+          </w:tcPr>
+          <w:p>
+            <w:pPr>
+              <w:spacing w:before="0" w:after="0" w:line="240" w:lineRule="auto"/>
+              <w:jc w:val="center"/>
+            </w:pPr>
+            <w:r>
+              <w:rPr>
+                <w:rFonts w:ascii="NYU Perstare" w:hAnsi="NYU Perstare"/>
+                <w:b w:val="0"/>
+                <w:sz w:val="12"/>
+              </w:rPr>
+              <w:t>MUSIC AND PERFORMING ARTS PROFESSIONS</w:t>
+            </w:r>
+          </w:p>
+        </w:tc>
+      </w:tr>
+      <w:tr>
+        <w:trPr>
+          <w:trHeight w:val="360" w:hRule="exact"/>
+        </w:trPr>
+        <w:tc>
+          <w:tcPr>
+            <w:tcW w:type="dxa" w:w="5256"/>
+          </w:tcPr>
+          <w:p>
+            <w:pPr>
+              <w:spacing w:before="0" w:after="0" w:line="240" w:lineRule="auto"/>
+              <w:jc w:val="center"/>
+            </w:pPr>
+            <w:r>
+              <w:rPr>
+                <w:rFonts w:ascii="NYU Perstare" w:hAnsi="NYU Perstare"/>
+                <w:b w:val="0"/>
+              </w:rPr>
+              <w:t>Support</w:t>
+            </w:r>
+          </w:p>
+        </w:tc>
+        <w:tc>
+          <w:tcPr>
+            <w:tcW w:type="dxa" w:w="5256"/>
+          </w:tcPr>
+          <w:p>
+            <w:pPr>
+              <w:spacing w:before="0" w:after="0" w:line="240" w:lineRule="auto"/>
+              <w:jc w:val="center"/>
+            </w:pPr>
+            <w:r>
+              <w:rPr>
+                <w:rFonts w:ascii="NYU Perstare" w:hAnsi="NYU Perstare"/>
+                <w:b w:val="0"/>
+              </w:rPr>
+              <w:t>Room Instructions</w:t>
+            </w:r>
+          </w:p>
+        </w:tc>
+      </w:tr>
+      <w:tr>
+        <w:trPr>
+          <w:trHeight w:val="4176" w:hRule="exact"/>
+        </w:trPr>
+        <w:tc>
+          <w:tcPr>
+            <w:tcW w:type="dxa" w:w="5256"/>
+          </w:tcPr>
+          <w:p>
+            <w:pPr>
+              <w:spacing w:before="0" w:after="0" w:line="240" w:lineRule="auto"/>
+              <w:jc w:val="center"/>
+            </w:pPr>
+            <w:r>
+              <w:drawing>
+                <wp:inline xmlns:a="http://schemas.openxmlformats.org/drawingml/2006/main" xmlns:pic="http://schemas.openxmlformats.org/drawingml/2006/picture">
+                  <wp:extent cx="2194560" cy="2532185"/>
+                  <wp:docPr id="56" name="Picture 56"/>
+                  <wp:cNvGraphicFramePr>
+                    <a:graphicFrameLocks noChangeAspect="1"/>
+                  </wp:cNvGraphicFramePr>
+                  <a:graphic>
+                    <a:graphicData uri="http://schemas.openxmlformats.org/drawingml/2006/picture">
+                      <pic:pic>
+                        <pic:nvPicPr>
+                          <pic:cNvPr id="0" name="image.png"/>
+                          <pic:cNvPicPr/>
+                        </pic:nvPicPr>
+                        <pic:blipFill>
+                          <a:blip r:embed="rId10"/>
+                          <a:stretch>
+                            <a:fillRect/>
+                          </a:stretch>
+                        </pic:blipFill>
+                        <pic:spPr>
+                          <a:xfrm>
+                            <a:off x="0" y="0"/>
+                            <a:ext cx="2194560" cy="2532185"/>
+                          </a:xfrm>
+                          <a:prstGeom prst="rect"/>
+                        </pic:spPr>
+                      </pic:pic>
+                    </a:graphicData>
+                  </a:graphic>
+                </wp:inline>
+              </w:drawing>
+            </w:r>
+          </w:p>
+        </w:tc>
+        <w:tc>
+          <w:tcPr>
+            <w:tcW w:type="dxa" w:w="5256"/>
+          </w:tcPr>
+          <w:p>
+            <w:pPr>
+              <w:spacing w:before="0" w:after="0" w:line="240" w:lineRule="auto"/>
+              <w:jc w:val="center"/>
+            </w:pPr>
+            <w:r>
+              <w:drawing>
+                <wp:inline xmlns:a="http://schemas.openxmlformats.org/drawingml/2006/main" xmlns:pic="http://schemas.openxmlformats.org/drawingml/2006/picture">
+                  <wp:extent cx="2194560" cy="2532185"/>
+                  <wp:docPr id="57" name="Picture 57"/>
+                  <wp:cNvGraphicFramePr>
+                    <a:graphicFrameLocks noChangeAspect="1"/>
+                  </wp:cNvGraphicFramePr>
+                  <a:graphic>
+                    <a:graphicData uri="http://schemas.openxmlformats.org/drawingml/2006/picture">
+                      <pic:pic>
+                        <pic:nvPicPr>
+                          <pic:cNvPr id="0" name="image.png"/>
+                          <pic:cNvPicPr/>
+                        </pic:nvPicPr>
+                        <pic:blipFill>
+                          <a:blip r:embed="rId26"/>
+                          <a:stretch>
+                            <a:fillRect/>
+                          </a:stretch>
+                        </pic:blipFill>
+                        <pic:spPr>
+                          <a:xfrm>
+                            <a:off x="0" y="0"/>
+                            <a:ext cx="2194560" cy="2532185"/>
+                          </a:xfrm>
+                          <a:prstGeom prst="rect"/>
+                        </pic:spPr>
+                      </pic:pic>
+                    </a:graphicData>
+                  </a:graphic>
+                </wp:inline>
+              </w:drawing>
+            </w:r>
+          </w:p>
+        </w:tc>
+      </w:tr>
+      <w:tr>
+        <w:trPr>
+          <w:trHeight w:val="230" w:hRule="exact"/>
+        </w:trPr>
+        <w:tc>
+          <w:tcPr>
+            <w:tcW w:type="dxa" w:w="5256"/>
+          </w:tcPr>
+          <w:p>
+            <w:pPr>
+              <w:spacing w:before="0" w:after="0" w:line="240" w:lineRule="auto"/>
+            </w:pPr>
+          </w:p>
+        </w:tc>
+        <w:tc>
+          <w:tcPr>
+            <w:tcW w:type="dxa" w:w="5256"/>
+          </w:tcPr>
+          <w:p>
+            <w:pPr>
+              <w:spacing w:before="0" w:after="0" w:line="240" w:lineRule="auto"/>
+            </w:pPr>
+          </w:p>
+        </w:tc>
+      </w:tr>
+      <w:tr>
+        <w:trPr>
+          <w:trHeight w:val="230" w:hRule="exact"/>
+        </w:trPr>
+        <w:tc>
+          <w:tcPr>
+            <w:tcW w:type="dxa" w:w="5256"/>
+          </w:tcPr>
+          <w:p>
+            <w:pPr>
+              <w:spacing w:before="0" w:after="0" w:line="240" w:lineRule="auto"/>
+            </w:pPr>
+          </w:p>
+        </w:tc>
+        <w:tc>
+          <w:tcPr>
+            <w:tcW w:type="dxa" w:w="5256"/>
+          </w:tcPr>
+          <w:p>
+            <w:pPr>
+              <w:spacing w:before="0" w:after="0" w:line="240" w:lineRule="auto"/>
+            </w:pPr>
+          </w:p>
+        </w:tc>
+      </w:tr>
+      <w:tr>
+        <w:trPr>
+          <w:trHeight w:val="360" w:hRule="exact"/>
+        </w:trPr>
+        <w:tc>
+          <w:tcPr>
+            <w:tcW w:type="dxa" w:w="5256"/>
+          </w:tcPr>
+          <w:p/>
+        </w:tc>
+        <w:tc>
+          <w:tcPr>
+            <w:tcW w:type="dxa" w:w="5256"/>
+          </w:tcPr>
+          <w:p>
+            <w:pPr>
+              <w:spacing w:before="0" w:after="0" w:line="240" w:lineRule="auto"/>
+              <w:jc w:val="center"/>
+            </w:pPr>
+            <w:r>
+              <w:rPr>
+                <w:rFonts w:ascii="NYU Perstare" w:hAnsi="NYU Perstare"/>
+                <w:b/>
+              </w:rPr>
+              <w:t>Room 777</w:t>
+            </w:r>
+          </w:p>
+        </w:tc>
+      </w:tr>
+    </w:tbl>
+    <w:tbl>
+      <w:tblPr>
+        <w:tblW w:type="auto" w:w="0"/>
+        <w:tblLayout w:type="fixed"/>
+        <w:tblLook w:firstColumn="1" w:firstRow="1" w:lastColumn="0" w:lastRow="0" w:noHBand="0" w:noVBand="1" w:val="04A0"/>
+      </w:tblPr>
+      <w:tblGrid>
+        <w:gridCol w:w="5400"/>
+        <w:gridCol w:w="5400"/>
+      </w:tblGrid>
+      <w:tr>
+        <w:trPr>
+          <w:trHeight w:hRule="auto"/>
+        </w:trPr>
+        <w:tc>
+          <w:tcPr>
+            <w:tcW w:type="dxa" w:w="5256"/>
+          </w:tcPr>
+          <w:p/>
+        </w:tc>
+        <w:tc>
+          <w:tcPr>
+            <w:tcW w:type="dxa" w:w="5256"/>
+          </w:tcPr>
+          <w:p>
+            <w:pPr>
+              <w:spacing w:before="0" w:after="0" w:line="240" w:lineRule="auto"/>
+              <w:jc w:val="center"/>
+            </w:pPr>
+            <w:r>
+              <w:drawing>
+                <wp:inline xmlns:a="http://schemas.openxmlformats.org/drawingml/2006/main" xmlns:pic="http://schemas.openxmlformats.org/drawingml/2006/picture">
+                  <wp:extent cx="1828800" cy="1828800"/>
+                  <wp:docPr id="58" name="Picture 58"/>
+                  <wp:cNvGraphicFramePr>
+                    <a:graphicFrameLocks noChangeAspect="1"/>
+                  </wp:cNvGraphicFramePr>
+                  <a:graphic>
+                    <a:graphicData uri="http://schemas.openxmlformats.org/drawingml/2006/picture">
+                      <pic:pic>
+                        <pic:nvPicPr>
+                          <pic:cNvPr id="0" name="image.png"/>
+                          <pic:cNvPicPr/>
+                        </pic:nvPicPr>
+                        <pic:blipFill>
+                          <a:blip r:embed="rId9"/>
+                          <a:stretch>
+                            <a:fillRect/>
+                          </a:stretch>
+                        </pic:blipFill>
+                        <pic:spPr>
+                          <a:xfrm>
+                            <a:off x="0" y="0"/>
+                            <a:ext cx="1828800" cy="1828800"/>
+                          </a:xfrm>
+                          <a:prstGeom prst="rect"/>
+                        </pic:spPr>
+                      </pic:pic>
+                    </a:graphicData>
+                  </a:graphic>
+                </wp:inline>
+              </w:drawing>
+            </w:r>
+          </w:p>
+        </w:tc>
+      </w:tr>
+      <w:tr>
+        <w:trPr>
+          <w:trHeight w:hRule="auto"/>
+        </w:trPr>
+        <w:tc>
+          <w:tcPr>
+            <w:tcW w:type="dxa" w:w="5256"/>
+          </w:tcPr>
+          <w:p/>
+        </w:tc>
+        <w:tc>
+          <w:tcPr>
+            <w:tcW w:type="dxa" w:w="5256"/>
+          </w:tcPr>
+          <w:p>
+            <w:pPr>
+              <w:spacing w:before="0" w:after="0" w:line="240" w:lineRule="auto"/>
+              <w:jc w:val="center"/>
+            </w:pPr>
+            <w:r>
+              <w:rPr>
+                <w:rFonts w:ascii="NYU Perstare" w:hAnsi="NYU Perstare"/>
+                <w:b w:val="0"/>
+                <w:sz w:val="12"/>
+              </w:rPr>
+              <w:t>MUSIC AND PERFORMING ARTS PROFESSIONS</w:t>
+            </w:r>
+          </w:p>
+        </w:tc>
+      </w:tr>
+      <w:tr>
+        <w:trPr>
+          <w:trHeight w:val="360" w:hRule="exact"/>
+        </w:trPr>
+        <w:tc>
+          <w:tcPr>
+            <w:tcW w:type="dxa" w:w="5256"/>
+          </w:tcPr>
+          <w:p>
+            <w:pPr>
+              <w:spacing w:before="0" w:after="0" w:line="240" w:lineRule="auto"/>
+              <w:jc w:val="center"/>
+            </w:pPr>
+            <w:r>
+              <w:rPr>
+                <w:rFonts w:ascii="NYU Perstare" w:hAnsi="NYU Perstare"/>
+                <w:b w:val="0"/>
+              </w:rPr>
+              <w:t>Support</w:t>
+            </w:r>
+          </w:p>
+        </w:tc>
+        <w:tc>
+          <w:tcPr>
+            <w:tcW w:type="dxa" w:w="5256"/>
+          </w:tcPr>
+          <w:p>
+            <w:pPr>
+              <w:spacing w:before="0" w:after="0" w:line="240" w:lineRule="auto"/>
+              <w:jc w:val="center"/>
+            </w:pPr>
+            <w:r>
+              <w:rPr>
+                <w:rFonts w:ascii="NYU Perstare" w:hAnsi="NYU Perstare"/>
+                <w:b w:val="0"/>
+              </w:rPr>
+              <w:t>Room Instructions</w:t>
+            </w:r>
+          </w:p>
+        </w:tc>
+      </w:tr>
+      <w:tr>
+        <w:trPr>
+          <w:trHeight w:val="4176" w:hRule="exact"/>
+        </w:trPr>
+        <w:tc>
+          <w:tcPr>
+            <w:tcW w:type="dxa" w:w="5256"/>
+          </w:tcPr>
+          <w:p>
+            <w:pPr>
+              <w:spacing w:before="0" w:after="0" w:line="240" w:lineRule="auto"/>
+              <w:jc w:val="center"/>
+            </w:pPr>
+            <w:r>
+              <w:drawing>
+                <wp:inline xmlns:a="http://schemas.openxmlformats.org/drawingml/2006/main" xmlns:pic="http://schemas.openxmlformats.org/drawingml/2006/picture">
+                  <wp:extent cx="2194560" cy="2532185"/>
+                  <wp:docPr id="59" name="Picture 59"/>
+                  <wp:cNvGraphicFramePr>
+                    <a:graphicFrameLocks noChangeAspect="1"/>
+                  </wp:cNvGraphicFramePr>
+                  <a:graphic>
+                    <a:graphicData uri="http://schemas.openxmlformats.org/drawingml/2006/picture">
+                      <pic:pic>
+                        <pic:nvPicPr>
+                          <pic:cNvPr id="0" name="image.png"/>
+                          <pic:cNvPicPr/>
+                        </pic:nvPicPr>
+                        <pic:blipFill>
+                          <a:blip r:embed="rId10"/>
+                          <a:stretch>
+                            <a:fillRect/>
+                          </a:stretch>
+                        </pic:blipFill>
+                        <pic:spPr>
+                          <a:xfrm>
+                            <a:off x="0" y="0"/>
+                            <a:ext cx="2194560" cy="2532185"/>
+                          </a:xfrm>
+                          <a:prstGeom prst="rect"/>
+                        </pic:spPr>
+                      </pic:pic>
+                    </a:graphicData>
+                  </a:graphic>
+                </wp:inline>
+              </w:drawing>
+            </w:r>
+          </w:p>
+        </w:tc>
+        <w:tc>
+          <w:tcPr>
+            <w:tcW w:type="dxa" w:w="5256"/>
+          </w:tcPr>
+          <w:p>
+            <w:pPr>
+              <w:spacing w:before="0" w:after="0" w:line="240" w:lineRule="auto"/>
+              <w:jc w:val="center"/>
+            </w:pPr>
+            <w:r>
+              <w:drawing>
+                <wp:inline xmlns:a="http://schemas.openxmlformats.org/drawingml/2006/main" xmlns:pic="http://schemas.openxmlformats.org/drawingml/2006/picture">
+                  <wp:extent cx="2194560" cy="2532185"/>
+                  <wp:docPr id="60" name="Picture 60"/>
+                  <wp:cNvGraphicFramePr>
+                    <a:graphicFrameLocks noChangeAspect="1"/>
+                  </wp:cNvGraphicFramePr>
+                  <a:graphic>
+                    <a:graphicData uri="http://schemas.openxmlformats.org/drawingml/2006/picture">
+                      <pic:pic>
+                        <pic:nvPicPr>
+                          <pic:cNvPr id="0" name="image.png"/>
+                          <pic:cNvPicPr/>
+                        </pic:nvPicPr>
+                        <pic:blipFill>
+                          <a:blip r:embed="rId27"/>
+                          <a:stretch>
+                            <a:fillRect/>
+                          </a:stretch>
+                        </pic:blipFill>
+                        <pic:spPr>
+                          <a:xfrm>
+                            <a:off x="0" y="0"/>
+                            <a:ext cx="2194560" cy="2532185"/>
+                          </a:xfrm>
+                          <a:prstGeom prst="rect"/>
+                        </pic:spPr>
+                      </pic:pic>
+                    </a:graphicData>
+                  </a:graphic>
+                </wp:inline>
+              </w:drawing>
+            </w:r>
+          </w:p>
+        </w:tc>
+      </w:tr>
+      <w:tr>
+        <w:trPr>
+          <w:trHeight w:val="230" w:hRule="exact"/>
+        </w:trPr>
+        <w:tc>
+          <w:tcPr>
+            <w:tcW w:type="dxa" w:w="5256"/>
+          </w:tcPr>
+          <w:p>
+            <w:pPr>
+              <w:spacing w:before="0" w:after="0" w:line="240" w:lineRule="auto"/>
+            </w:pPr>
+          </w:p>
+        </w:tc>
+        <w:tc>
+          <w:tcPr>
+            <w:tcW w:type="dxa" w:w="5256"/>
+          </w:tcPr>
+          <w:p>
+            <w:pPr>
+              <w:spacing w:before="0" w:after="0" w:line="240" w:lineRule="auto"/>
+            </w:pPr>
+          </w:p>
+        </w:tc>
+      </w:tr>
+      <w:tr>
+        <w:trPr>
+          <w:trHeight w:val="230" w:hRule="exact"/>
+        </w:trPr>
+        <w:tc>
+          <w:tcPr>
+            <w:tcW w:type="dxa" w:w="5256"/>
+          </w:tcPr>
+          <w:p>
+            <w:pPr>
+              <w:spacing w:before="0" w:after="0" w:line="240" w:lineRule="auto"/>
+            </w:pPr>
+          </w:p>
+        </w:tc>
+        <w:tc>
+          <w:tcPr>
+            <w:tcW w:type="dxa" w:w="5256"/>
+          </w:tcPr>
+          <w:p>
+            <w:pPr>
+              <w:spacing w:before="0" w:after="0" w:line="240" w:lineRule="auto"/>
+            </w:pPr>
+          </w:p>
+        </w:tc>
+      </w:tr>
+      <w:tr>
+        <w:trPr>
+          <w:trHeight w:val="360" w:hRule="exact"/>
+        </w:trPr>
+        <w:tc>
+          <w:tcPr>
+            <w:tcW w:type="dxa" w:w="5256"/>
+          </w:tcPr>
+          <w:p/>
+        </w:tc>
+        <w:tc>
+          <w:tcPr>
+            <w:tcW w:type="dxa" w:w="5256"/>
+          </w:tcPr>
+          <w:p>
+            <w:pPr>
+              <w:spacing w:before="0" w:after="0" w:line="240" w:lineRule="auto"/>
+              <w:jc w:val="center"/>
+            </w:pPr>
+            <w:r>
+              <w:rPr>
+                <w:rFonts w:ascii="NYU Perstare" w:hAnsi="NYU Perstare"/>
+                <w:b/>
+              </w:rPr>
+              <w:t>Room 778</w:t>
+            </w:r>
+          </w:p>
+        </w:tc>
+      </w:tr>
+    </w:tbl>
+    <w:p>
+      <w:r>
+        <w:br w:type="page"/>
+      </w:r>
+    </w:p>
+    <w:tbl>
+      <w:tblPr>
+        <w:tblW w:type="auto" w:w="0"/>
+        <w:tblLayout w:type="fixed"/>
+        <w:tblLook w:firstColumn="1" w:firstRow="1" w:lastColumn="0" w:lastRow="0" w:noHBand="0" w:noVBand="1" w:val="04A0"/>
+      </w:tblPr>
+      <w:tblGrid>
+        <w:gridCol w:w="5400"/>
+        <w:gridCol w:w="5400"/>
+      </w:tblGrid>
+      <w:tr>
+        <w:trPr>
+          <w:trHeight w:hRule="auto"/>
+        </w:trPr>
+        <w:tc>
+          <w:tcPr>
+            <w:tcW w:type="dxa" w:w="5256"/>
+          </w:tcPr>
+          <w:p/>
+        </w:tc>
+        <w:tc>
+          <w:tcPr>
+            <w:tcW w:type="dxa" w:w="5256"/>
+          </w:tcPr>
+          <w:p>
+            <w:pPr>
+              <w:spacing w:before="0" w:after="0" w:line="240" w:lineRule="auto"/>
+              <w:jc w:val="center"/>
+            </w:pPr>
+            <w:r>
+              <w:drawing>
+                <wp:inline xmlns:a="http://schemas.openxmlformats.org/drawingml/2006/main" xmlns:pic="http://schemas.openxmlformats.org/drawingml/2006/picture">
+                  <wp:extent cx="1828800" cy="1828800"/>
+                  <wp:docPr id="61" name="Picture 61"/>
+                  <wp:cNvGraphicFramePr>
+                    <a:graphicFrameLocks noChangeAspect="1"/>
+                  </wp:cNvGraphicFramePr>
+                  <a:graphic>
+                    <a:graphicData uri="http://schemas.openxmlformats.org/drawingml/2006/picture">
+                      <pic:pic>
+                        <pic:nvPicPr>
+                          <pic:cNvPr id="0" name="image.png"/>
+                          <pic:cNvPicPr/>
+                        </pic:nvPicPr>
+                        <pic:blipFill>
+                          <a:blip r:embed="rId9"/>
+                          <a:stretch>
+                            <a:fillRect/>
+                          </a:stretch>
+                        </pic:blipFill>
+                        <pic:spPr>
+                          <a:xfrm>
+                            <a:off x="0" y="0"/>
+                            <a:ext cx="1828800" cy="1828800"/>
+                          </a:xfrm>
+                          <a:prstGeom prst="rect"/>
+                        </pic:spPr>
+                      </pic:pic>
+                    </a:graphicData>
+                  </a:graphic>
+                </wp:inline>
+              </w:drawing>
+            </w:r>
+          </w:p>
+        </w:tc>
+      </w:tr>
+      <w:tr>
+        <w:trPr>
+          <w:trHeight w:hRule="auto"/>
+        </w:trPr>
+        <w:tc>
+          <w:tcPr>
+            <w:tcW w:type="dxa" w:w="5256"/>
+          </w:tcPr>
+          <w:p/>
+        </w:tc>
+        <w:tc>
+          <w:tcPr>
+            <w:tcW w:type="dxa" w:w="5256"/>
+          </w:tcPr>
+          <w:p>
+            <w:pPr>
+              <w:spacing w:before="0" w:after="0" w:line="240" w:lineRule="auto"/>
+              <w:jc w:val="center"/>
+            </w:pPr>
+            <w:r>
+              <w:rPr>
+                <w:rFonts w:ascii="NYU Perstare" w:hAnsi="NYU Perstare"/>
+                <w:b w:val="0"/>
+                <w:sz w:val="12"/>
+              </w:rPr>
+              <w:t>MUSIC AND PERFORMING ARTS PROFESSIONS</w:t>
+            </w:r>
+          </w:p>
+        </w:tc>
+      </w:tr>
+      <w:tr>
+        <w:trPr>
+          <w:trHeight w:val="360" w:hRule="exact"/>
+        </w:trPr>
+        <w:tc>
+          <w:tcPr>
+            <w:tcW w:type="dxa" w:w="5256"/>
+          </w:tcPr>
+          <w:p>
+            <w:pPr>
+              <w:spacing w:before="0" w:after="0" w:line="240" w:lineRule="auto"/>
+              <w:jc w:val="center"/>
+            </w:pPr>
+            <w:r>
+              <w:rPr>
+                <w:rFonts w:ascii="NYU Perstare" w:hAnsi="NYU Perstare"/>
+                <w:b w:val="0"/>
+              </w:rPr>
+              <w:t>Support</w:t>
+            </w:r>
+          </w:p>
+        </w:tc>
+        <w:tc>
+          <w:tcPr>
+            <w:tcW w:type="dxa" w:w="5256"/>
+          </w:tcPr>
+          <w:p>
+            <w:pPr>
+              <w:spacing w:before="0" w:after="0" w:line="240" w:lineRule="auto"/>
+              <w:jc w:val="center"/>
+            </w:pPr>
+            <w:r>
+              <w:rPr>
+                <w:rFonts w:ascii="NYU Perstare" w:hAnsi="NYU Perstare"/>
+                <w:b w:val="0"/>
+              </w:rPr>
+              <w:t>Room Instructions</w:t>
+            </w:r>
+          </w:p>
+        </w:tc>
+      </w:tr>
+      <w:tr>
+        <w:trPr>
+          <w:trHeight w:val="4176" w:hRule="exact"/>
+        </w:trPr>
+        <w:tc>
+          <w:tcPr>
+            <w:tcW w:type="dxa" w:w="5256"/>
+          </w:tcPr>
+          <w:p>
+            <w:pPr>
+              <w:spacing w:before="0" w:after="0" w:line="240" w:lineRule="auto"/>
+              <w:jc w:val="center"/>
+            </w:pPr>
+            <w:r>
+              <w:drawing>
+                <wp:inline xmlns:a="http://schemas.openxmlformats.org/drawingml/2006/main" xmlns:pic="http://schemas.openxmlformats.org/drawingml/2006/picture">
+                  <wp:extent cx="2194560" cy="2532185"/>
+                  <wp:docPr id="62" name="Picture 62"/>
+                  <wp:cNvGraphicFramePr>
+                    <a:graphicFrameLocks noChangeAspect="1"/>
+                  </wp:cNvGraphicFramePr>
+                  <a:graphic>
+                    <a:graphicData uri="http://schemas.openxmlformats.org/drawingml/2006/picture">
+                      <pic:pic>
+                        <pic:nvPicPr>
+                          <pic:cNvPr id="0" name="image.png"/>
+                          <pic:cNvPicPr/>
+                        </pic:nvPicPr>
+                        <pic:blipFill>
+                          <a:blip r:embed="rId10"/>
+                          <a:stretch>
+                            <a:fillRect/>
+                          </a:stretch>
+                        </pic:blipFill>
+                        <pic:spPr>
+                          <a:xfrm>
+                            <a:off x="0" y="0"/>
+                            <a:ext cx="2194560" cy="2532185"/>
+                          </a:xfrm>
+                          <a:prstGeom prst="rect"/>
+                        </pic:spPr>
+                      </pic:pic>
+                    </a:graphicData>
+                  </a:graphic>
+                </wp:inline>
+              </w:drawing>
+            </w:r>
+          </w:p>
+        </w:tc>
+        <w:tc>
+          <w:tcPr>
+            <w:tcW w:type="dxa" w:w="5256"/>
+          </w:tcPr>
+          <w:p>
+            <w:pPr>
+              <w:spacing w:before="0" w:after="0" w:line="240" w:lineRule="auto"/>
+              <w:jc w:val="center"/>
+            </w:pPr>
+            <w:r>
+              <w:drawing>
+                <wp:inline xmlns:a="http://schemas.openxmlformats.org/drawingml/2006/main" xmlns:pic="http://schemas.openxmlformats.org/drawingml/2006/picture">
+                  <wp:extent cx="2194560" cy="2532185"/>
+                  <wp:docPr id="63" name="Picture 63"/>
+                  <wp:cNvGraphicFramePr>
+                    <a:graphicFrameLocks noChangeAspect="1"/>
+                  </wp:cNvGraphicFramePr>
+                  <a:graphic>
+                    <a:graphicData uri="http://schemas.openxmlformats.org/drawingml/2006/picture">
+                      <pic:pic>
+                        <pic:nvPicPr>
+                          <pic:cNvPr id="0" name="image.png"/>
+                          <pic:cNvPicPr/>
+                        </pic:nvPicPr>
+                        <pic:blipFill>
+                          <a:blip r:embed="rId28"/>
+                          <a:stretch>
+                            <a:fillRect/>
+                          </a:stretch>
+                        </pic:blipFill>
+                        <pic:spPr>
+                          <a:xfrm>
+                            <a:off x="0" y="0"/>
+                            <a:ext cx="2194560" cy="2532185"/>
+                          </a:xfrm>
+                          <a:prstGeom prst="rect"/>
+                        </pic:spPr>
+                      </pic:pic>
+                    </a:graphicData>
+                  </a:graphic>
+                </wp:inline>
+              </w:drawing>
+            </w:r>
+          </w:p>
+        </w:tc>
+      </w:tr>
+      <w:tr>
+        <w:trPr>
+          <w:trHeight w:val="230" w:hRule="exact"/>
+        </w:trPr>
+        <w:tc>
+          <w:tcPr>
+            <w:tcW w:type="dxa" w:w="5256"/>
+          </w:tcPr>
+          <w:p>
+            <w:pPr>
+              <w:spacing w:before="0" w:after="0" w:line="240" w:lineRule="auto"/>
+            </w:pPr>
+          </w:p>
+        </w:tc>
+        <w:tc>
+          <w:tcPr>
+            <w:tcW w:type="dxa" w:w="5256"/>
+          </w:tcPr>
+          <w:p>
+            <w:pPr>
+              <w:spacing w:before="0" w:after="0" w:line="240" w:lineRule="auto"/>
+            </w:pPr>
+          </w:p>
+        </w:tc>
+      </w:tr>
+      <w:tr>
+        <w:trPr>
+          <w:trHeight w:val="230" w:hRule="exact"/>
+        </w:trPr>
+        <w:tc>
+          <w:tcPr>
+            <w:tcW w:type="dxa" w:w="5256"/>
+          </w:tcPr>
+          <w:p>
+            <w:pPr>
+              <w:spacing w:before="0" w:after="0" w:line="240" w:lineRule="auto"/>
+            </w:pPr>
+          </w:p>
+        </w:tc>
+        <w:tc>
+          <w:tcPr>
+            <w:tcW w:type="dxa" w:w="5256"/>
+          </w:tcPr>
+          <w:p>
+            <w:pPr>
+              <w:spacing w:before="0" w:after="0" w:line="240" w:lineRule="auto"/>
+            </w:pPr>
+          </w:p>
+        </w:tc>
+      </w:tr>
+      <w:tr>
+        <w:trPr>
+          <w:trHeight w:val="360" w:hRule="exact"/>
+        </w:trPr>
+        <w:tc>
+          <w:tcPr>
+            <w:tcW w:type="dxa" w:w="5256"/>
+          </w:tcPr>
+          <w:p/>
+        </w:tc>
+        <w:tc>
+          <w:tcPr>
+            <w:tcW w:type="dxa" w:w="5256"/>
+          </w:tcPr>
+          <w:p>
+            <w:pPr>
+              <w:spacing w:before="0" w:after="0" w:line="240" w:lineRule="auto"/>
+              <w:jc w:val="center"/>
+            </w:pPr>
+            <w:r>
+              <w:rPr>
+                <w:rFonts w:ascii="NYU Perstare" w:hAnsi="NYU Perstare"/>
+                <w:b/>
+              </w:rPr>
+              <w:t>Room 779</w:t>
+            </w:r>
+          </w:p>
+        </w:tc>
+      </w:tr>
+    </w:tbl>
+    <w:tbl>
+      <w:tblPr>
+        <w:tblW w:type="auto" w:w="0"/>
+        <w:tblLayout w:type="fixed"/>
+        <w:tblLook w:firstColumn="1" w:firstRow="1" w:lastColumn="0" w:lastRow="0" w:noHBand="0" w:noVBand="1" w:val="04A0"/>
+      </w:tblPr>
+      <w:tblGrid>
+        <w:gridCol w:w="5400"/>
+        <w:gridCol w:w="5400"/>
+      </w:tblGrid>
+      <w:tr>
+        <w:trPr>
+          <w:trHeight w:hRule="auto"/>
+        </w:trPr>
+        <w:tc>
+          <w:tcPr>
+            <w:tcW w:type="dxa" w:w="5256"/>
+          </w:tcPr>
+          <w:p/>
+        </w:tc>
+        <w:tc>
+          <w:tcPr>
+            <w:tcW w:type="dxa" w:w="5256"/>
+          </w:tcPr>
+          <w:p>
+            <w:pPr>
+              <w:spacing w:before="0" w:after="0" w:line="240" w:lineRule="auto"/>
+              <w:jc w:val="center"/>
+            </w:pPr>
+            <w:r>
+              <w:drawing>
+                <wp:inline xmlns:a="http://schemas.openxmlformats.org/drawingml/2006/main" xmlns:pic="http://schemas.openxmlformats.org/drawingml/2006/picture">
+                  <wp:extent cx="1828800" cy="1828800"/>
+                  <wp:docPr id="64" name="Picture 64"/>
+                  <wp:cNvGraphicFramePr>
+                    <a:graphicFrameLocks noChangeAspect="1"/>
+                  </wp:cNvGraphicFramePr>
+                  <a:graphic>
+                    <a:graphicData uri="http://schemas.openxmlformats.org/drawingml/2006/picture">
+                      <pic:pic>
+                        <pic:nvPicPr>
+                          <pic:cNvPr id="0" name="image.png"/>
+                          <pic:cNvPicPr/>
+                        </pic:nvPicPr>
+                        <pic:blipFill>
+                          <a:blip r:embed="rId9"/>
+                          <a:stretch>
+                            <a:fillRect/>
+                          </a:stretch>
+                        </pic:blipFill>
+                        <pic:spPr>
+                          <a:xfrm>
+                            <a:off x="0" y="0"/>
+                            <a:ext cx="1828800" cy="1828800"/>
+                          </a:xfrm>
+                          <a:prstGeom prst="rect"/>
+                        </pic:spPr>
+                      </pic:pic>
+                    </a:graphicData>
+                  </a:graphic>
+                </wp:inline>
+              </w:drawing>
+            </w:r>
+          </w:p>
+        </w:tc>
+      </w:tr>
+      <w:tr>
+        <w:trPr>
+          <w:trHeight w:hRule="auto"/>
+        </w:trPr>
+        <w:tc>
+          <w:tcPr>
+            <w:tcW w:type="dxa" w:w="5256"/>
+          </w:tcPr>
+          <w:p/>
+        </w:tc>
+        <w:tc>
+          <w:tcPr>
+            <w:tcW w:type="dxa" w:w="5256"/>
+          </w:tcPr>
+          <w:p>
+            <w:pPr>
+              <w:spacing w:before="0" w:after="0" w:line="240" w:lineRule="auto"/>
+              <w:jc w:val="center"/>
+            </w:pPr>
+            <w:r>
+              <w:rPr>
+                <w:rFonts w:ascii="NYU Perstare" w:hAnsi="NYU Perstare"/>
+                <w:b w:val="0"/>
+                <w:sz w:val="12"/>
+              </w:rPr>
+              <w:t>MUSIC AND PERFORMING ARTS PROFESSIONS</w:t>
+            </w:r>
+          </w:p>
+        </w:tc>
+      </w:tr>
+      <w:tr>
+        <w:trPr>
+          <w:trHeight w:val="360" w:hRule="exact"/>
+        </w:trPr>
+        <w:tc>
+          <w:tcPr>
+            <w:tcW w:type="dxa" w:w="5256"/>
+          </w:tcPr>
+          <w:p>
+            <w:pPr>
+              <w:spacing w:before="0" w:after="0" w:line="240" w:lineRule="auto"/>
+              <w:jc w:val="center"/>
+            </w:pPr>
+            <w:r>
+              <w:rPr>
+                <w:rFonts w:ascii="NYU Perstare" w:hAnsi="NYU Perstare"/>
+                <w:b w:val="0"/>
+              </w:rPr>
+              <w:t>Support</w:t>
+            </w:r>
+          </w:p>
+        </w:tc>
+        <w:tc>
+          <w:tcPr>
+            <w:tcW w:type="dxa" w:w="5256"/>
+          </w:tcPr>
+          <w:p>
+            <w:pPr>
+              <w:spacing w:before="0" w:after="0" w:line="240" w:lineRule="auto"/>
+              <w:jc w:val="center"/>
+            </w:pPr>
+            <w:r>
+              <w:rPr>
+                <w:rFonts w:ascii="NYU Perstare" w:hAnsi="NYU Perstare"/>
+                <w:b w:val="0"/>
+              </w:rPr>
+              <w:t>Room Instructions</w:t>
+            </w:r>
+          </w:p>
+        </w:tc>
+      </w:tr>
+      <w:tr>
+        <w:trPr>
+          <w:trHeight w:val="4176" w:hRule="exact"/>
+        </w:trPr>
+        <w:tc>
+          <w:tcPr>
+            <w:tcW w:type="dxa" w:w="5256"/>
+          </w:tcPr>
+          <w:p>
+            <w:pPr>
+              <w:spacing w:before="0" w:after="0" w:line="240" w:lineRule="auto"/>
+              <w:jc w:val="center"/>
+            </w:pPr>
+            <w:r>
+              <w:drawing>
+                <wp:inline xmlns:a="http://schemas.openxmlformats.org/drawingml/2006/main" xmlns:pic="http://schemas.openxmlformats.org/drawingml/2006/picture">
+                  <wp:extent cx="2194560" cy="2532185"/>
+                  <wp:docPr id="65" name="Picture 65"/>
+                  <wp:cNvGraphicFramePr>
+                    <a:graphicFrameLocks noChangeAspect="1"/>
+                  </wp:cNvGraphicFramePr>
+                  <a:graphic>
+                    <a:graphicData uri="http://schemas.openxmlformats.org/drawingml/2006/picture">
+                      <pic:pic>
+                        <pic:nvPicPr>
+                          <pic:cNvPr id="0" name="image.png"/>
+                          <pic:cNvPicPr/>
+                        </pic:nvPicPr>
+                        <pic:blipFill>
+                          <a:blip r:embed="rId10"/>
+                          <a:stretch>
+                            <a:fillRect/>
+                          </a:stretch>
+                        </pic:blipFill>
+                        <pic:spPr>
+                          <a:xfrm>
+                            <a:off x="0" y="0"/>
+                            <a:ext cx="2194560" cy="2532185"/>
+                          </a:xfrm>
+                          <a:prstGeom prst="rect"/>
+                        </pic:spPr>
+                      </pic:pic>
+                    </a:graphicData>
+                  </a:graphic>
+                </wp:inline>
+              </w:drawing>
+            </w:r>
+          </w:p>
+        </w:tc>
+        <w:tc>
+          <w:tcPr>
+            <w:tcW w:type="dxa" w:w="5256"/>
+          </w:tcPr>
+          <w:p>
+            <w:pPr>
+              <w:spacing w:before="0" w:after="0" w:line="240" w:lineRule="auto"/>
+              <w:jc w:val="center"/>
+            </w:pPr>
+            <w:r>
+              <w:drawing>
+                <wp:inline xmlns:a="http://schemas.openxmlformats.org/drawingml/2006/main" xmlns:pic="http://schemas.openxmlformats.org/drawingml/2006/picture">
+                  <wp:extent cx="2194560" cy="2532185"/>
+                  <wp:docPr id="66" name="Picture 66"/>
+                  <wp:cNvGraphicFramePr>
+                    <a:graphicFrameLocks noChangeAspect="1"/>
+                  </wp:cNvGraphicFramePr>
+                  <a:graphic>
+                    <a:graphicData uri="http://schemas.openxmlformats.org/drawingml/2006/picture">
+                      <pic:pic>
+                        <pic:nvPicPr>
+                          <pic:cNvPr id="0" name="image.png"/>
+                          <pic:cNvPicPr/>
+                        </pic:nvPicPr>
+                        <pic:blipFill>
+                          <a:blip r:embed="rId29"/>
+                          <a:stretch>
+                            <a:fillRect/>
+                          </a:stretch>
+                        </pic:blipFill>
+                        <pic:spPr>
+                          <a:xfrm>
+                            <a:off x="0" y="0"/>
+                            <a:ext cx="2194560" cy="2532185"/>
+                          </a:xfrm>
+                          <a:prstGeom prst="rect"/>
+                        </pic:spPr>
+                      </pic:pic>
+                    </a:graphicData>
+                  </a:graphic>
+                </wp:inline>
+              </w:drawing>
+            </w:r>
+          </w:p>
+        </w:tc>
+      </w:tr>
+      <w:tr>
+        <w:trPr>
+          <w:trHeight w:val="230" w:hRule="exact"/>
+        </w:trPr>
+        <w:tc>
+          <w:tcPr>
+            <w:tcW w:type="dxa" w:w="5256"/>
+          </w:tcPr>
+          <w:p>
+            <w:pPr>
+              <w:spacing w:before="0" w:after="0" w:line="240" w:lineRule="auto"/>
+            </w:pPr>
+          </w:p>
+        </w:tc>
+        <w:tc>
+          <w:tcPr>
+            <w:tcW w:type="dxa" w:w="5256"/>
+          </w:tcPr>
+          <w:p>
+            <w:pPr>
+              <w:spacing w:before="0" w:after="0" w:line="240" w:lineRule="auto"/>
+            </w:pPr>
+          </w:p>
+        </w:tc>
+      </w:tr>
+      <w:tr>
+        <w:trPr>
+          <w:trHeight w:val="230" w:hRule="exact"/>
+        </w:trPr>
+        <w:tc>
+          <w:tcPr>
+            <w:tcW w:type="dxa" w:w="5256"/>
+          </w:tcPr>
+          <w:p>
+            <w:pPr>
+              <w:spacing w:before="0" w:after="0" w:line="240" w:lineRule="auto"/>
+            </w:pPr>
+          </w:p>
+        </w:tc>
+        <w:tc>
+          <w:tcPr>
+            <w:tcW w:type="dxa" w:w="5256"/>
+          </w:tcPr>
+          <w:p>
+            <w:pPr>
+              <w:spacing w:before="0" w:after="0" w:line="240" w:lineRule="auto"/>
+            </w:pPr>
+          </w:p>
+        </w:tc>
+      </w:tr>
+      <w:tr>
+        <w:trPr>
+          <w:trHeight w:val="360" w:hRule="exact"/>
+        </w:trPr>
+        <w:tc>
+          <w:tcPr>
+            <w:tcW w:type="dxa" w:w="5256"/>
+          </w:tcPr>
+          <w:p/>
+        </w:tc>
+        <w:tc>
+          <w:tcPr>
+            <w:tcW w:type="dxa" w:w="5256"/>
+          </w:tcPr>
+          <w:p>
+            <w:pPr>
+              <w:spacing w:before="0" w:after="0" w:line="240" w:lineRule="auto"/>
+              <w:jc w:val="center"/>
+            </w:pPr>
+            <w:r>
+              <w:rPr>
+                <w:rFonts w:ascii="NYU Perstare" w:hAnsi="NYU Perstare"/>
+                <w:b/>
+              </w:rPr>
+              <w:t>Room 876</w:t>
+            </w:r>
+          </w:p>
+        </w:tc>
+      </w:tr>
+    </w:tbl>
+    <w:p>
+      <w:r>
+        <w:br w:type="page"/>
+      </w:r>
+    </w:p>
+    <w:tbl>
+      <w:tblPr>
+        <w:tblW w:type="auto" w:w="0"/>
+        <w:tblLayout w:type="fixed"/>
+        <w:tblLook w:firstColumn="1" w:firstRow="1" w:lastColumn="0" w:lastRow="0" w:noHBand="0" w:noVBand="1" w:val="04A0"/>
+      </w:tblPr>
+      <w:tblGrid>
+        <w:gridCol w:w="5400"/>
+        <w:gridCol w:w="5400"/>
+      </w:tblGrid>
+      <w:tr>
+        <w:trPr>
+          <w:trHeight w:hRule="auto"/>
+        </w:trPr>
+        <w:tc>
+          <w:tcPr>
+            <w:tcW w:type="dxa" w:w="5256"/>
+          </w:tcPr>
+          <w:p/>
+        </w:tc>
+        <w:tc>
+          <w:tcPr>
+            <w:tcW w:type="dxa" w:w="5256"/>
+          </w:tcPr>
+          <w:p>
+            <w:pPr>
+              <w:spacing w:before="0" w:after="0" w:line="240" w:lineRule="auto"/>
+              <w:jc w:val="center"/>
+            </w:pPr>
+            <w:r>
+              <w:drawing>
+                <wp:inline xmlns:a="http://schemas.openxmlformats.org/drawingml/2006/main" xmlns:pic="http://schemas.openxmlformats.org/drawingml/2006/picture">
+                  <wp:extent cx="1828800" cy="1828800"/>
+                  <wp:docPr id="67" name="Picture 67"/>
+                  <wp:cNvGraphicFramePr>
+                    <a:graphicFrameLocks noChangeAspect="1"/>
+                  </wp:cNvGraphicFramePr>
+                  <a:graphic>
+                    <a:graphicData uri="http://schemas.openxmlformats.org/drawingml/2006/picture">
+                      <pic:pic>
+                        <pic:nvPicPr>
+                          <pic:cNvPr id="0" name="image.png"/>
+                          <pic:cNvPicPr/>
+                        </pic:nvPicPr>
+                        <pic:blipFill>
+                          <a:blip r:embed="rId9"/>
+                          <a:stretch>
+                            <a:fillRect/>
+                          </a:stretch>
+                        </pic:blipFill>
+                        <pic:spPr>
+                          <a:xfrm>
+                            <a:off x="0" y="0"/>
+                            <a:ext cx="1828800" cy="1828800"/>
+                          </a:xfrm>
+                          <a:prstGeom prst="rect"/>
+                        </pic:spPr>
+                      </pic:pic>
+                    </a:graphicData>
+                  </a:graphic>
+                </wp:inline>
+              </w:drawing>
+            </w:r>
+          </w:p>
+        </w:tc>
+      </w:tr>
+      <w:tr>
+        <w:trPr>
+          <w:trHeight w:hRule="auto"/>
+        </w:trPr>
+        <w:tc>
+          <w:tcPr>
+            <w:tcW w:type="dxa" w:w="5256"/>
+          </w:tcPr>
+          <w:p/>
+        </w:tc>
+        <w:tc>
+          <w:tcPr>
+            <w:tcW w:type="dxa" w:w="5256"/>
+          </w:tcPr>
+          <w:p>
+            <w:pPr>
+              <w:spacing w:before="0" w:after="0" w:line="240" w:lineRule="auto"/>
+              <w:jc w:val="center"/>
+            </w:pPr>
+            <w:r>
+              <w:rPr>
+                <w:rFonts w:ascii="NYU Perstare" w:hAnsi="NYU Perstare"/>
+                <w:b w:val="0"/>
+                <w:sz w:val="12"/>
+              </w:rPr>
+              <w:t>MUSIC AND PERFORMING ARTS PROFESSIONS</w:t>
+            </w:r>
+          </w:p>
+        </w:tc>
+      </w:tr>
+      <w:tr>
+        <w:trPr>
+          <w:trHeight w:val="360" w:hRule="exact"/>
+        </w:trPr>
+        <w:tc>
+          <w:tcPr>
+            <w:tcW w:type="dxa" w:w="5256"/>
+          </w:tcPr>
+          <w:p>
+            <w:pPr>
+              <w:spacing w:before="0" w:after="0" w:line="240" w:lineRule="auto"/>
+              <w:jc w:val="center"/>
+            </w:pPr>
+            <w:r>
+              <w:rPr>
+                <w:rFonts w:ascii="NYU Perstare" w:hAnsi="NYU Perstare"/>
+                <w:b w:val="0"/>
+              </w:rPr>
+              <w:t>Support</w:t>
+            </w:r>
+          </w:p>
+        </w:tc>
+        <w:tc>
+          <w:tcPr>
+            <w:tcW w:type="dxa" w:w="5256"/>
+          </w:tcPr>
+          <w:p>
+            <w:pPr>
+              <w:spacing w:before="0" w:after="0" w:line="240" w:lineRule="auto"/>
+              <w:jc w:val="center"/>
+            </w:pPr>
+            <w:r>
+              <w:rPr>
+                <w:rFonts w:ascii="NYU Perstare" w:hAnsi="NYU Perstare"/>
+                <w:b w:val="0"/>
+              </w:rPr>
+              <w:t>Room Instructions</w:t>
+            </w:r>
+          </w:p>
+        </w:tc>
+      </w:tr>
+      <w:tr>
+        <w:trPr>
+          <w:trHeight w:val="4176" w:hRule="exact"/>
+        </w:trPr>
+        <w:tc>
+          <w:tcPr>
+            <w:tcW w:type="dxa" w:w="5256"/>
+          </w:tcPr>
+          <w:p>
+            <w:pPr>
+              <w:spacing w:before="0" w:after="0" w:line="240" w:lineRule="auto"/>
+              <w:jc w:val="center"/>
+            </w:pPr>
+            <w:r>
+              <w:drawing>
+                <wp:inline xmlns:a="http://schemas.openxmlformats.org/drawingml/2006/main" xmlns:pic="http://schemas.openxmlformats.org/drawingml/2006/picture">
+                  <wp:extent cx="2194560" cy="2532185"/>
+                  <wp:docPr id="68" name="Picture 68"/>
+                  <wp:cNvGraphicFramePr>
+                    <a:graphicFrameLocks noChangeAspect="1"/>
+                  </wp:cNvGraphicFramePr>
+                  <a:graphic>
+                    <a:graphicData uri="http://schemas.openxmlformats.org/drawingml/2006/picture">
+                      <pic:pic>
+                        <pic:nvPicPr>
+                          <pic:cNvPr id="0" name="image.png"/>
+                          <pic:cNvPicPr/>
+                        </pic:nvPicPr>
+                        <pic:blipFill>
+                          <a:blip r:embed="rId10"/>
+                          <a:stretch>
+                            <a:fillRect/>
+                          </a:stretch>
+                        </pic:blipFill>
+                        <pic:spPr>
+                          <a:xfrm>
+                            <a:off x="0" y="0"/>
+                            <a:ext cx="2194560" cy="2532185"/>
+                          </a:xfrm>
+                          <a:prstGeom prst="rect"/>
+                        </pic:spPr>
+                      </pic:pic>
+                    </a:graphicData>
+                  </a:graphic>
+                </wp:inline>
+              </w:drawing>
+            </w:r>
+          </w:p>
+        </w:tc>
+        <w:tc>
+          <w:tcPr>
+            <w:tcW w:type="dxa" w:w="5256"/>
+          </w:tcPr>
+          <w:p>
+            <w:pPr>
+              <w:spacing w:before="0" w:after="0" w:line="240" w:lineRule="auto"/>
+              <w:jc w:val="center"/>
+            </w:pPr>
+            <w:r>
+              <w:drawing>
+                <wp:inline xmlns:a="http://schemas.openxmlformats.org/drawingml/2006/main" xmlns:pic="http://schemas.openxmlformats.org/drawingml/2006/picture">
+                  <wp:extent cx="2194560" cy="2532185"/>
+                  <wp:docPr id="69" name="Picture 69"/>
+                  <wp:cNvGraphicFramePr>
+                    <a:graphicFrameLocks noChangeAspect="1"/>
+                  </wp:cNvGraphicFramePr>
+                  <a:graphic>
+                    <a:graphicData uri="http://schemas.openxmlformats.org/drawingml/2006/picture">
+                      <pic:pic>
+                        <pic:nvPicPr>
+                          <pic:cNvPr id="0" name="image.png"/>
+                          <pic:cNvPicPr/>
+                        </pic:nvPicPr>
+                        <pic:blipFill>
+                          <a:blip r:embed="rId30"/>
+                          <a:stretch>
+                            <a:fillRect/>
+                          </a:stretch>
+                        </pic:blipFill>
+                        <pic:spPr>
+                          <a:xfrm>
+                            <a:off x="0" y="0"/>
+                            <a:ext cx="2194560" cy="2532185"/>
+                          </a:xfrm>
+                          <a:prstGeom prst="rect"/>
+                        </pic:spPr>
+                      </pic:pic>
+                    </a:graphicData>
+                  </a:graphic>
+                </wp:inline>
+              </w:drawing>
+            </w:r>
+          </w:p>
+        </w:tc>
+      </w:tr>
+      <w:tr>
+        <w:trPr>
+          <w:trHeight w:val="230" w:hRule="exact"/>
+        </w:trPr>
+        <w:tc>
+          <w:tcPr>
+            <w:tcW w:type="dxa" w:w="5256"/>
+          </w:tcPr>
+          <w:p>
+            <w:pPr>
+              <w:spacing w:before="0" w:after="0" w:line="240" w:lineRule="auto"/>
+            </w:pPr>
+          </w:p>
+        </w:tc>
+        <w:tc>
+          <w:tcPr>
+            <w:tcW w:type="dxa" w:w="5256"/>
+          </w:tcPr>
+          <w:p>
+            <w:pPr>
+              <w:spacing w:before="0" w:after="0" w:line="240" w:lineRule="auto"/>
+            </w:pPr>
+          </w:p>
+        </w:tc>
+      </w:tr>
+      <w:tr>
+        <w:trPr>
+          <w:trHeight w:val="230" w:hRule="exact"/>
+        </w:trPr>
+        <w:tc>
+          <w:tcPr>
+            <w:tcW w:type="dxa" w:w="5256"/>
+          </w:tcPr>
+          <w:p>
+            <w:pPr>
+              <w:spacing w:before="0" w:after="0" w:line="240" w:lineRule="auto"/>
+            </w:pPr>
+          </w:p>
+        </w:tc>
+        <w:tc>
+          <w:tcPr>
+            <w:tcW w:type="dxa" w:w="5256"/>
+          </w:tcPr>
+          <w:p>
+            <w:pPr>
+              <w:spacing w:before="0" w:after="0" w:line="240" w:lineRule="auto"/>
+            </w:pPr>
+          </w:p>
+        </w:tc>
+      </w:tr>
+      <w:tr>
+        <w:trPr>
+          <w:trHeight w:val="360" w:hRule="exact"/>
+        </w:trPr>
+        <w:tc>
+          <w:tcPr>
+            <w:tcW w:type="dxa" w:w="5256"/>
+          </w:tcPr>
+          <w:p/>
+        </w:tc>
+        <w:tc>
+          <w:tcPr>
+            <w:tcW w:type="dxa" w:w="5256"/>
+          </w:tcPr>
+          <w:p>
+            <w:pPr>
+              <w:spacing w:before="0" w:after="0" w:line="240" w:lineRule="auto"/>
+              <w:jc w:val="center"/>
+            </w:pPr>
+            <w:r>
+              <w:rPr>
+                <w:rFonts w:ascii="NYU Perstare" w:hAnsi="NYU Perstare"/>
+                <w:b/>
+              </w:rPr>
+              <w:t>Room 985</w:t>
+            </w:r>
+          </w:p>
+        </w:tc>
+      </w:tr>
+    </w:tbl>
+    <w:tbl>
+      <w:tblPr>
+        <w:tblW w:type="auto" w:w="0"/>
+        <w:tblLayout w:type="fixed"/>
+        <w:tblLook w:firstColumn="1" w:firstRow="1" w:lastColumn="0" w:lastRow="0" w:noHBand="0" w:noVBand="1" w:val="04A0"/>
+      </w:tblPr>
+      <w:tblGrid>
+        <w:gridCol w:w="5400"/>
+        <w:gridCol w:w="5400"/>
+      </w:tblGrid>
+      <w:tr>
+        <w:trPr>
+          <w:trHeight w:hRule="auto"/>
+        </w:trPr>
+        <w:tc>
+          <w:tcPr>
+            <w:tcW w:type="dxa" w:w="5256"/>
+          </w:tcPr>
+          <w:p/>
+        </w:tc>
+        <w:tc>
+          <w:tcPr>
+            <w:tcW w:type="dxa" w:w="5256"/>
+          </w:tcPr>
+          <w:p>
+            <w:pPr>
+              <w:spacing w:before="0" w:after="0" w:line="240" w:lineRule="auto"/>
+              <w:jc w:val="center"/>
+            </w:pPr>
+            <w:r>
+              <w:drawing>
+                <wp:inline xmlns:a="http://schemas.openxmlformats.org/drawingml/2006/main" xmlns:pic="http://schemas.openxmlformats.org/drawingml/2006/picture">
+                  <wp:extent cx="1828800" cy="1828800"/>
+                  <wp:docPr id="70" name="Picture 70"/>
+                  <wp:cNvGraphicFramePr>
+                    <a:graphicFrameLocks noChangeAspect="1"/>
+                  </wp:cNvGraphicFramePr>
+                  <a:graphic>
+                    <a:graphicData uri="http://schemas.openxmlformats.org/drawingml/2006/picture">
+                      <pic:pic>
+                        <pic:nvPicPr>
+                          <pic:cNvPr id="0" name="image.png"/>
+                          <pic:cNvPicPr/>
+                        </pic:nvPicPr>
+                        <pic:blipFill>
+                          <a:blip r:embed="rId9"/>
+                          <a:stretch>
+                            <a:fillRect/>
+                          </a:stretch>
+                        </pic:blipFill>
+                        <pic:spPr>
+                          <a:xfrm>
+                            <a:off x="0" y="0"/>
+                            <a:ext cx="1828800" cy="1828800"/>
+                          </a:xfrm>
+                          <a:prstGeom prst="rect"/>
+                        </pic:spPr>
+                      </pic:pic>
+                    </a:graphicData>
+                  </a:graphic>
+                </wp:inline>
+              </w:drawing>
+            </w:r>
+          </w:p>
+        </w:tc>
+      </w:tr>
+      <w:tr>
+        <w:trPr>
+          <w:trHeight w:hRule="auto"/>
+        </w:trPr>
+        <w:tc>
+          <w:tcPr>
+            <w:tcW w:type="dxa" w:w="5256"/>
+          </w:tcPr>
+          <w:p/>
+        </w:tc>
+        <w:tc>
+          <w:tcPr>
+            <w:tcW w:type="dxa" w:w="5256"/>
+          </w:tcPr>
+          <w:p>
+            <w:pPr>
+              <w:spacing w:before="0" w:after="0" w:line="240" w:lineRule="auto"/>
+              <w:jc w:val="center"/>
+            </w:pPr>
+            <w:r>
+              <w:rPr>
+                <w:rFonts w:ascii="NYU Perstare" w:hAnsi="NYU Perstare"/>
+                <w:b w:val="0"/>
+                <w:sz w:val="12"/>
+              </w:rPr>
+              <w:t>MUSIC AND PERFORMING ARTS PROFESSIONS</w:t>
+            </w:r>
+          </w:p>
+        </w:tc>
+      </w:tr>
+      <w:tr>
+        <w:trPr>
+          <w:trHeight w:val="360" w:hRule="exact"/>
+        </w:trPr>
+        <w:tc>
+          <w:tcPr>
+            <w:tcW w:type="dxa" w:w="5256"/>
+          </w:tcPr>
+          <w:p>
+            <w:pPr>
+              <w:spacing w:before="0" w:after="0" w:line="240" w:lineRule="auto"/>
+              <w:jc w:val="center"/>
+            </w:pPr>
+            <w:r>
+              <w:rPr>
+                <w:rFonts w:ascii="NYU Perstare" w:hAnsi="NYU Perstare"/>
+                <w:b w:val="0"/>
+              </w:rPr>
+              <w:t>Support</w:t>
+            </w:r>
+          </w:p>
+        </w:tc>
+        <w:tc>
+          <w:tcPr>
+            <w:tcW w:type="dxa" w:w="5256"/>
+          </w:tcPr>
+          <w:p>
+            <w:pPr>
+              <w:spacing w:before="0" w:after="0" w:line="240" w:lineRule="auto"/>
+              <w:jc w:val="center"/>
+            </w:pPr>
+            <w:r>
+              <w:rPr>
+                <w:rFonts w:ascii="NYU Perstare" w:hAnsi="NYU Perstare"/>
+                <w:b w:val="0"/>
+              </w:rPr>
+              <w:t>Room Instructions</w:t>
+            </w:r>
+          </w:p>
+        </w:tc>
+      </w:tr>
+      <w:tr>
+        <w:trPr>
+          <w:trHeight w:val="4176" w:hRule="exact"/>
+        </w:trPr>
+        <w:tc>
+          <w:tcPr>
+            <w:tcW w:type="dxa" w:w="5256"/>
+          </w:tcPr>
+          <w:p>
+            <w:pPr>
+              <w:spacing w:before="0" w:after="0" w:line="240" w:lineRule="auto"/>
+              <w:jc w:val="center"/>
+            </w:pPr>
+            <w:r>
+              <w:drawing>
+                <wp:inline xmlns:a="http://schemas.openxmlformats.org/drawingml/2006/main" xmlns:pic="http://schemas.openxmlformats.org/drawingml/2006/picture">
+                  <wp:extent cx="2194560" cy="2532185"/>
+                  <wp:docPr id="71" name="Picture 71"/>
+                  <wp:cNvGraphicFramePr>
+                    <a:graphicFrameLocks noChangeAspect="1"/>
+                  </wp:cNvGraphicFramePr>
+                  <a:graphic>
+                    <a:graphicData uri="http://schemas.openxmlformats.org/drawingml/2006/picture">
+                      <pic:pic>
+                        <pic:nvPicPr>
+                          <pic:cNvPr id="0" name="image.png"/>
+                          <pic:cNvPicPr/>
+                        </pic:nvPicPr>
+                        <pic:blipFill>
+                          <a:blip r:embed="rId10"/>
+                          <a:stretch>
+                            <a:fillRect/>
+                          </a:stretch>
+                        </pic:blipFill>
+                        <pic:spPr>
+                          <a:xfrm>
+                            <a:off x="0" y="0"/>
+                            <a:ext cx="2194560" cy="2532185"/>
+                          </a:xfrm>
+                          <a:prstGeom prst="rect"/>
+                        </pic:spPr>
+                      </pic:pic>
+                    </a:graphicData>
+                  </a:graphic>
+                </wp:inline>
+              </w:drawing>
+            </w:r>
+          </w:p>
+        </w:tc>
+        <w:tc>
+          <w:tcPr>
+            <w:tcW w:type="dxa" w:w="5256"/>
+          </w:tcPr>
+          <w:p>
+            <w:pPr>
+              <w:spacing w:before="0" w:after="0" w:line="240" w:lineRule="auto"/>
+              <w:jc w:val="center"/>
+            </w:pPr>
+            <w:r>
+              <w:drawing>
+                <wp:inline xmlns:a="http://schemas.openxmlformats.org/drawingml/2006/main" xmlns:pic="http://schemas.openxmlformats.org/drawingml/2006/picture">
+                  <wp:extent cx="2194560" cy="2532185"/>
+                  <wp:docPr id="72" name="Picture 72"/>
+                  <wp:cNvGraphicFramePr>
+                    <a:graphicFrameLocks noChangeAspect="1"/>
+                  </wp:cNvGraphicFramePr>
+                  <a:graphic>
+                    <a:graphicData uri="http://schemas.openxmlformats.org/drawingml/2006/picture">
+                      <pic:pic>
+                        <pic:nvPicPr>
+                          <pic:cNvPr id="0" name="image.png"/>
+                          <pic:cNvPicPr/>
+                        </pic:nvPicPr>
+                        <pic:blipFill>
+                          <a:blip r:embed="rId31"/>
+                          <a:stretch>
+                            <a:fillRect/>
+                          </a:stretch>
+                        </pic:blipFill>
+                        <pic:spPr>
+                          <a:xfrm>
+                            <a:off x="0" y="0"/>
+                            <a:ext cx="2194560" cy="2532185"/>
+                          </a:xfrm>
+                          <a:prstGeom prst="rect"/>
+                        </pic:spPr>
+                      </pic:pic>
+                    </a:graphicData>
+                  </a:graphic>
+                </wp:inline>
+              </w:drawing>
+            </w:r>
+          </w:p>
+        </w:tc>
+      </w:tr>
+      <w:tr>
+        <w:trPr>
+          <w:trHeight w:val="230" w:hRule="exact"/>
+        </w:trPr>
+        <w:tc>
+          <w:tcPr>
+            <w:tcW w:type="dxa" w:w="5256"/>
+          </w:tcPr>
+          <w:p>
+            <w:pPr>
+              <w:spacing w:before="0" w:after="0" w:line="240" w:lineRule="auto"/>
+            </w:pPr>
+          </w:p>
+        </w:tc>
+        <w:tc>
+          <w:tcPr>
+            <w:tcW w:type="dxa" w:w="5256"/>
+          </w:tcPr>
+          <w:p>
+            <w:pPr>
+              <w:spacing w:before="0" w:after="0" w:line="240" w:lineRule="auto"/>
+            </w:pPr>
+          </w:p>
+        </w:tc>
+      </w:tr>
+      <w:tr>
+        <w:trPr>
+          <w:trHeight w:val="230" w:hRule="exact"/>
+        </w:trPr>
+        <w:tc>
+          <w:tcPr>
+            <w:tcW w:type="dxa" w:w="5256"/>
+          </w:tcPr>
+          <w:p>
+            <w:pPr>
+              <w:spacing w:before="0" w:after="0" w:line="240" w:lineRule="auto"/>
+            </w:pPr>
+          </w:p>
+        </w:tc>
+        <w:tc>
+          <w:tcPr>
+            <w:tcW w:type="dxa" w:w="5256"/>
+          </w:tcPr>
+          <w:p>
+            <w:pPr>
+              <w:spacing w:before="0" w:after="0" w:line="240" w:lineRule="auto"/>
+            </w:pPr>
+          </w:p>
+        </w:tc>
+      </w:tr>
+      <w:tr>
+        <w:trPr>
+          <w:trHeight w:val="360" w:hRule="exact"/>
+        </w:trPr>
+        <w:tc>
+          <w:tcPr>
+            <w:tcW w:type="dxa" w:w="5256"/>
+          </w:tcPr>
+          <w:p/>
+        </w:tc>
+        <w:tc>
+          <w:tcPr>
+            <w:tcW w:type="dxa" w:w="5256"/>
+          </w:tcPr>
+          <w:p>
+            <w:pPr>
+              <w:spacing w:before="0" w:after="0" w:line="240" w:lineRule="auto"/>
+              <w:jc w:val="center"/>
+            </w:pPr>
+            <w:r>
+              <w:rPr>
+                <w:rFonts w:ascii="NYU Perstare" w:hAnsi="NYU Perstare"/>
+                <w:b/>
+              </w:rPr>
+              <w:t>6th Floor Conference Room</w:t>
             </w:r>
           </w:p>
         </w:tc>

</xml_diff>